<commit_message>
Front matter Chinese punctation corrections made
</commit_message>
<xml_diff>
--- a/Front Matter/Template/Pieces/1_Front-Matter.docx
+++ b/Front Matter/Template/Pieces/1_Front-Matter.docx
@@ -1315,55 +1315,53 @@
     <w:p>
       <w:pPr>
         <w:rPr>
-          <w:rFonts w:ascii="Noto Serif CJK SC" w:eastAsia="Noto Serif CJK SC" w:hAnsi="Noto Serif CJK SC"/>
-          <w:sz w:val="24"/>
-          <w:szCs w:val="24"/>
-          <w:lang w:val="en-US"/>
-        </w:rPr>
-      </w:pPr>
-      <w:r>
-        <w:rPr>
-          <w:rFonts w:ascii="Noto Serif CJK SC" w:eastAsia="Noto Serif CJK SC" w:hAnsi="Noto Serif CJK SC"/>
-          <w:sz w:val="24"/>
-          <w:szCs w:val="24"/>
-          <w:lang w:val="en-US"/>
-        </w:rPr>
-        <w:t xml:space="preserve">Xie </w:t>
+          <w:rFonts w:ascii="Noto Serif SC" w:eastAsia="Noto Serif SC" w:hAnsi="Noto Serif SC"/>
+          <w:sz w:val="24"/>
+          <w:szCs w:val="24"/>
+          <w:lang w:val="en-US"/>
+        </w:rPr>
+      </w:pPr>
+      <w:r>
+        <w:rPr>
+          <w:rFonts w:ascii="Noto Serif SC" w:eastAsia="Noto Serif SC" w:hAnsi="Noto Serif SC"/>
+          <w:sz w:val="24"/>
+          <w:szCs w:val="24"/>
+          <w:lang w:val="en-US"/>
+        </w:rPr>
+        <w:t xml:space="preserve">Xie Xiangming was born in Zhangzhou, Fujian Province in 1974, of Hakka </w:t>
       </w:r>
       <w:proofErr w:type="spellStart"/>
       <w:r>
         <w:rPr>
-          <w:rFonts w:ascii="Noto Serif CJK SC" w:eastAsia="Noto Serif CJK SC" w:hAnsi="Noto Serif CJK SC"/>
-          <w:sz w:val="24"/>
-          <w:szCs w:val="24"/>
-          <w:lang w:val="en-US"/>
-        </w:rPr>
-        <w:t>Xiangming</w:t>
+          <w:rFonts w:ascii="Noto Serif SC" w:eastAsia="Noto Serif SC" w:hAnsi="Noto Serif SC"/>
+          <w:sz w:val="24"/>
+          <w:szCs w:val="24"/>
+          <w:lang w:val="en-US"/>
+        </w:rPr>
+        <w:t>Long</w:t>
+      </w:r>
+      <w:r>
+        <w:rPr>
+          <w:rFonts w:ascii="Noto Serif SC" w:eastAsia="Noto Serif SC" w:hAnsi="Noto Serif SC"/>
+          <w:sz w:val="24"/>
+          <w:szCs w:val="24"/>
+          <w:lang w:val="en-US"/>
+        </w:rPr>
+        <w:t>y</w:t>
+      </w:r>
+      <w:r>
+        <w:rPr>
+          <w:rFonts w:ascii="Noto Serif SC" w:eastAsia="Noto Serif SC" w:hAnsi="Noto Serif SC"/>
+          <w:sz w:val="24"/>
+          <w:szCs w:val="24"/>
+          <w:lang w:val="en-US"/>
+        </w:rPr>
+        <w:t>uan</w:t>
       </w:r>
       <w:proofErr w:type="spellEnd"/>
       <w:r>
         <w:rPr>
-          <w:rFonts w:ascii="Noto Serif CJK SC" w:eastAsia="Noto Serif CJK SC" w:hAnsi="Noto Serif CJK SC"/>
-          <w:sz w:val="24"/>
-          <w:szCs w:val="24"/>
-          <w:lang w:val="en-US"/>
-        </w:rPr>
-        <w:t xml:space="preserve"> was born in Zhangzhou, Fujian Province in 1974, of Hakka </w:t>
-      </w:r>
-      <w:proofErr w:type="spellStart"/>
-      <w:r>
-        <w:rPr>
-          <w:rFonts w:ascii="Noto Serif CJK SC" w:eastAsia="Noto Serif CJK SC" w:hAnsi="Noto Serif CJK SC"/>
-          <w:sz w:val="24"/>
-          <w:szCs w:val="24"/>
-          <w:lang w:val="en-US"/>
-        </w:rPr>
-        <w:t>LongYuan</w:t>
-      </w:r>
-      <w:proofErr w:type="spellEnd"/>
-      <w:r>
-        <w:rPr>
-          <w:rFonts w:ascii="Noto Serif CJK SC" w:eastAsia="Noto Serif CJK SC" w:hAnsi="Noto Serif CJK SC"/>
+          <w:rFonts w:ascii="Noto Serif SC" w:eastAsia="Noto Serif SC" w:hAnsi="Noto Serif SC"/>
           <w:sz w:val="24"/>
           <w:szCs w:val="24"/>
           <w:lang w:val="en-US"/>
@@ -1864,1219 +1862,1207 @@
           <w:szCs w:val="24"/>
           <w:lang w:val="en-GB"/>
         </w:rPr>
+        <w:t xml:space="preserve"> Xindi</w:t>
+      </w:r>
+      <w:r>
+        <w:rPr>
+          <w:rFonts w:ascii="Noto Serif SC" w:eastAsia="Noto Serif SC" w:hAnsi="Noto Serif SC" w:cs="Noto Serif"/>
+          <w:sz w:val="24"/>
+          <w:szCs w:val="24"/>
+          <w:lang w:val="en-GB"/>
+        </w:rPr>
+        <w:t xml:space="preserve"> I, II</w:t>
+      </w:r>
+    </w:p>
+    <w:p>
+      <w:pPr>
+        <w:rPr>
+          <w:rFonts w:ascii="Noto Serif SC" w:eastAsia="Noto Serif SC" w:hAnsi="Noto Serif SC" w:cs="Noto Serif"/>
+          <w:sz w:val="24"/>
+          <w:szCs w:val="24"/>
+          <w:lang w:val="en-GB"/>
+        </w:rPr>
+      </w:pPr>
+      <w:r>
+        <w:rPr>
+          <w:rFonts w:ascii="Noto Serif SC" w:eastAsia="Noto Serif SC" w:hAnsi="Noto Serif SC" w:cs="Noto Serif" w:hint="eastAsia"/>
+          <w:sz w:val="24"/>
+          <w:szCs w:val="24"/>
+          <w:lang w:val="en-GB"/>
+        </w:rPr>
+        <w:t>高音笙</w:t>
+      </w:r>
+      <w:r>
+        <w:rPr>
+          <w:rFonts w:ascii="Noto Serif SC" w:eastAsia="Noto Serif SC" w:hAnsi="Noto Serif SC" w:cs="Noto Serif"/>
+          <w:sz w:val="24"/>
+          <w:szCs w:val="24"/>
+          <w:lang w:val="en-GB"/>
+        </w:rPr>
         <w:t xml:space="preserve"> </w:t>
       </w:r>
+      <w:r>
+        <w:rPr>
+          <w:rFonts w:ascii="Noto Serif SC" w:eastAsia="Noto Serif SC" w:hAnsi="Noto Serif SC" w:cs="Noto Serif"/>
+          <w:sz w:val="24"/>
+          <w:szCs w:val="24"/>
+          <w:lang w:val="en-GB"/>
+        </w:rPr>
+        <w:t xml:space="preserve">I, II </w:t>
+      </w:r>
+      <w:r>
+        <w:rPr>
+          <w:rFonts w:ascii="Noto Serif SC" w:eastAsia="Noto Serif SC" w:hAnsi="Noto Serif SC" w:cs="Noto Serif"/>
+          <w:sz w:val="24"/>
+          <w:szCs w:val="24"/>
+          <w:lang w:val="en-GB"/>
+        </w:rPr>
+        <w:t xml:space="preserve">Gaoyin </w:t>
+      </w:r>
+      <w:r>
+        <w:rPr>
+          <w:rFonts w:ascii="Noto Serif SC" w:eastAsia="Noto Serif SC" w:hAnsi="Noto Serif SC" w:cs="Noto Serif"/>
+          <w:sz w:val="24"/>
+          <w:szCs w:val="24"/>
+          <w:lang w:val="en-GB"/>
+        </w:rPr>
+        <w:t>Sheng</w:t>
+      </w:r>
+      <w:r>
+        <w:rPr>
+          <w:rFonts w:ascii="Noto Serif SC" w:eastAsia="Noto Serif SC" w:hAnsi="Noto Serif SC" w:cs="Noto Serif"/>
+          <w:sz w:val="24"/>
+          <w:szCs w:val="24"/>
+          <w:lang w:val="en-GB"/>
+        </w:rPr>
+        <w:t xml:space="preserve"> I, II</w:t>
+      </w:r>
+    </w:p>
+    <w:p>
+      <w:pPr>
+        <w:rPr>
+          <w:rFonts w:ascii="Noto Serif SC" w:eastAsia="Noto Serif SC" w:hAnsi="Noto Serif SC" w:cs="Noto Serif"/>
+          <w:sz w:val="24"/>
+          <w:szCs w:val="24"/>
+          <w:lang w:val="en-GB"/>
+        </w:rPr>
+      </w:pPr>
+      <w:r>
+        <w:rPr>
+          <w:rFonts w:ascii="Noto Serif SC" w:eastAsia="Noto Serif SC" w:hAnsi="Noto Serif SC" w:cs="Noto Serif" w:hint="eastAsia"/>
+          <w:sz w:val="24"/>
+          <w:szCs w:val="24"/>
+          <w:lang w:val="en-GB"/>
+        </w:rPr>
+        <w:t>中音笙</w:t>
+      </w:r>
+      <w:r>
+        <w:rPr>
+          <w:rFonts w:ascii="Noto Serif SC" w:eastAsia="Noto Serif SC" w:hAnsi="Noto Serif SC" w:cs="Noto Serif"/>
+          <w:sz w:val="24"/>
+          <w:szCs w:val="24"/>
+          <w:lang w:val="en-GB"/>
+        </w:rPr>
+        <w:t xml:space="preserve"> Zhongyin Sheng</w:t>
+      </w:r>
+    </w:p>
+    <w:p>
+      <w:pPr>
+        <w:spacing w:after="120"/>
+        <w:rPr>
+          <w:rFonts w:ascii="Noto Serif SC" w:eastAsia="Noto Serif SC" w:hAnsi="Noto Serif SC" w:cs="Noto Serif"/>
+          <w:sz w:val="24"/>
+          <w:szCs w:val="24"/>
+          <w:lang w:val="en-GB"/>
+        </w:rPr>
+      </w:pPr>
+      <w:r>
+        <w:rPr>
+          <w:rFonts w:ascii="Noto Serif SC" w:eastAsia="Noto Serif SC" w:hAnsi="Noto Serif SC" w:cs="Noto Serif" w:hint="eastAsia"/>
+          <w:sz w:val="24"/>
+          <w:szCs w:val="24"/>
+          <w:lang w:val="en-GB"/>
+        </w:rPr>
+        <w:t>低音笙</w:t>
+      </w:r>
+      <w:r>
+        <w:rPr>
+          <w:rFonts w:ascii="Noto Serif SC" w:eastAsia="Noto Serif SC" w:hAnsi="Noto Serif SC" w:cs="Noto Serif"/>
+          <w:sz w:val="24"/>
+          <w:szCs w:val="24"/>
+          <w:lang w:val="en-GB"/>
+        </w:rPr>
+        <w:t xml:space="preserve"> Diyin Sheng</w:t>
+      </w:r>
+    </w:p>
+    <w:p>
+      <w:pPr>
+        <w:rPr>
+          <w:rFonts w:ascii="Noto Serif SC" w:eastAsia="Noto Serif SC" w:hAnsi="Noto Serif SC" w:cs="Noto Serif"/>
+          <w:sz w:val="24"/>
+          <w:szCs w:val="24"/>
+          <w:lang w:val="en-GB"/>
+        </w:rPr>
+      </w:pPr>
+      <w:r>
+        <w:rPr>
+          <w:rFonts w:ascii="Noto Serif SC" w:eastAsia="Noto Serif SC" w:hAnsi="Noto Serif SC" w:cs="Noto Serif"/>
+          <w:sz w:val="24"/>
+          <w:szCs w:val="24"/>
+        </w:rPr>
+        <w:t>加键高音唢呐</w:t>
+      </w:r>
+      <w:r>
+        <w:rPr>
+          <w:rFonts w:ascii="Noto Serif SC" w:eastAsia="Noto Serif SC" w:hAnsi="Noto Serif SC" w:cs="Noto Serif"/>
+          <w:sz w:val="24"/>
+          <w:szCs w:val="24"/>
+          <w:lang w:val="en-GB"/>
+        </w:rPr>
+        <w:t xml:space="preserve">I, II </w:t>
+      </w:r>
+      <w:r>
+        <w:rPr>
+          <w:rFonts w:ascii="Noto Serif SC" w:eastAsia="Noto Serif SC" w:hAnsi="Noto Serif SC" w:cs="Noto Serif"/>
+          <w:sz w:val="24"/>
+          <w:szCs w:val="24"/>
+          <w:lang w:val="en-GB"/>
+        </w:rPr>
+        <w:t xml:space="preserve">Keyed </w:t>
+      </w:r>
+      <w:r>
+        <w:rPr>
+          <w:rFonts w:ascii="Noto Serif SC" w:eastAsia="Noto Serif SC" w:hAnsi="Noto Serif SC" w:cs="Noto Serif"/>
+          <w:sz w:val="24"/>
+          <w:szCs w:val="24"/>
+          <w:lang w:val="en-GB"/>
+        </w:rPr>
+        <w:t>Gaoyin Suona</w:t>
+      </w:r>
+      <w:r>
+        <w:rPr>
+          <w:rFonts w:ascii="Noto Serif SC" w:eastAsia="Noto Serif SC" w:hAnsi="Noto Serif SC" w:cs="Noto Serif"/>
+          <w:sz w:val="24"/>
+          <w:szCs w:val="24"/>
+          <w:lang w:val="en-GB"/>
+        </w:rPr>
+        <w:t xml:space="preserve"> </w:t>
+      </w:r>
+      <w:r>
+        <w:rPr>
+          <w:rFonts w:ascii="Noto Serif SC" w:eastAsia="Noto Serif SC" w:hAnsi="Noto Serif SC" w:cs="Noto Serif"/>
+          <w:sz w:val="24"/>
+          <w:szCs w:val="24"/>
+          <w:lang w:val="en-GB"/>
+        </w:rPr>
+        <w:t>I, II</w:t>
+      </w:r>
+    </w:p>
+    <w:p>
+      <w:pPr>
+        <w:rPr>
+          <w:rFonts w:ascii="Noto Serif SC" w:eastAsia="Noto Serif SC" w:hAnsi="Noto Serif SC" w:cs="Noto Serif"/>
+          <w:sz w:val="24"/>
+          <w:szCs w:val="24"/>
+          <w:lang w:val="en-US"/>
+        </w:rPr>
+      </w:pPr>
+      <w:r>
+        <w:rPr>
+          <w:rFonts w:ascii="Noto Serif SC" w:eastAsia="Noto Serif SC" w:hAnsi="Noto Serif SC" w:cs="Noto Serif" w:hint="eastAsia"/>
+          <w:sz w:val="24"/>
+          <w:szCs w:val="24"/>
+          <w:lang w:val="en-US"/>
+        </w:rPr>
+        <w:t>中音唢吶</w:t>
+      </w:r>
+      <w:r>
+        <w:rPr>
+          <w:rFonts w:ascii="Noto Serif SC" w:eastAsia="Noto Serif SC" w:hAnsi="Noto Serif SC" w:cs="Noto Serif"/>
+          <w:sz w:val="24"/>
+          <w:szCs w:val="24"/>
+          <w:lang w:val="en-US"/>
+        </w:rPr>
+        <w:t xml:space="preserve"> Zhongyin Suona</w:t>
+      </w:r>
+    </w:p>
+    <w:p>
+      <w:pPr>
+        <w:rPr>
+          <w:rFonts w:ascii="Noto Serif SC" w:eastAsia="Noto Serif SC" w:hAnsi="Noto Serif SC" w:cs="Noto Serif"/>
+          <w:sz w:val="24"/>
+          <w:szCs w:val="24"/>
+          <w:lang w:val="en-US"/>
+        </w:rPr>
+      </w:pPr>
+      <w:r>
+        <w:rPr>
+          <w:rFonts w:ascii="Noto Serif SC" w:eastAsia="Noto Serif SC" w:hAnsi="Noto Serif SC" w:cs="Noto Serif" w:hint="eastAsia"/>
+          <w:sz w:val="24"/>
+          <w:szCs w:val="24"/>
+          <w:lang w:val="en-US"/>
+        </w:rPr>
+        <w:t>次中</w:t>
+      </w:r>
+      <w:r>
+        <w:rPr>
+          <w:rFonts w:ascii="Noto Serif SC" w:eastAsia="Noto Serif SC" w:hAnsi="Noto Serif SC" w:cs="Noto Serif" w:hint="eastAsia"/>
+          <w:sz w:val="24"/>
+          <w:szCs w:val="24"/>
+          <w:lang w:val="en-GB"/>
+        </w:rPr>
+        <w:t>音</w:t>
+      </w:r>
+      <w:r>
+        <w:rPr>
+          <w:rFonts w:ascii="Noto Serif SC" w:eastAsia="Noto Serif SC" w:hAnsi="Noto Serif SC" w:cs="Noto Serif" w:hint="eastAsia"/>
+          <w:sz w:val="24"/>
+          <w:szCs w:val="24"/>
+          <w:lang w:val="en-US"/>
+        </w:rPr>
+        <w:t>唢吶</w:t>
+      </w:r>
+      <w:r>
+        <w:rPr>
+          <w:rFonts w:ascii="Noto Serif SC" w:eastAsia="Noto Serif SC" w:hAnsi="Noto Serif SC" w:cs="Noto Serif"/>
+          <w:sz w:val="24"/>
+          <w:szCs w:val="24"/>
+          <w:lang w:val="en-US"/>
+        </w:rPr>
+        <w:t xml:space="preserve"> </w:t>
+      </w:r>
+      <w:r>
+        <w:rPr>
+          <w:rFonts w:ascii="Noto Serif SC" w:eastAsia="Noto Serif SC" w:hAnsi="Noto Serif SC" w:cs="Noto Serif"/>
+          <w:sz w:val="24"/>
+          <w:szCs w:val="24"/>
+        </w:rPr>
+        <w:t xml:space="preserve">Cizhongyin </w:t>
+      </w:r>
+      <w:r>
+        <w:rPr>
+          <w:rFonts w:ascii="Noto Serif SC" w:eastAsia="Noto Serif SC" w:hAnsi="Noto Serif SC" w:cs="Noto Serif"/>
+          <w:sz w:val="24"/>
+          <w:szCs w:val="24"/>
+          <w:lang w:val="en-US"/>
+        </w:rPr>
+        <w:t>Suona</w:t>
+      </w:r>
+    </w:p>
+    <w:p>
+      <w:pPr>
+        <w:rPr>
+          <w:rFonts w:ascii="Noto Serif SC" w:eastAsia="Noto Serif SC" w:hAnsi="Noto Serif SC" w:cs="Noto Serif"/>
+          <w:sz w:val="24"/>
+          <w:szCs w:val="24"/>
+          <w:lang w:val="en-US"/>
+        </w:rPr>
+      </w:pPr>
+      <w:r>
+        <w:rPr>
+          <w:rFonts w:ascii="Noto Serif SC" w:eastAsia="Noto Serif SC" w:hAnsi="Noto Serif SC" w:cs="Noto Serif" w:hint="eastAsia"/>
+          <w:sz w:val="24"/>
+          <w:szCs w:val="24"/>
+        </w:rPr>
+        <w:t>低音唢吶</w:t>
+      </w:r>
+      <w:r>
+        <w:rPr>
+          <w:rFonts w:ascii="Noto Serif SC" w:eastAsia="Noto Serif SC" w:hAnsi="Noto Serif SC" w:cs="Noto Serif"/>
+          <w:sz w:val="24"/>
+          <w:szCs w:val="24"/>
+        </w:rPr>
+        <w:t xml:space="preserve"> Diyin Suona</w:t>
+      </w:r>
+    </w:p>
+    <w:p>
+      <w:pPr>
+        <w:rPr>
+          <w:rFonts w:ascii="Noto Serif SC" w:eastAsia="Noto Serif SC" w:hAnsi="Noto Serif SC" w:cs="Noto Serif"/>
+          <w:sz w:val="24"/>
+          <w:szCs w:val="24"/>
+          <w:lang w:val="en-US"/>
+        </w:rPr>
+      </w:pPr>
+    </w:p>
+    <w:p>
+      <w:pPr>
+        <w:rPr>
+          <w:rFonts w:ascii="Noto Serif SC" w:eastAsia="Noto Serif SC" w:hAnsi="Noto Serif SC" w:cs="Noto Serif"/>
+          <w:sz w:val="24"/>
+          <w:szCs w:val="24"/>
+          <w:lang w:val="en-US"/>
+        </w:rPr>
+      </w:pPr>
+      <w:r>
+        <w:rPr>
+          <w:rFonts w:ascii="Noto Serif SC" w:eastAsia="Noto Serif SC" w:hAnsi="Noto Serif SC" w:cs="Noto Serif" w:hint="eastAsia"/>
+          <w:sz w:val="24"/>
+          <w:szCs w:val="24"/>
+          <w:lang w:val="en-US"/>
+        </w:rPr>
+        <w:t>扬琴</w:t>
+      </w:r>
+      <w:r>
+        <w:rPr>
+          <w:rFonts w:ascii="Noto Serif SC" w:eastAsia="Noto Serif SC" w:hAnsi="Noto Serif SC" w:cs="Noto Serif"/>
+          <w:sz w:val="24"/>
+          <w:szCs w:val="24"/>
+          <w:lang w:val="en-US"/>
+        </w:rPr>
+        <w:t xml:space="preserve"> Yangqin</w:t>
+      </w:r>
+      <w:r>
+        <w:rPr>
+          <w:rFonts w:ascii="Noto Serif SC" w:eastAsia="Noto Serif SC" w:hAnsi="Noto Serif SC" w:cs="Noto Serif"/>
+          <w:sz w:val="24"/>
+          <w:szCs w:val="24"/>
+          <w:lang w:val="en-US"/>
+        </w:rPr>
+        <w:t xml:space="preserve"> </w:t>
+      </w:r>
+      <w:r>
+        <w:rPr>
+          <w:rFonts w:ascii="Noto Serif SC" w:eastAsia="Noto Serif SC" w:hAnsi="Noto Serif SC" w:cs="Noto Serif"/>
+          <w:sz w:val="24"/>
+          <w:szCs w:val="24"/>
+          <w:lang w:val="en-US"/>
+        </w:rPr>
+        <w:t>(2)</w:t>
+      </w:r>
+      <w:r>
+        <w:rPr>
+          <w:rFonts w:ascii="Noto Serif SC" w:eastAsia="Noto Serif SC" w:hAnsi="Noto Serif SC" w:cs="Noto Serif"/>
+          <w:sz w:val="24"/>
+          <w:szCs w:val="24"/>
+          <w:lang w:val="en-US"/>
+        </w:rPr>
+        <w:t>*</w:t>
+      </w:r>
+    </w:p>
+    <w:p>
+      <w:pPr>
+        <w:rPr>
+          <w:rFonts w:ascii="Noto Serif SC" w:eastAsia="Noto Serif SC" w:hAnsi="Noto Serif SC" w:cs="Noto Serif"/>
+          <w:sz w:val="24"/>
+          <w:szCs w:val="24"/>
+          <w:lang w:val="en-US"/>
+        </w:rPr>
+      </w:pPr>
+      <w:r>
+        <w:rPr>
+          <w:rFonts w:ascii="Noto Serif SC" w:eastAsia="Noto Serif SC" w:hAnsi="Noto Serif SC" w:cs="Noto Serif" w:hint="eastAsia"/>
+          <w:sz w:val="24"/>
+          <w:szCs w:val="24"/>
+          <w:lang w:val="en-US"/>
+        </w:rPr>
+        <w:t>柳琴</w:t>
+      </w:r>
+      <w:r>
+        <w:rPr>
+          <w:rFonts w:ascii="Noto Serif SC" w:eastAsia="Noto Serif SC" w:hAnsi="Noto Serif SC" w:cs="Noto Serif"/>
+          <w:sz w:val="24"/>
+          <w:szCs w:val="24"/>
+          <w:lang w:val="en-US"/>
+        </w:rPr>
+        <w:t>Liuqin</w:t>
+      </w:r>
+      <w:r>
+        <w:rPr>
+          <w:rFonts w:ascii="Noto Serif SC" w:eastAsia="Noto Serif SC" w:hAnsi="Noto Serif SC" w:cs="Noto Serif"/>
+          <w:sz w:val="24"/>
+          <w:szCs w:val="24"/>
+          <w:lang w:val="en-US"/>
+        </w:rPr>
+        <w:t xml:space="preserve"> </w:t>
+      </w:r>
+      <w:r>
+        <w:rPr>
+          <w:rFonts w:ascii="Noto Serif SC" w:eastAsia="Noto Serif SC" w:hAnsi="Noto Serif SC" w:cs="Noto Serif"/>
+          <w:sz w:val="24"/>
+          <w:szCs w:val="24"/>
+          <w:lang w:val="en-US"/>
+        </w:rPr>
+        <w:t>(2)</w:t>
+      </w:r>
+    </w:p>
+    <w:p>
+      <w:pPr>
+        <w:rPr>
+          <w:rFonts w:ascii="Noto Serif SC" w:eastAsia="Noto Serif SC" w:hAnsi="Noto Serif SC" w:cs="Noto Serif"/>
+          <w:sz w:val="24"/>
+          <w:szCs w:val="24"/>
+          <w:lang w:val="en-US"/>
+        </w:rPr>
+      </w:pPr>
+      <w:r>
+        <w:rPr>
+          <w:rFonts w:ascii="Noto Serif SC" w:eastAsia="Noto Serif SC" w:hAnsi="Noto Serif SC" w:cs="Noto Serif" w:hint="eastAsia"/>
+          <w:sz w:val="24"/>
+          <w:szCs w:val="24"/>
+          <w:lang w:val="en-US"/>
+        </w:rPr>
+        <w:t>琵琶</w:t>
+      </w:r>
+      <w:r>
+        <w:rPr>
+          <w:rFonts w:ascii="Noto Serif SC" w:eastAsia="Noto Serif SC" w:hAnsi="Noto Serif SC" w:cs="Noto Serif"/>
+          <w:sz w:val="24"/>
+          <w:szCs w:val="24"/>
+          <w:lang w:val="en-US"/>
+        </w:rPr>
+        <w:t>Pipa</w:t>
+      </w:r>
+      <w:r>
+        <w:rPr>
+          <w:rFonts w:ascii="Noto Serif SC" w:eastAsia="Noto Serif SC" w:hAnsi="Noto Serif SC" w:cs="Noto Serif"/>
+          <w:sz w:val="24"/>
+          <w:szCs w:val="24"/>
+          <w:lang w:val="en-US"/>
+        </w:rPr>
+        <w:t xml:space="preserve"> </w:t>
+      </w:r>
+      <w:r>
+        <w:rPr>
+          <w:rFonts w:ascii="Noto Serif SC" w:eastAsia="Noto Serif SC" w:hAnsi="Noto Serif SC" w:cs="Noto Serif"/>
+          <w:sz w:val="24"/>
+          <w:szCs w:val="24"/>
+          <w:lang w:val="en-US"/>
+        </w:rPr>
+        <w:t>(4)</w:t>
+      </w:r>
+    </w:p>
+    <w:p>
+      <w:pPr>
+        <w:rPr>
+          <w:rFonts w:ascii="Noto Serif SC" w:eastAsia="Noto Serif SC" w:hAnsi="Noto Serif SC" w:cs="Noto Serif"/>
+          <w:sz w:val="24"/>
+          <w:szCs w:val="24"/>
+          <w:lang w:val="en-US"/>
+        </w:rPr>
+      </w:pPr>
+      <w:r>
+        <w:rPr>
+          <w:rFonts w:ascii="Noto Serif SC" w:eastAsia="Noto Serif SC" w:hAnsi="Noto Serif SC" w:cs="Noto Serif" w:hint="eastAsia"/>
+          <w:sz w:val="24"/>
+          <w:szCs w:val="24"/>
+          <w:lang w:val="en-US"/>
+        </w:rPr>
+        <w:t>中阮</w:t>
+      </w:r>
+      <w:r>
+        <w:rPr>
+          <w:rFonts w:ascii="Noto Serif SC" w:eastAsia="Noto Serif SC" w:hAnsi="Noto Serif SC" w:cs="Noto Serif"/>
+          <w:sz w:val="24"/>
+          <w:szCs w:val="24"/>
+          <w:lang w:val="en-US"/>
+        </w:rPr>
+        <w:t>Zhongruan</w:t>
+      </w:r>
+      <w:r>
+        <w:rPr>
+          <w:rFonts w:ascii="Noto Serif SC" w:eastAsia="Noto Serif SC" w:hAnsi="Noto Serif SC" w:cs="Noto Serif"/>
+          <w:sz w:val="24"/>
+          <w:szCs w:val="24"/>
+          <w:lang w:val="en-US"/>
+        </w:rPr>
+        <w:t xml:space="preserve"> </w:t>
+      </w:r>
+      <w:r>
+        <w:rPr>
+          <w:rFonts w:ascii="Noto Serif SC" w:eastAsia="Noto Serif SC" w:hAnsi="Noto Serif SC" w:cs="Noto Serif"/>
+          <w:sz w:val="24"/>
+          <w:szCs w:val="24"/>
+          <w:lang w:val="en-US"/>
+        </w:rPr>
+        <w:t>(4)</w:t>
+      </w:r>
+    </w:p>
+    <w:p>
+      <w:pPr>
+        <w:rPr>
+          <w:rFonts w:ascii="Noto Serif SC" w:eastAsia="Noto Serif SC" w:hAnsi="Noto Serif SC" w:cs="Noto Serif"/>
+          <w:sz w:val="24"/>
+          <w:szCs w:val="24"/>
+          <w:lang w:val="en-US"/>
+        </w:rPr>
+      </w:pPr>
+      <w:r>
+        <w:rPr>
+          <w:rFonts w:ascii="Noto Serif SC" w:eastAsia="Noto Serif SC" w:hAnsi="Noto Serif SC" w:cs="Noto Serif" w:hint="eastAsia"/>
+          <w:sz w:val="24"/>
+          <w:szCs w:val="24"/>
+          <w:lang w:val="en-US"/>
+        </w:rPr>
+        <w:t>大阮</w:t>
+      </w:r>
+      <w:r>
+        <w:rPr>
+          <w:rFonts w:ascii="Noto Serif SC" w:eastAsia="Noto Serif SC" w:hAnsi="Noto Serif SC" w:cs="Noto Serif"/>
+          <w:sz w:val="24"/>
+          <w:szCs w:val="24"/>
+          <w:lang w:val="en-US"/>
+        </w:rPr>
+        <w:t>Daruan</w:t>
+      </w:r>
+      <w:r>
+        <w:rPr>
+          <w:rFonts w:ascii="Noto Serif SC" w:eastAsia="Noto Serif SC" w:hAnsi="Noto Serif SC" w:cs="Noto Serif"/>
+          <w:sz w:val="24"/>
+          <w:szCs w:val="24"/>
+          <w:lang w:val="en-US"/>
+        </w:rPr>
+        <w:t xml:space="preserve"> </w:t>
+      </w:r>
+      <w:r>
+        <w:rPr>
+          <w:rFonts w:ascii="Noto Serif SC" w:eastAsia="Noto Serif SC" w:hAnsi="Noto Serif SC" w:cs="Noto Serif"/>
+          <w:sz w:val="24"/>
+          <w:szCs w:val="24"/>
+          <w:lang w:val="en-US"/>
+        </w:rPr>
+        <w:t>(2)</w:t>
+      </w:r>
+    </w:p>
+    <w:p>
+      <w:pPr>
+        <w:rPr>
+          <w:rFonts w:ascii="Noto Serif SC" w:eastAsia="Noto Serif SC" w:hAnsi="Noto Serif SC" w:cs="Noto Serif"/>
+          <w:sz w:val="24"/>
+          <w:szCs w:val="24"/>
+          <w:lang w:val="en-US"/>
+        </w:rPr>
+      </w:pPr>
+      <w:r>
+        <w:rPr>
+          <w:rFonts w:ascii="Noto Serif SC" w:eastAsia="Noto Serif SC" w:hAnsi="Noto Serif SC" w:cs="Noto Serif" w:hint="eastAsia"/>
+          <w:sz w:val="24"/>
+          <w:szCs w:val="24"/>
+        </w:rPr>
+        <w:t>古筝</w:t>
+      </w:r>
+      <w:r>
+        <w:rPr>
+          <w:rFonts w:ascii="Noto Serif SC" w:eastAsia="Noto Serif SC" w:hAnsi="Noto Serif SC" w:cs="Noto Serif"/>
+          <w:sz w:val="24"/>
+          <w:szCs w:val="24"/>
+          <w:lang w:val="en-US"/>
+        </w:rPr>
+        <w:t>Guzheng</w:t>
+      </w:r>
+      <w:r>
+        <w:rPr>
+          <w:rFonts w:ascii="Noto Serif SC" w:eastAsia="Noto Serif SC" w:hAnsi="Noto Serif SC" w:cs="Noto Serif"/>
+          <w:sz w:val="24"/>
+          <w:szCs w:val="24"/>
+          <w:lang w:val="en-US"/>
+        </w:rPr>
+        <w:t xml:space="preserve"> </w:t>
+      </w:r>
+      <w:r>
+        <w:rPr>
+          <w:rFonts w:ascii="Noto Serif SC" w:eastAsia="Noto Serif SC" w:hAnsi="Noto Serif SC" w:cs="Noto Serif"/>
+          <w:sz w:val="24"/>
+          <w:szCs w:val="24"/>
+          <w:lang w:val="en-US"/>
+        </w:rPr>
+        <w:t>(2)</w:t>
+      </w:r>
+    </w:p>
+    <w:p>
+      <w:pPr>
+        <w:rPr>
+          <w:rFonts w:ascii="Noto Serif SC" w:eastAsia="Noto Serif SC" w:hAnsi="Noto Serif SC" w:cs="Noto Serif"/>
+          <w:sz w:val="24"/>
+          <w:szCs w:val="24"/>
+          <w:lang w:val="en-US"/>
+        </w:rPr>
+      </w:pPr>
+    </w:p>
+    <w:p>
+      <w:pPr>
+        <w:rPr>
+          <w:rFonts w:ascii="Noto Serif SC" w:eastAsia="Noto Serif SC" w:hAnsi="Noto Serif SC" w:cs="Noto Serif"/>
+          <w:sz w:val="24"/>
+          <w:szCs w:val="24"/>
+          <w:lang w:val="en-US"/>
+        </w:rPr>
+      </w:pPr>
+      <w:r>
+        <w:rPr>
+          <w:rFonts w:ascii="Noto Serif SC" w:eastAsia="Noto Serif SC" w:hAnsi="Noto Serif SC" w:cs="Noto Serif" w:hint="eastAsia"/>
+          <w:sz w:val="24"/>
+          <w:szCs w:val="24"/>
+        </w:rPr>
+        <w:t>定音鼓</w:t>
+      </w:r>
+      <w:r>
+        <w:rPr>
+          <w:rFonts w:ascii="Noto Serif SC" w:eastAsia="Noto Serif SC" w:hAnsi="Noto Serif SC" w:cs="Noto Serif"/>
+          <w:sz w:val="24"/>
+          <w:szCs w:val="24"/>
+          <w:lang w:val="en-US"/>
+        </w:rPr>
+        <w:t xml:space="preserve"> Timpani</w:t>
+      </w:r>
+    </w:p>
+    <w:p>
+      <w:pPr>
+        <w:rPr>
+          <w:rFonts w:ascii="Noto Serif SC" w:eastAsia="Noto Serif SC" w:hAnsi="Noto Serif SC" w:cs="Noto Serif"/>
+          <w:sz w:val="24"/>
+          <w:szCs w:val="24"/>
+          <w:lang w:val="en-US"/>
+        </w:rPr>
+      </w:pPr>
+      <w:r>
+        <w:rPr>
+          <w:rFonts w:ascii="Noto Serif SC" w:eastAsia="Noto Serif SC" w:hAnsi="Noto Serif SC" w:cs="Noto Serif"/>
+          <w:sz w:val="24"/>
+          <w:szCs w:val="24"/>
+        </w:rPr>
+        <w:t>4</w:t>
+      </w:r>
+      <w:r>
+        <w:rPr>
+          <w:rFonts w:ascii="Noto Serif SC" w:eastAsia="Noto Serif SC" w:hAnsi="Noto Serif SC" w:cs="Noto Serif" w:hint="eastAsia"/>
+          <w:sz w:val="24"/>
+          <w:szCs w:val="24"/>
+        </w:rPr>
+        <w:t xml:space="preserve"> 打击乐 </w:t>
+      </w:r>
+      <w:r>
+        <w:rPr>
+          <w:rFonts w:ascii="Noto Serif SC" w:eastAsia="Noto Serif SC" w:hAnsi="Noto Serif SC" w:cs="Noto Serif"/>
+          <w:sz w:val="24"/>
+          <w:szCs w:val="24"/>
+        </w:rPr>
+        <w:t>Percussion</w:t>
+      </w:r>
+    </w:p>
+    <w:p>
+      <w:pPr>
+        <w:ind w:left="720" w:hanging="436"/>
+        <w:rPr>
+          <w:rFonts w:ascii="Noto Serif SC" w:eastAsia="Noto Serif SC" w:hAnsi="Noto Serif SC" w:cs="Noto Serif"/>
+          <w:sz w:val="20"/>
+          <w:szCs w:val="20"/>
+          <w:lang w:val="en-US"/>
+        </w:rPr>
+      </w:pPr>
+      <w:r>
+        <w:rPr>
+          <w:rFonts w:ascii="Noto Serif SC" w:eastAsia="Noto Serif SC" w:hAnsi="Noto Serif SC" w:cs="Noto Serif"/>
+          <w:sz w:val="20"/>
+          <w:szCs w:val="20"/>
+          <w:lang w:val="en-US"/>
+        </w:rPr>
+        <w:t xml:space="preserve">I: </w:t>
+      </w:r>
+      <w:r>
+        <w:rPr>
+          <w:rFonts w:ascii="Noto Serif SC" w:eastAsia="Noto Serif SC" w:hAnsi="Noto Serif SC" w:cs="Noto Serif" w:hint="eastAsia"/>
+          <w:sz w:val="20"/>
+          <w:szCs w:val="20"/>
+        </w:rPr>
+        <w:t>大军鼓</w:t>
+      </w:r>
+      <w:r>
+        <w:rPr>
+          <w:rFonts w:ascii="Noto Serif SC" w:eastAsia="Noto Serif SC" w:hAnsi="Noto Serif SC" w:cs="Noto Serif"/>
+          <w:sz w:val="20"/>
+          <w:szCs w:val="20"/>
+        </w:rPr>
+        <w:t xml:space="preserve"> Bass Drum, </w:t>
+      </w:r>
+      <w:r>
+        <w:rPr>
+          <w:rFonts w:ascii="Noto Serif SC" w:eastAsia="Noto Serif SC" w:hAnsi="Noto Serif SC" w:cs="Noto Serif" w:hint="eastAsia"/>
+          <w:sz w:val="20"/>
+          <w:szCs w:val="20"/>
+        </w:rPr>
+        <w:t>板鼓</w:t>
+      </w:r>
+      <w:r>
+        <w:rPr>
+          <w:rFonts w:ascii="Noto Serif SC" w:eastAsia="Noto Serif SC" w:hAnsi="Noto Serif SC" w:cs="Noto Serif"/>
+          <w:sz w:val="20"/>
+          <w:szCs w:val="20"/>
+        </w:rPr>
+        <w:t xml:space="preserve"> Bangu</w:t>
+      </w:r>
+    </w:p>
+    <w:p>
+      <w:pPr>
+        <w:ind w:left="720" w:hanging="436"/>
+        <w:rPr>
+          <w:rFonts w:ascii="Noto Serif SC" w:eastAsia="Noto Serif SC" w:hAnsi="Noto Serif SC" w:cs="Noto Serif"/>
+          <w:sz w:val="20"/>
+          <w:szCs w:val="20"/>
+        </w:rPr>
+      </w:pPr>
+      <w:r>
+        <w:rPr>
+          <w:rFonts w:ascii="Noto Serif SC" w:eastAsia="Noto Serif SC" w:hAnsi="Noto Serif SC" w:cs="Noto Serif"/>
+          <w:sz w:val="20"/>
+          <w:szCs w:val="20"/>
+          <w:lang w:val="en-US"/>
+        </w:rPr>
+        <w:t xml:space="preserve">II: </w:t>
+      </w:r>
+      <w:r>
+        <w:rPr>
+          <w:rFonts w:ascii="Noto Serif SC" w:eastAsia="Noto Serif SC" w:hAnsi="Noto Serif SC" w:cs="Noto Serif" w:hint="eastAsia"/>
+          <w:sz w:val="20"/>
+          <w:szCs w:val="20"/>
+        </w:rPr>
+        <w:t>吊镲</w:t>
+      </w:r>
+      <w:r>
+        <w:rPr>
+          <w:rFonts w:ascii="Noto Serif SC" w:eastAsia="Noto Serif SC" w:hAnsi="Noto Serif SC" w:cs="Noto Serif"/>
+          <w:sz w:val="20"/>
+          <w:szCs w:val="20"/>
+        </w:rPr>
+        <w:t xml:space="preserve"> Suspended Cymbal, </w:t>
+      </w:r>
+      <w:r>
+        <w:rPr>
+          <w:rFonts w:ascii="Noto Serif SC" w:eastAsia="Noto Serif SC" w:hAnsi="Noto Serif SC" w:cs="Noto Serif" w:hint="eastAsia"/>
+          <w:sz w:val="20"/>
+          <w:szCs w:val="20"/>
+        </w:rPr>
+        <w:t>碰铃</w:t>
+      </w:r>
+      <w:r>
+        <w:rPr>
+          <w:rFonts w:ascii="Noto Serif SC" w:eastAsia="Noto Serif SC" w:hAnsi="Noto Serif SC" w:cs="Noto Serif"/>
+          <w:sz w:val="20"/>
+          <w:szCs w:val="20"/>
+        </w:rPr>
+        <w:t xml:space="preserve"> </w:t>
+      </w:r>
       <w:proofErr w:type="spellStart"/>
       <w:r>
         <w:rPr>
           <w:rFonts w:ascii="Noto Serif SC" w:eastAsia="Noto Serif SC" w:hAnsi="Noto Serif SC" w:cs="Noto Serif"/>
-          <w:sz w:val="24"/>
-          <w:szCs w:val="24"/>
+          <w:sz w:val="20"/>
+          <w:szCs w:val="20"/>
+        </w:rPr>
+        <w:t>Pengling</w:t>
+      </w:r>
+      <w:proofErr w:type="spellEnd"/>
+      <w:r>
+        <w:rPr>
+          <w:rFonts w:ascii="Noto Serif SC" w:eastAsia="Noto Serif SC" w:hAnsi="Noto Serif SC" w:cs="Noto Serif"/>
+          <w:sz w:val="20"/>
+          <w:szCs w:val="20"/>
+        </w:rPr>
+        <w:t xml:space="preserve">, </w:t>
+      </w:r>
+      <w:r>
+        <w:rPr>
+          <w:rFonts w:ascii="Noto Serif SC" w:eastAsia="Noto Serif SC" w:hAnsi="Noto Serif SC" w:cs="Noto Serif" w:hint="eastAsia"/>
+          <w:sz w:val="20"/>
+          <w:szCs w:val="20"/>
+        </w:rPr>
+        <w:t>低音木鱼</w:t>
+      </w:r>
+      <w:r>
+        <w:rPr>
+          <w:rFonts w:ascii="Noto Serif SC" w:eastAsia="Noto Serif SC" w:hAnsi="Noto Serif SC" w:cs="Noto Serif"/>
+          <w:sz w:val="20"/>
+          <w:szCs w:val="20"/>
+        </w:rPr>
+        <w:t xml:space="preserve"> Low Woodblock</w:t>
+      </w:r>
+    </w:p>
+    <w:p>
+      <w:pPr>
+        <w:ind w:left="720" w:hanging="436"/>
+        <w:rPr>
+          <w:rFonts w:ascii="Noto Serif SC" w:eastAsia="Noto Serif SC" w:hAnsi="Noto Serif SC" w:cs="Noto Serif"/>
+          <w:sz w:val="20"/>
+          <w:szCs w:val="20"/>
+        </w:rPr>
+      </w:pPr>
+      <w:r>
+        <w:rPr>
+          <w:rFonts w:ascii="Noto Serif SC" w:eastAsia="Noto Serif SC" w:hAnsi="Noto Serif SC" w:cs="Noto Serif"/>
+          <w:sz w:val="20"/>
+          <w:szCs w:val="20"/>
+          <w:lang w:val="en-US"/>
+        </w:rPr>
+        <w:t xml:space="preserve">III: </w:t>
+      </w:r>
+      <w:r>
+        <w:rPr>
+          <w:rFonts w:ascii="Noto Serif SC" w:eastAsia="Noto Serif SC" w:hAnsi="Noto Serif SC" w:cs="Noto Serif" w:hint="eastAsia"/>
+          <w:sz w:val="20"/>
+          <w:szCs w:val="20"/>
+          <w:lang w:val="en-US"/>
+        </w:rPr>
+        <w:t>小军鼓</w:t>
+      </w:r>
+      <w:r>
+        <w:rPr>
+          <w:rFonts w:ascii="Noto Serif SC" w:eastAsia="Noto Serif SC" w:hAnsi="Noto Serif SC" w:cs="Noto Serif"/>
+          <w:sz w:val="20"/>
+          <w:szCs w:val="20"/>
+          <w:lang w:val="en-US"/>
+        </w:rPr>
+        <w:t xml:space="preserve"> Snare Drum, </w:t>
+      </w:r>
+      <w:r>
+        <w:rPr>
+          <w:rFonts w:ascii="Noto Serif SC" w:eastAsia="Noto Serif SC" w:hAnsi="Noto Serif SC" w:cs="Noto Serif" w:hint="eastAsia"/>
+          <w:sz w:val="20"/>
+          <w:szCs w:val="20"/>
+        </w:rPr>
+        <w:t>铃鼓</w:t>
+      </w:r>
+      <w:r>
+        <w:rPr>
+          <w:rFonts w:ascii="Noto Serif SC" w:eastAsia="Noto Serif SC" w:hAnsi="Noto Serif SC" w:cs="Noto Serif"/>
+          <w:sz w:val="20"/>
+          <w:szCs w:val="20"/>
+        </w:rPr>
+        <w:t xml:space="preserve"> Tambourine, </w:t>
+      </w:r>
+      <w:r>
+        <w:rPr>
+          <w:rFonts w:ascii="Noto Serif SC" w:eastAsia="Noto Serif SC" w:hAnsi="Noto Serif SC" w:cs="Noto Serif" w:hint="eastAsia"/>
+          <w:sz w:val="20"/>
+          <w:szCs w:val="20"/>
+        </w:rPr>
+        <w:t>钟琴</w:t>
+      </w:r>
+      <w:r>
+        <w:rPr>
+          <w:rFonts w:ascii="Noto Serif SC" w:eastAsia="Noto Serif SC" w:hAnsi="Noto Serif SC" w:cs="Noto Serif"/>
+          <w:sz w:val="20"/>
+          <w:szCs w:val="20"/>
+        </w:rPr>
+        <w:t xml:space="preserve"> Glockenspiel, </w:t>
+      </w:r>
+      <w:r>
+        <w:rPr>
+          <w:rFonts w:ascii="Noto Serif SC" w:eastAsia="Noto Serif SC" w:hAnsi="Noto Serif SC" w:cs="Noto Serif" w:hint="eastAsia"/>
+          <w:sz w:val="20"/>
+          <w:szCs w:val="20"/>
+        </w:rPr>
+        <w:t>小钹</w:t>
+      </w:r>
+      <w:r>
+        <w:rPr>
+          <w:rFonts w:ascii="Noto Serif SC" w:eastAsia="Noto Serif SC" w:hAnsi="Noto Serif SC" w:cs="Noto Serif"/>
+          <w:sz w:val="20"/>
+          <w:szCs w:val="20"/>
+        </w:rPr>
+        <w:t xml:space="preserve"> Xiaobo, </w:t>
+      </w:r>
+      <w:r>
+        <w:rPr>
+          <w:rFonts w:ascii="Noto Serif SC" w:eastAsia="Noto Serif SC" w:hAnsi="Noto Serif SC" w:cs="Noto Serif" w:hint="eastAsia"/>
+          <w:sz w:val="20"/>
+          <w:szCs w:val="20"/>
+        </w:rPr>
+        <w:t>小堂鼓</w:t>
+      </w:r>
+      <w:r>
+        <w:rPr>
+          <w:rFonts w:ascii="Noto Serif SC" w:eastAsia="Noto Serif SC" w:hAnsi="Noto Serif SC" w:cs="Noto Serif"/>
+          <w:sz w:val="20"/>
+          <w:szCs w:val="20"/>
+        </w:rPr>
+        <w:t xml:space="preserve"> </w:t>
+      </w:r>
+      <w:proofErr w:type="spellStart"/>
+      <w:r>
+        <w:rPr>
+          <w:rFonts w:ascii="Noto Serif SC" w:eastAsia="Noto Serif SC" w:hAnsi="Noto Serif SC" w:cs="Noto Serif"/>
+          <w:sz w:val="20"/>
+          <w:szCs w:val="20"/>
+        </w:rPr>
+        <w:t>Xiaotanggu</w:t>
+      </w:r>
+      <w:proofErr w:type="spellEnd"/>
+    </w:p>
+    <w:p>
+      <w:pPr>
+        <w:ind w:left="720" w:hanging="436"/>
+        <w:rPr>
+          <w:rFonts w:ascii="Noto Serif SC" w:eastAsia="Noto Serif SC" w:hAnsi="Noto Serif SC" w:cs="Noto Serif"/>
+          <w:sz w:val="20"/>
+          <w:szCs w:val="20"/>
+          <w:lang w:val="en-US"/>
+        </w:rPr>
+      </w:pPr>
+      <w:r>
+        <w:rPr>
+          <w:rFonts w:ascii="Noto Serif SC" w:eastAsia="Noto Serif SC" w:hAnsi="Noto Serif SC" w:cs="Noto Serif"/>
+          <w:sz w:val="20"/>
+          <w:szCs w:val="20"/>
+          <w:lang w:val="en-US"/>
+        </w:rPr>
+        <w:t xml:space="preserve">IV: </w:t>
+      </w:r>
+      <w:r>
+        <w:rPr>
+          <w:rFonts w:ascii="Noto Serif SC" w:eastAsia="Noto Serif SC" w:hAnsi="Noto Serif SC" w:cs="Noto Serif" w:hint="eastAsia"/>
+          <w:sz w:val="20"/>
+          <w:szCs w:val="20"/>
+        </w:rPr>
+        <w:t>鞭子</w:t>
+      </w:r>
+      <w:r>
+        <w:rPr>
+          <w:rFonts w:ascii="Noto Serif SC" w:eastAsia="Noto Serif SC" w:hAnsi="Noto Serif SC" w:cs="Noto Serif"/>
+          <w:sz w:val="20"/>
+          <w:szCs w:val="20"/>
+        </w:rPr>
+        <w:t xml:space="preserve"> Whip, </w:t>
+      </w:r>
+      <w:r>
+        <w:rPr>
+          <w:rFonts w:ascii="Noto Serif SC" w:eastAsia="Noto Serif SC" w:hAnsi="Noto Serif SC" w:cs="Noto Serif" w:hint="eastAsia"/>
+          <w:sz w:val="20"/>
+          <w:szCs w:val="20"/>
+        </w:rPr>
+        <w:t>中钹</w:t>
+      </w:r>
+      <w:r>
+        <w:rPr>
+          <w:rFonts w:ascii="Noto Serif SC" w:eastAsia="Noto Serif SC" w:hAnsi="Noto Serif SC" w:cs="Noto Serif"/>
+          <w:sz w:val="20"/>
+          <w:szCs w:val="20"/>
+        </w:rPr>
+        <w:t xml:space="preserve"> </w:t>
+      </w:r>
+      <w:proofErr w:type="spellStart"/>
+      <w:r>
+        <w:rPr>
+          <w:rFonts w:ascii="Noto Serif SC" w:eastAsia="Noto Serif SC" w:hAnsi="Noto Serif SC" w:cs="Noto Serif"/>
+          <w:sz w:val="20"/>
+          <w:szCs w:val="20"/>
+        </w:rPr>
+        <w:t>Zhongbo</w:t>
+      </w:r>
+      <w:proofErr w:type="spellEnd"/>
+      <w:r>
+        <w:rPr>
+          <w:rFonts w:ascii="Noto Serif SC" w:eastAsia="Noto Serif SC" w:hAnsi="Noto Serif SC" w:cs="Noto Serif"/>
+          <w:sz w:val="20"/>
+          <w:szCs w:val="20"/>
+        </w:rPr>
+        <w:t xml:space="preserve">, </w:t>
+      </w:r>
+      <w:r>
+        <w:rPr>
+          <w:rFonts w:ascii="Noto Serif SC" w:eastAsia="Noto Serif SC" w:hAnsi="Noto Serif SC" w:cs="Noto Serif" w:hint="eastAsia"/>
+          <w:sz w:val="20"/>
+          <w:szCs w:val="20"/>
+        </w:rPr>
+        <w:t>中国小钹</w:t>
+      </w:r>
+      <w:r>
+        <w:rPr>
+          <w:rFonts w:ascii="Noto Serif SC" w:eastAsia="Noto Serif SC" w:hAnsi="Noto Serif SC" w:cs="Noto Serif"/>
+          <w:sz w:val="20"/>
+          <w:szCs w:val="20"/>
           <w:lang w:val="en-GB"/>
         </w:rPr>
-        <w:t>Xindi</w:t>
+        <w:t xml:space="preserve"> </w:t>
+      </w:r>
+      <w:proofErr w:type="spellStart"/>
+      <w:r>
+        <w:rPr>
+          <w:rFonts w:ascii="Noto Serif SC" w:eastAsia="Noto Serif SC" w:hAnsi="Noto Serif SC" w:cs="Noto Serif"/>
+          <w:sz w:val="20"/>
+          <w:szCs w:val="20"/>
+        </w:rPr>
+        <w:t>Xiaoluo</w:t>
       </w:r>
       <w:proofErr w:type="spellEnd"/>
       <w:r>
         <w:rPr>
           <w:rFonts w:ascii="Noto Serif SC" w:eastAsia="Noto Serif SC" w:hAnsi="Noto Serif SC" w:cs="Noto Serif"/>
-          <w:sz w:val="24"/>
-          <w:szCs w:val="24"/>
-          <w:lang w:val="en-GB"/>
-        </w:rPr>
-        <w:t xml:space="preserve"> I, II</w:t>
-      </w:r>
-    </w:p>
-    <w:p>
-      <w:pPr>
-        <w:rPr>
-          <w:rFonts w:ascii="Noto Serif SC" w:eastAsia="Noto Serif SC" w:hAnsi="Noto Serif SC" w:cs="Noto Serif"/>
-          <w:sz w:val="24"/>
-          <w:szCs w:val="24"/>
-          <w:lang w:val="en-GB"/>
-        </w:rPr>
-      </w:pPr>
-      <w:r>
-        <w:rPr>
-          <w:rFonts w:ascii="Noto Serif SC" w:eastAsia="Noto Serif SC" w:hAnsi="Noto Serif SC" w:cs="Noto Serif" w:hint="eastAsia"/>
-          <w:sz w:val="24"/>
-          <w:szCs w:val="24"/>
-          <w:lang w:val="en-GB"/>
-        </w:rPr>
-        <w:t>高音笙</w:t>
-      </w:r>
-      <w:r>
-        <w:rPr>
-          <w:rFonts w:ascii="Noto Serif SC" w:eastAsia="Noto Serif SC" w:hAnsi="Noto Serif SC" w:cs="Noto Serif"/>
-          <w:sz w:val="24"/>
-          <w:szCs w:val="24"/>
-          <w:lang w:val="en-GB"/>
+          <w:sz w:val="20"/>
+          <w:szCs w:val="20"/>
+        </w:rPr>
+        <w:t xml:space="preserve">, </w:t>
+      </w:r>
+      <w:r>
+        <w:rPr>
+          <w:rFonts w:ascii="Noto Serif SC" w:eastAsia="Noto Serif SC" w:hAnsi="Noto Serif SC" w:cs="Noto Serif" w:hint="eastAsia"/>
+          <w:sz w:val="20"/>
+          <w:szCs w:val="20"/>
+        </w:rPr>
+        <w:t>中国大钹</w:t>
+      </w:r>
+      <w:r>
+        <w:rPr>
+          <w:rFonts w:ascii="Noto Serif SC" w:eastAsia="Noto Serif SC" w:hAnsi="Noto Serif SC" w:cs="Noto Serif"/>
+          <w:sz w:val="20"/>
+          <w:szCs w:val="20"/>
         </w:rPr>
         <w:t xml:space="preserve"> </w:t>
       </w:r>
-      <w:r>
-        <w:rPr>
-          <w:rFonts w:ascii="Noto Serif SC" w:eastAsia="Noto Serif SC" w:hAnsi="Noto Serif SC" w:cs="Noto Serif"/>
-          <w:sz w:val="24"/>
-          <w:szCs w:val="24"/>
-          <w:lang w:val="en-GB"/>
-        </w:rPr>
-        <w:t xml:space="preserve">I, II </w:t>
-      </w:r>
-      <w:r>
-        <w:rPr>
-          <w:rFonts w:ascii="Noto Serif SC" w:eastAsia="Noto Serif SC" w:hAnsi="Noto Serif SC" w:cs="Noto Serif"/>
-          <w:sz w:val="24"/>
-          <w:szCs w:val="24"/>
-          <w:lang w:val="en-GB"/>
-        </w:rPr>
-        <w:t xml:space="preserve">Gaoyin </w:t>
-      </w:r>
-      <w:r>
-        <w:rPr>
-          <w:rFonts w:ascii="Noto Serif SC" w:eastAsia="Noto Serif SC" w:hAnsi="Noto Serif SC" w:cs="Noto Serif"/>
-          <w:sz w:val="24"/>
-          <w:szCs w:val="24"/>
-          <w:lang w:val="en-GB"/>
-        </w:rPr>
-        <w:t>Sheng</w:t>
-      </w:r>
-      <w:r>
-        <w:rPr>
-          <w:rFonts w:ascii="Noto Serif SC" w:eastAsia="Noto Serif SC" w:hAnsi="Noto Serif SC" w:cs="Noto Serif"/>
-          <w:sz w:val="24"/>
-          <w:szCs w:val="24"/>
-          <w:lang w:val="en-GB"/>
-        </w:rPr>
-        <w:t xml:space="preserve"> I, II</w:t>
-      </w:r>
-    </w:p>
-    <w:p>
-      <w:pPr>
-        <w:rPr>
-          <w:rFonts w:ascii="Noto Serif SC" w:eastAsia="Noto Serif SC" w:hAnsi="Noto Serif SC" w:cs="Noto Serif"/>
-          <w:sz w:val="24"/>
-          <w:szCs w:val="24"/>
-          <w:lang w:val="en-GB"/>
-        </w:rPr>
-      </w:pPr>
-      <w:r>
-        <w:rPr>
-          <w:rFonts w:ascii="Noto Serif SC" w:eastAsia="Noto Serif SC" w:hAnsi="Noto Serif SC" w:cs="Noto Serif" w:hint="eastAsia"/>
-          <w:sz w:val="24"/>
-          <w:szCs w:val="24"/>
-          <w:lang w:val="en-GB"/>
-        </w:rPr>
-        <w:t>中音笙</w:t>
-      </w:r>
-      <w:r>
-        <w:rPr>
-          <w:rFonts w:ascii="Noto Serif SC" w:eastAsia="Noto Serif SC" w:hAnsi="Noto Serif SC" w:cs="Noto Serif"/>
-          <w:sz w:val="24"/>
-          <w:szCs w:val="24"/>
-          <w:lang w:val="en-GB"/>
-        </w:rPr>
-        <w:t xml:space="preserve"> Zhongyin Sheng</w:t>
-      </w:r>
-    </w:p>
-    <w:p>
-      <w:pPr>
-        <w:spacing w:after="120"/>
-        <w:rPr>
-          <w:rFonts w:ascii="Noto Serif SC" w:eastAsia="Noto Serif SC" w:hAnsi="Noto Serif SC" w:cs="Noto Serif"/>
-          <w:sz w:val="24"/>
-          <w:szCs w:val="24"/>
-          <w:lang w:val="en-GB"/>
-        </w:rPr>
-      </w:pPr>
-      <w:r>
-        <w:rPr>
-          <w:rFonts w:ascii="Noto Serif SC" w:eastAsia="Noto Serif SC" w:hAnsi="Noto Serif SC" w:cs="Noto Serif" w:hint="eastAsia"/>
-          <w:sz w:val="24"/>
-          <w:szCs w:val="24"/>
-          <w:lang w:val="en-GB"/>
-        </w:rPr>
-        <w:t>低音笙</w:t>
-      </w:r>
-      <w:r>
-        <w:rPr>
-          <w:rFonts w:ascii="Noto Serif SC" w:eastAsia="Noto Serif SC" w:hAnsi="Noto Serif SC" w:cs="Noto Serif"/>
-          <w:sz w:val="24"/>
-          <w:szCs w:val="24"/>
-          <w:lang w:val="en-GB"/>
-        </w:rPr>
-        <w:t xml:space="preserve"> Diyin Sheng</w:t>
-      </w:r>
-    </w:p>
-    <w:p>
-      <w:pPr>
-        <w:rPr>
-          <w:rFonts w:ascii="Noto Serif SC" w:eastAsia="Noto Serif SC" w:hAnsi="Noto Serif SC" w:cs="Noto Serif"/>
-          <w:sz w:val="24"/>
-          <w:szCs w:val="24"/>
-          <w:lang w:val="en-GB"/>
-        </w:rPr>
-      </w:pPr>
-      <w:r>
-        <w:rPr>
-          <w:rFonts w:ascii="Noto Serif SC" w:eastAsia="Noto Serif SC" w:hAnsi="Noto Serif SC" w:cs="Noto Serif"/>
-          <w:sz w:val="24"/>
-          <w:szCs w:val="24"/>
-        </w:rPr>
-        <w:t>加键高音唢呐</w:t>
-      </w:r>
-      <w:r>
-        <w:rPr>
-          <w:rFonts w:ascii="Noto Serif SC" w:eastAsia="Noto Serif SC" w:hAnsi="Noto Serif SC" w:cs="Noto Serif"/>
-          <w:sz w:val="24"/>
-          <w:szCs w:val="24"/>
-          <w:lang w:val="en-GB"/>
-        </w:rPr>
-        <w:t xml:space="preserve">I, II </w:t>
-      </w:r>
-      <w:r>
-        <w:rPr>
-          <w:rFonts w:ascii="Noto Serif SC" w:eastAsia="Noto Serif SC" w:hAnsi="Noto Serif SC" w:cs="Noto Serif"/>
-          <w:sz w:val="24"/>
-          <w:szCs w:val="24"/>
-          <w:lang w:val="en-GB"/>
-        </w:rPr>
-        <w:t xml:space="preserve">Keyed </w:t>
-      </w:r>
-      <w:r>
-        <w:rPr>
-          <w:rFonts w:ascii="Noto Serif SC" w:eastAsia="Noto Serif SC" w:hAnsi="Noto Serif SC" w:cs="Noto Serif"/>
-          <w:sz w:val="24"/>
-          <w:szCs w:val="24"/>
-          <w:lang w:val="en-GB"/>
-        </w:rPr>
-        <w:t>Gaoyin Suona</w:t>
-      </w:r>
-      <w:r>
-        <w:rPr>
-          <w:rFonts w:ascii="Noto Serif SC" w:eastAsia="Noto Serif SC" w:hAnsi="Noto Serif SC" w:cs="Noto Serif"/>
-          <w:sz w:val="24"/>
-          <w:szCs w:val="24"/>
-          <w:lang w:val="en-GB"/>
+      <w:proofErr w:type="spellStart"/>
+      <w:r>
+        <w:rPr>
+          <w:rFonts w:ascii="Noto Serif SC" w:eastAsia="Noto Serif SC" w:hAnsi="Noto Serif SC" w:cs="Noto Serif"/>
+          <w:sz w:val="20"/>
+          <w:szCs w:val="20"/>
+        </w:rPr>
+        <w:t>Daluo</w:t>
+      </w:r>
+      <w:proofErr w:type="spellEnd"/>
+      <w:r>
+        <w:rPr>
+          <w:rFonts w:ascii="Noto Serif SC" w:eastAsia="Noto Serif SC" w:hAnsi="Noto Serif SC" w:cs="Noto Serif"/>
+          <w:sz w:val="20"/>
+          <w:szCs w:val="20"/>
+        </w:rPr>
+        <w:t xml:space="preserve">, </w:t>
+      </w:r>
+      <w:r>
+        <w:rPr>
+          <w:rFonts w:ascii="Noto Serif SC" w:eastAsia="Noto Serif SC" w:hAnsi="Noto Serif SC" w:cs="Noto Serif" w:hint="eastAsia"/>
+          <w:sz w:val="20"/>
+          <w:szCs w:val="20"/>
+        </w:rPr>
+        <w:t>西洋对镲</w:t>
+      </w:r>
+      <w:r>
+        <w:rPr>
+          <w:rFonts w:ascii="Noto Serif SC" w:eastAsia="Noto Serif SC" w:hAnsi="Noto Serif SC" w:cs="Noto Serif"/>
+          <w:sz w:val="20"/>
+          <w:szCs w:val="20"/>
+        </w:rPr>
+        <w:t xml:space="preserve"> Crash Cymbals</w:t>
+      </w:r>
+    </w:p>
+    <w:p>
+      <w:pPr>
+        <w:ind w:hanging="436"/>
+        <w:rPr>
+          <w:rFonts w:ascii="Noto Serif SC" w:eastAsia="Noto Serif SC" w:hAnsi="Noto Serif SC" w:cs="Noto Serif"/>
+          <w:sz w:val="24"/>
+          <w:szCs w:val="24"/>
+          <w:lang w:val="en-US"/>
+        </w:rPr>
+      </w:pPr>
+    </w:p>
+    <w:p>
+      <w:pPr>
+        <w:rPr>
+          <w:rFonts w:ascii="Noto Serif SC" w:eastAsia="Noto Serif SC" w:hAnsi="Noto Serif SC" w:cs="Noto Serif"/>
+          <w:sz w:val="24"/>
+          <w:szCs w:val="24"/>
+          <w:lang w:val="en-US"/>
+        </w:rPr>
+      </w:pPr>
+      <w:r>
+        <w:rPr>
+          <w:rFonts w:ascii="Noto Serif SC" w:eastAsia="Noto Serif SC" w:hAnsi="Noto Serif SC" w:cs="Noto Serif" w:hint="eastAsia"/>
+          <w:sz w:val="24"/>
+          <w:szCs w:val="24"/>
+          <w:lang w:val="en-US"/>
+        </w:rPr>
+        <w:t>高胡</w:t>
+      </w:r>
+      <w:r>
+        <w:rPr>
+          <w:rFonts w:ascii="Noto Serif SC" w:eastAsia="Noto Serif SC" w:hAnsi="Noto Serif SC" w:cs="Noto Serif"/>
+          <w:sz w:val="24"/>
+          <w:szCs w:val="24"/>
+          <w:lang w:val="en-US"/>
+        </w:rPr>
+        <w:t xml:space="preserve"> Gaohu</w:t>
+      </w:r>
+    </w:p>
+    <w:p>
+      <w:pPr>
+        <w:rPr>
+          <w:rFonts w:ascii="Noto Serif SC" w:eastAsia="Noto Serif SC" w:hAnsi="Noto Serif SC" w:cs="Noto Serif"/>
+          <w:sz w:val="24"/>
+          <w:szCs w:val="24"/>
+          <w:lang w:val="en-US"/>
+        </w:rPr>
+      </w:pPr>
+      <w:r>
+        <w:rPr>
+          <w:rFonts w:ascii="Noto Serif SC" w:eastAsia="Noto Serif SC" w:hAnsi="Noto Serif SC" w:cs="Noto Serif" w:hint="eastAsia"/>
+          <w:sz w:val="24"/>
+          <w:szCs w:val="24"/>
+          <w:lang w:val="en-US"/>
+        </w:rPr>
+        <w:t>二胡</w:t>
+      </w:r>
+      <w:r>
+        <w:rPr>
+          <w:rFonts w:ascii="Noto Serif SC" w:eastAsia="Noto Serif SC" w:hAnsi="Noto Serif SC" w:cs="Noto Serif"/>
+          <w:sz w:val="24"/>
+          <w:szCs w:val="24"/>
+          <w:lang w:val="en-US"/>
+        </w:rPr>
+        <w:t xml:space="preserve"> Erhu</w:t>
+      </w:r>
+      <w:r>
+        <w:rPr>
+          <w:rFonts w:ascii="Noto Serif SC" w:eastAsia="Noto Serif SC" w:hAnsi="Noto Serif SC" w:cs="Noto Serif"/>
+          <w:sz w:val="24"/>
+          <w:szCs w:val="24"/>
+          <w:lang w:val="en-US"/>
+        </w:rPr>
+        <w:t xml:space="preserve"> I</w:t>
+      </w:r>
+    </w:p>
+    <w:p>
+      <w:pPr>
+        <w:rPr>
+          <w:rFonts w:ascii="Noto Serif SC" w:eastAsia="Noto Serif SC" w:hAnsi="Noto Serif SC" w:cs="Noto Serif"/>
+          <w:sz w:val="24"/>
+          <w:szCs w:val="24"/>
+          <w:lang w:val="en-US"/>
+        </w:rPr>
+      </w:pPr>
+      <w:r>
+        <w:rPr>
+          <w:rFonts w:ascii="Noto Serif SC" w:eastAsia="Noto Serif SC" w:hAnsi="Noto Serif SC" w:cs="Noto Serif" w:hint="eastAsia"/>
+          <w:sz w:val="24"/>
+          <w:szCs w:val="24"/>
+          <w:lang w:val="en-US"/>
+        </w:rPr>
+        <w:t>二胡</w:t>
+      </w:r>
+      <w:r>
+        <w:rPr>
+          <w:rFonts w:ascii="Noto Serif SC" w:eastAsia="Noto Serif SC" w:hAnsi="Noto Serif SC" w:cs="Noto Serif"/>
+          <w:sz w:val="24"/>
+          <w:szCs w:val="24"/>
+          <w:lang w:val="en-US"/>
+        </w:rPr>
+        <w:t xml:space="preserve"> Erhu</w:t>
+      </w:r>
+      <w:r>
+        <w:rPr>
+          <w:rFonts w:ascii="Noto Serif SC" w:eastAsia="Noto Serif SC" w:hAnsi="Noto Serif SC" w:cs="Noto Serif"/>
+          <w:sz w:val="24"/>
+          <w:szCs w:val="24"/>
+          <w:lang w:val="en-US"/>
+        </w:rPr>
+        <w:t xml:space="preserve"> II</w:t>
+      </w:r>
+      <w:r>
+        <w:rPr>
+          <w:rFonts w:ascii="Noto Serif SC" w:eastAsia="Noto Serif SC" w:hAnsi="Noto Serif SC" w:cs="Noto Serif"/>
+          <w:sz w:val="24"/>
+          <w:szCs w:val="24"/>
+          <w:lang w:val="en-US"/>
         </w:rPr>
         <w:t xml:space="preserve"> </w:t>
-      </w:r>
-      <w:r>
-        <w:rPr>
-          <w:rFonts w:ascii="Noto Serif SC" w:eastAsia="Noto Serif SC" w:hAnsi="Noto Serif SC" w:cs="Noto Serif"/>
-          <w:sz w:val="24"/>
-          <w:szCs w:val="24"/>
-          <w:lang w:val="en-GB"/>
-        </w:rPr>
-        <w:t>I, II</w:t>
-      </w:r>
-    </w:p>
-    <w:p>
-      <w:pPr>
-        <w:rPr>
-          <w:rFonts w:ascii="Noto Serif SC" w:eastAsia="Noto Serif SC" w:hAnsi="Noto Serif SC" w:cs="Noto Serif"/>
-          <w:sz w:val="24"/>
-          <w:szCs w:val="24"/>
-          <w:lang w:val="en-US"/>
-        </w:rPr>
-      </w:pPr>
-      <w:r>
-        <w:rPr>
-          <w:rFonts w:ascii="Noto Serif SC" w:eastAsia="Noto Serif SC" w:hAnsi="Noto Serif SC" w:cs="Noto Serif" w:hint="eastAsia"/>
-          <w:sz w:val="24"/>
-          <w:szCs w:val="24"/>
-          <w:lang w:val="en-US"/>
-        </w:rPr>
-        <w:t>中音唢吶</w:t>
-      </w:r>
-      <w:r>
-        <w:rPr>
-          <w:rFonts w:ascii="Noto Serif SC" w:eastAsia="Noto Serif SC" w:hAnsi="Noto Serif SC" w:cs="Noto Serif"/>
-          <w:sz w:val="24"/>
-          <w:szCs w:val="24"/>
-          <w:lang w:val="en-US"/>
-        </w:rPr>
-        <w:t xml:space="preserve"> Zhongyin Suona</w:t>
-      </w:r>
-    </w:p>
-    <w:p>
-      <w:pPr>
-        <w:rPr>
-          <w:rFonts w:ascii="Noto Serif SC" w:eastAsia="Noto Serif SC" w:hAnsi="Noto Serif SC" w:cs="Noto Serif"/>
-          <w:sz w:val="24"/>
-          <w:szCs w:val="24"/>
-          <w:lang w:val="en-US"/>
-        </w:rPr>
-      </w:pPr>
-      <w:r>
-        <w:rPr>
-          <w:rFonts w:ascii="Noto Serif SC" w:eastAsia="Noto Serif SC" w:hAnsi="Noto Serif SC" w:cs="Noto Serif" w:hint="eastAsia"/>
-          <w:sz w:val="24"/>
-          <w:szCs w:val="24"/>
-          <w:lang w:val="en-US"/>
-        </w:rPr>
-        <w:t>次中</w:t>
-      </w:r>
-      <w:r>
-        <w:rPr>
-          <w:rFonts w:ascii="Noto Serif SC" w:eastAsia="Noto Serif SC" w:hAnsi="Noto Serif SC" w:cs="Noto Serif" w:hint="eastAsia"/>
-          <w:sz w:val="24"/>
-          <w:szCs w:val="24"/>
-          <w:lang w:val="en-GB"/>
-        </w:rPr>
-        <w:t>音</w:t>
-      </w:r>
-      <w:r>
-        <w:rPr>
-          <w:rFonts w:ascii="Noto Serif SC" w:eastAsia="Noto Serif SC" w:hAnsi="Noto Serif SC" w:cs="Noto Serif" w:hint="eastAsia"/>
-          <w:sz w:val="24"/>
-          <w:szCs w:val="24"/>
-          <w:lang w:val="en-US"/>
-        </w:rPr>
-        <w:t>唢吶</w:t>
-      </w:r>
-      <w:r>
-        <w:rPr>
-          <w:rFonts w:ascii="Noto Serif SC" w:eastAsia="Noto Serif SC" w:hAnsi="Noto Serif SC" w:cs="Noto Serif"/>
-          <w:sz w:val="24"/>
-          <w:szCs w:val="24"/>
-          <w:lang w:val="en-US"/>
-        </w:rPr>
-        <w:t xml:space="preserve"> </w:t>
-      </w:r>
-      <w:proofErr w:type="spellStart"/>
-      <w:r>
-        <w:rPr>
-          <w:rFonts w:ascii="Noto Serif SC" w:eastAsia="Noto Serif SC" w:hAnsi="Noto Serif SC" w:cs="Noto Serif"/>
-          <w:sz w:val="24"/>
-          <w:szCs w:val="24"/>
-        </w:rPr>
-        <w:t>Cizhongyin</w:t>
-      </w:r>
-      <w:proofErr w:type="spellEnd"/>
-      <w:r>
-        <w:rPr>
-          <w:rFonts w:ascii="Noto Serif SC" w:eastAsia="Noto Serif SC" w:hAnsi="Noto Serif SC" w:cs="Noto Serif"/>
-          <w:sz w:val="24"/>
-          <w:szCs w:val="24"/>
-        </w:rPr>
-        <w:t xml:space="preserve"> </w:t>
-      </w:r>
-      <w:r>
-        <w:rPr>
-          <w:rFonts w:ascii="Noto Serif SC" w:eastAsia="Noto Serif SC" w:hAnsi="Noto Serif SC" w:cs="Noto Serif"/>
-          <w:sz w:val="24"/>
-          <w:szCs w:val="24"/>
-          <w:lang w:val="en-US"/>
-        </w:rPr>
-        <w:t>Suona</w:t>
-      </w:r>
-    </w:p>
-    <w:p>
-      <w:pPr>
-        <w:rPr>
-          <w:rFonts w:ascii="Noto Serif SC" w:eastAsia="Noto Serif SC" w:hAnsi="Noto Serif SC" w:cs="Noto Serif"/>
-          <w:sz w:val="24"/>
-          <w:szCs w:val="24"/>
-          <w:lang w:val="en-US"/>
-        </w:rPr>
-      </w:pPr>
-      <w:r>
-        <w:rPr>
-          <w:rFonts w:ascii="Noto Serif SC" w:eastAsia="Noto Serif SC" w:hAnsi="Noto Serif SC" w:cs="Noto Serif" w:hint="eastAsia"/>
-          <w:sz w:val="24"/>
-          <w:szCs w:val="24"/>
-        </w:rPr>
-        <w:t>低音唢吶</w:t>
-      </w:r>
-      <w:r>
-        <w:rPr>
-          <w:rFonts w:ascii="Noto Serif SC" w:eastAsia="Noto Serif SC" w:hAnsi="Noto Serif SC" w:cs="Noto Serif"/>
-          <w:sz w:val="24"/>
-          <w:szCs w:val="24"/>
-        </w:rPr>
-        <w:t xml:space="preserve"> Diyin Suona</w:t>
-      </w:r>
-    </w:p>
-    <w:p>
-      <w:pPr>
-        <w:rPr>
-          <w:rFonts w:ascii="Noto Serif SC" w:eastAsia="Noto Serif SC" w:hAnsi="Noto Serif SC" w:cs="Noto Serif"/>
-          <w:sz w:val="24"/>
-          <w:szCs w:val="24"/>
-          <w:lang w:val="en-US"/>
-        </w:rPr>
-      </w:pPr>
-    </w:p>
-    <w:p>
-      <w:pPr>
-        <w:rPr>
-          <w:rFonts w:ascii="Noto Serif SC" w:eastAsia="Noto Serif SC" w:hAnsi="Noto Serif SC" w:cs="Noto Serif"/>
-          <w:sz w:val="24"/>
-          <w:szCs w:val="24"/>
-          <w:lang w:val="en-US"/>
-        </w:rPr>
-      </w:pPr>
-      <w:r>
-        <w:rPr>
-          <w:rFonts w:ascii="Noto Serif SC" w:eastAsia="Noto Serif SC" w:hAnsi="Noto Serif SC" w:cs="Noto Serif" w:hint="eastAsia"/>
-          <w:sz w:val="24"/>
-          <w:szCs w:val="24"/>
-          <w:lang w:val="en-US"/>
-        </w:rPr>
-        <w:t>扬琴</w:t>
-      </w:r>
-      <w:r>
-        <w:rPr>
-          <w:rFonts w:ascii="Noto Serif SC" w:eastAsia="Noto Serif SC" w:hAnsi="Noto Serif SC" w:cs="Noto Serif"/>
-          <w:sz w:val="24"/>
-          <w:szCs w:val="24"/>
-          <w:lang w:val="en-US"/>
-        </w:rPr>
-        <w:t xml:space="preserve"> Yangqin</w:t>
-      </w:r>
-      <w:r>
-        <w:rPr>
-          <w:rFonts w:ascii="Noto Serif SC" w:eastAsia="Noto Serif SC" w:hAnsi="Noto Serif SC" w:cs="Noto Serif"/>
-          <w:sz w:val="24"/>
-          <w:szCs w:val="24"/>
-          <w:lang w:val="en-US"/>
-        </w:rPr>
-        <w:t xml:space="preserve"> </w:t>
-      </w:r>
-      <w:r>
-        <w:rPr>
-          <w:rFonts w:ascii="Noto Serif SC" w:eastAsia="Noto Serif SC" w:hAnsi="Noto Serif SC" w:cs="Noto Serif"/>
-          <w:sz w:val="24"/>
-          <w:szCs w:val="24"/>
-          <w:lang w:val="en-US"/>
-        </w:rPr>
-        <w:t>(2)</w:t>
-      </w:r>
-      <w:r>
-        <w:rPr>
-          <w:rFonts w:ascii="Noto Serif SC" w:eastAsia="Noto Serif SC" w:hAnsi="Noto Serif SC" w:cs="Noto Serif"/>
-          <w:sz w:val="24"/>
-          <w:szCs w:val="24"/>
-          <w:lang w:val="en-US"/>
-        </w:rPr>
-        <w:t>*</w:t>
-      </w:r>
-    </w:p>
-    <w:p>
-      <w:pPr>
-        <w:rPr>
-          <w:rFonts w:ascii="Noto Serif SC" w:eastAsia="Noto Serif SC" w:hAnsi="Noto Serif SC" w:cs="Noto Serif"/>
-          <w:sz w:val="24"/>
-          <w:szCs w:val="24"/>
-          <w:lang w:val="en-US"/>
-        </w:rPr>
-      </w:pPr>
-      <w:r>
-        <w:rPr>
-          <w:rFonts w:ascii="Noto Serif SC" w:eastAsia="Noto Serif SC" w:hAnsi="Noto Serif SC" w:cs="Noto Serif" w:hint="eastAsia"/>
-          <w:sz w:val="24"/>
-          <w:szCs w:val="24"/>
-          <w:lang w:val="en-US"/>
-        </w:rPr>
-        <w:t>柳琴</w:t>
-      </w:r>
-      <w:r>
-        <w:rPr>
-          <w:rFonts w:ascii="Noto Serif SC" w:eastAsia="Noto Serif SC" w:hAnsi="Noto Serif SC" w:cs="Noto Serif"/>
-          <w:sz w:val="24"/>
-          <w:szCs w:val="24"/>
-          <w:lang w:val="en-US"/>
-        </w:rPr>
-        <w:t>Liuqin</w:t>
-      </w:r>
-      <w:r>
-        <w:rPr>
-          <w:rFonts w:ascii="Noto Serif SC" w:eastAsia="Noto Serif SC" w:hAnsi="Noto Serif SC" w:cs="Noto Serif"/>
-          <w:sz w:val="24"/>
-          <w:szCs w:val="24"/>
-          <w:lang w:val="en-US"/>
-        </w:rPr>
-        <w:t xml:space="preserve"> </w:t>
-      </w:r>
-      <w:r>
-        <w:rPr>
-          <w:rFonts w:ascii="Noto Serif SC" w:eastAsia="Noto Serif SC" w:hAnsi="Noto Serif SC" w:cs="Noto Serif"/>
-          <w:sz w:val="24"/>
-          <w:szCs w:val="24"/>
-          <w:lang w:val="en-US"/>
-        </w:rPr>
-        <w:t>(2)</w:t>
-      </w:r>
-    </w:p>
-    <w:p>
-      <w:pPr>
-        <w:rPr>
-          <w:rFonts w:ascii="Noto Serif SC" w:eastAsia="Noto Serif SC" w:hAnsi="Noto Serif SC" w:cs="Noto Serif"/>
-          <w:sz w:val="24"/>
-          <w:szCs w:val="24"/>
-          <w:lang w:val="en-US"/>
-        </w:rPr>
-      </w:pPr>
-      <w:r>
-        <w:rPr>
-          <w:rFonts w:ascii="Noto Serif SC" w:eastAsia="Noto Serif SC" w:hAnsi="Noto Serif SC" w:cs="Noto Serif" w:hint="eastAsia"/>
-          <w:sz w:val="24"/>
-          <w:szCs w:val="24"/>
-          <w:lang w:val="en-US"/>
-        </w:rPr>
-        <w:t>琵琶</w:t>
-      </w:r>
-      <w:r>
-        <w:rPr>
-          <w:rFonts w:ascii="Noto Serif SC" w:eastAsia="Noto Serif SC" w:hAnsi="Noto Serif SC" w:cs="Noto Serif"/>
-          <w:sz w:val="24"/>
-          <w:szCs w:val="24"/>
-          <w:lang w:val="en-US"/>
-        </w:rPr>
-        <w:t>Pipa</w:t>
-      </w:r>
-      <w:r>
-        <w:rPr>
-          <w:rFonts w:ascii="Noto Serif SC" w:eastAsia="Noto Serif SC" w:hAnsi="Noto Serif SC" w:cs="Noto Serif"/>
-          <w:sz w:val="24"/>
-          <w:szCs w:val="24"/>
-          <w:lang w:val="en-US"/>
-        </w:rPr>
-        <w:t xml:space="preserve"> </w:t>
-      </w:r>
-      <w:r>
-        <w:rPr>
-          <w:rFonts w:ascii="Noto Serif SC" w:eastAsia="Noto Serif SC" w:hAnsi="Noto Serif SC" w:cs="Noto Serif"/>
-          <w:sz w:val="24"/>
-          <w:szCs w:val="24"/>
-          <w:lang w:val="en-US"/>
-        </w:rPr>
-        <w:t>(4)</w:t>
-      </w:r>
-    </w:p>
-    <w:p>
-      <w:pPr>
-        <w:rPr>
-          <w:rFonts w:ascii="Noto Serif SC" w:eastAsia="Noto Serif SC" w:hAnsi="Noto Serif SC" w:cs="Noto Serif"/>
-          <w:sz w:val="24"/>
-          <w:szCs w:val="24"/>
-          <w:lang w:val="en-US"/>
-        </w:rPr>
-      </w:pPr>
-      <w:r>
-        <w:rPr>
-          <w:rFonts w:ascii="Noto Serif SC" w:eastAsia="Noto Serif SC" w:hAnsi="Noto Serif SC" w:cs="Noto Serif" w:hint="eastAsia"/>
-          <w:sz w:val="24"/>
-          <w:szCs w:val="24"/>
-          <w:lang w:val="en-US"/>
-        </w:rPr>
-        <w:t>中阮</w:t>
-      </w:r>
-      <w:r>
-        <w:rPr>
-          <w:rFonts w:ascii="Noto Serif SC" w:eastAsia="Noto Serif SC" w:hAnsi="Noto Serif SC" w:cs="Noto Serif"/>
-          <w:sz w:val="24"/>
-          <w:szCs w:val="24"/>
-          <w:lang w:val="en-US"/>
-        </w:rPr>
-        <w:t>Zhongruan</w:t>
-      </w:r>
-      <w:r>
-        <w:rPr>
-          <w:rFonts w:ascii="Noto Serif SC" w:eastAsia="Noto Serif SC" w:hAnsi="Noto Serif SC" w:cs="Noto Serif"/>
-          <w:sz w:val="24"/>
-          <w:szCs w:val="24"/>
-          <w:lang w:val="en-US"/>
-        </w:rPr>
-        <w:t xml:space="preserve"> </w:t>
-      </w:r>
-      <w:r>
-        <w:rPr>
-          <w:rFonts w:ascii="Noto Serif SC" w:eastAsia="Noto Serif SC" w:hAnsi="Noto Serif SC" w:cs="Noto Serif"/>
-          <w:sz w:val="24"/>
-          <w:szCs w:val="24"/>
-          <w:lang w:val="en-US"/>
-        </w:rPr>
-        <w:t>(4)</w:t>
-      </w:r>
-    </w:p>
-    <w:p>
-      <w:pPr>
-        <w:rPr>
-          <w:rFonts w:ascii="Noto Serif SC" w:eastAsia="Noto Serif SC" w:hAnsi="Noto Serif SC" w:cs="Noto Serif"/>
-          <w:sz w:val="24"/>
-          <w:szCs w:val="24"/>
-          <w:lang w:val="en-US"/>
-        </w:rPr>
-      </w:pPr>
-      <w:r>
-        <w:rPr>
-          <w:rFonts w:ascii="Noto Serif SC" w:eastAsia="Noto Serif SC" w:hAnsi="Noto Serif SC" w:cs="Noto Serif" w:hint="eastAsia"/>
-          <w:sz w:val="24"/>
-          <w:szCs w:val="24"/>
-          <w:lang w:val="en-US"/>
-        </w:rPr>
-        <w:t>大阮</w:t>
-      </w:r>
-      <w:r>
-        <w:rPr>
-          <w:rFonts w:ascii="Noto Serif SC" w:eastAsia="Noto Serif SC" w:hAnsi="Noto Serif SC" w:cs="Noto Serif"/>
-          <w:sz w:val="24"/>
-          <w:szCs w:val="24"/>
-          <w:lang w:val="en-US"/>
-        </w:rPr>
-        <w:t>Daruan</w:t>
-      </w:r>
-      <w:r>
-        <w:rPr>
-          <w:rFonts w:ascii="Noto Serif SC" w:eastAsia="Noto Serif SC" w:hAnsi="Noto Serif SC" w:cs="Noto Serif"/>
-          <w:sz w:val="24"/>
-          <w:szCs w:val="24"/>
-          <w:lang w:val="en-US"/>
-        </w:rPr>
-        <w:t xml:space="preserve"> </w:t>
-      </w:r>
-      <w:r>
-        <w:rPr>
-          <w:rFonts w:ascii="Noto Serif SC" w:eastAsia="Noto Serif SC" w:hAnsi="Noto Serif SC" w:cs="Noto Serif"/>
-          <w:sz w:val="24"/>
-          <w:szCs w:val="24"/>
-          <w:lang w:val="en-US"/>
-        </w:rPr>
-        <w:t>(2)</w:t>
-      </w:r>
-    </w:p>
-    <w:p>
-      <w:pPr>
-        <w:rPr>
-          <w:rFonts w:ascii="Noto Serif SC" w:eastAsia="Noto Serif SC" w:hAnsi="Noto Serif SC" w:cs="Noto Serif"/>
-          <w:sz w:val="24"/>
-          <w:szCs w:val="24"/>
-          <w:lang w:val="en-US"/>
-        </w:rPr>
-      </w:pPr>
-      <w:r>
-        <w:rPr>
-          <w:rFonts w:ascii="Noto Serif SC" w:eastAsia="Noto Serif SC" w:hAnsi="Noto Serif SC" w:cs="Noto Serif" w:hint="eastAsia"/>
-          <w:sz w:val="24"/>
-          <w:szCs w:val="24"/>
-        </w:rPr>
-        <w:t>古筝</w:t>
-      </w:r>
-      <w:r>
-        <w:rPr>
-          <w:rFonts w:ascii="Noto Serif SC" w:eastAsia="Noto Serif SC" w:hAnsi="Noto Serif SC" w:cs="Noto Serif"/>
-          <w:sz w:val="24"/>
-          <w:szCs w:val="24"/>
-          <w:lang w:val="en-US"/>
-        </w:rPr>
-        <w:t>Guzheng</w:t>
-      </w:r>
-      <w:r>
-        <w:rPr>
-          <w:rFonts w:ascii="Noto Serif SC" w:eastAsia="Noto Serif SC" w:hAnsi="Noto Serif SC" w:cs="Noto Serif"/>
-          <w:sz w:val="24"/>
-          <w:szCs w:val="24"/>
-          <w:lang w:val="en-US"/>
-        </w:rPr>
-        <w:t xml:space="preserve"> </w:t>
-      </w:r>
-      <w:r>
-        <w:rPr>
-          <w:rFonts w:ascii="Noto Serif SC" w:eastAsia="Noto Serif SC" w:hAnsi="Noto Serif SC" w:cs="Noto Serif"/>
-          <w:sz w:val="24"/>
-          <w:szCs w:val="24"/>
-          <w:lang w:val="en-US"/>
-        </w:rPr>
-        <w:t>(2)</w:t>
-      </w:r>
-    </w:p>
-    <w:p>
-      <w:pPr>
-        <w:rPr>
-          <w:rFonts w:ascii="Noto Serif SC" w:eastAsia="Noto Serif SC" w:hAnsi="Noto Serif SC" w:cs="Noto Serif"/>
-          <w:sz w:val="24"/>
-          <w:szCs w:val="24"/>
-          <w:lang w:val="en-US"/>
-        </w:rPr>
-      </w:pPr>
-    </w:p>
-    <w:p>
-      <w:pPr>
-        <w:rPr>
-          <w:rFonts w:ascii="Noto Serif SC" w:eastAsia="Noto Serif SC" w:hAnsi="Noto Serif SC" w:cs="Noto Serif"/>
-          <w:sz w:val="24"/>
-          <w:szCs w:val="24"/>
-          <w:lang w:val="en-US"/>
-        </w:rPr>
-      </w:pPr>
-      <w:r>
-        <w:rPr>
-          <w:rFonts w:ascii="Noto Serif SC" w:eastAsia="Noto Serif SC" w:hAnsi="Noto Serif SC" w:cs="Noto Serif" w:hint="eastAsia"/>
-          <w:sz w:val="24"/>
-          <w:szCs w:val="24"/>
-        </w:rPr>
-        <w:t>定音鼓</w:t>
-      </w:r>
-      <w:r>
-        <w:rPr>
-          <w:rFonts w:ascii="Noto Serif SC" w:eastAsia="Noto Serif SC" w:hAnsi="Noto Serif SC" w:cs="Noto Serif"/>
-          <w:sz w:val="24"/>
-          <w:szCs w:val="24"/>
-          <w:lang w:val="en-US"/>
-        </w:rPr>
-        <w:t xml:space="preserve"> Timpani</w:t>
-      </w:r>
-    </w:p>
-    <w:p>
-      <w:pPr>
-        <w:rPr>
-          <w:rFonts w:ascii="Noto Serif SC" w:eastAsia="Noto Serif SC" w:hAnsi="Noto Serif SC" w:cs="Noto Serif"/>
-          <w:sz w:val="24"/>
-          <w:szCs w:val="24"/>
-          <w:lang w:val="en-US"/>
-        </w:rPr>
-      </w:pPr>
-      <w:r>
-        <w:rPr>
-          <w:rFonts w:ascii="Noto Serif SC" w:eastAsia="Noto Serif SC" w:hAnsi="Noto Serif SC" w:cs="Noto Serif"/>
-          <w:sz w:val="24"/>
-          <w:szCs w:val="24"/>
-        </w:rPr>
-        <w:t>4</w:t>
-      </w:r>
-      <w:r>
-        <w:rPr>
-          <w:rFonts w:ascii="Noto Serif SC" w:eastAsia="Noto Serif SC" w:hAnsi="Noto Serif SC" w:cs="Noto Serif" w:hint="eastAsia"/>
-          <w:sz w:val="24"/>
-          <w:szCs w:val="24"/>
-        </w:rPr>
-        <w:t xml:space="preserve"> 打击乐 </w:t>
-      </w:r>
-      <w:r>
-        <w:rPr>
-          <w:rFonts w:ascii="Noto Serif SC" w:eastAsia="Noto Serif SC" w:hAnsi="Noto Serif SC" w:cs="Noto Serif"/>
-          <w:sz w:val="24"/>
-          <w:szCs w:val="24"/>
-        </w:rPr>
-        <w:t>Percussion</w:t>
-      </w:r>
-    </w:p>
-    <w:p>
-      <w:pPr>
-        <w:ind w:left="720" w:hanging="436"/>
-        <w:rPr>
-          <w:rFonts w:ascii="Noto Serif SC" w:eastAsia="Noto Serif SC" w:hAnsi="Noto Serif SC" w:cs="Noto Serif"/>
-          <w:sz w:val="20"/>
-          <w:szCs w:val="20"/>
-          <w:lang w:val="en-US"/>
-        </w:rPr>
-      </w:pPr>
-      <w:r>
-        <w:rPr>
-          <w:rFonts w:ascii="Noto Serif SC" w:eastAsia="Noto Serif SC" w:hAnsi="Noto Serif SC" w:cs="Noto Serif"/>
-          <w:sz w:val="20"/>
-          <w:szCs w:val="20"/>
-          <w:lang w:val="en-US"/>
-        </w:rPr>
-        <w:t xml:space="preserve">I: </w:t>
-      </w:r>
-      <w:r>
-        <w:rPr>
-          <w:rFonts w:ascii="Noto Serif SC" w:eastAsia="Noto Serif SC" w:hAnsi="Noto Serif SC" w:cs="Noto Serif" w:hint="eastAsia"/>
-          <w:sz w:val="20"/>
-          <w:szCs w:val="20"/>
-        </w:rPr>
-        <w:t>大军鼓</w:t>
-      </w:r>
-      <w:r>
-        <w:rPr>
-          <w:rFonts w:ascii="Noto Serif SC" w:eastAsia="Noto Serif SC" w:hAnsi="Noto Serif SC" w:cs="Noto Serif"/>
-          <w:sz w:val="20"/>
-          <w:szCs w:val="20"/>
-        </w:rPr>
-        <w:t xml:space="preserve"> Bass Drum, </w:t>
-      </w:r>
-      <w:r>
-        <w:rPr>
-          <w:rFonts w:ascii="Noto Serif SC" w:eastAsia="Noto Serif SC" w:hAnsi="Noto Serif SC" w:cs="Noto Serif" w:hint="eastAsia"/>
-          <w:sz w:val="20"/>
-          <w:szCs w:val="20"/>
-        </w:rPr>
-        <w:t>板鼓</w:t>
-      </w:r>
-      <w:r>
-        <w:rPr>
-          <w:rFonts w:ascii="Noto Serif SC" w:eastAsia="Noto Serif SC" w:hAnsi="Noto Serif SC" w:cs="Noto Serif"/>
-          <w:sz w:val="20"/>
-          <w:szCs w:val="20"/>
-        </w:rPr>
-        <w:t xml:space="preserve"> Bangu</w:t>
-      </w:r>
-    </w:p>
-    <w:p>
-      <w:pPr>
-        <w:ind w:left="720" w:hanging="436"/>
-        <w:rPr>
-          <w:rFonts w:ascii="Noto Serif SC" w:eastAsia="Noto Serif SC" w:hAnsi="Noto Serif SC" w:cs="Noto Serif"/>
-          <w:sz w:val="20"/>
-          <w:szCs w:val="20"/>
-        </w:rPr>
-      </w:pPr>
-      <w:r>
-        <w:rPr>
-          <w:rFonts w:ascii="Noto Serif SC" w:eastAsia="Noto Serif SC" w:hAnsi="Noto Serif SC" w:cs="Noto Serif"/>
-          <w:sz w:val="20"/>
-          <w:szCs w:val="20"/>
-          <w:lang w:val="en-US"/>
-        </w:rPr>
-        <w:t xml:space="preserve">II: </w:t>
-      </w:r>
-      <w:r>
-        <w:rPr>
-          <w:rFonts w:ascii="Noto Serif SC" w:eastAsia="Noto Serif SC" w:hAnsi="Noto Serif SC" w:cs="Noto Serif" w:hint="eastAsia"/>
-          <w:sz w:val="20"/>
-          <w:szCs w:val="20"/>
-        </w:rPr>
-        <w:t>吊镲</w:t>
-      </w:r>
-      <w:r>
-        <w:rPr>
-          <w:rFonts w:ascii="Noto Serif SC" w:eastAsia="Noto Serif SC" w:hAnsi="Noto Serif SC" w:cs="Noto Serif"/>
-          <w:sz w:val="20"/>
-          <w:szCs w:val="20"/>
-        </w:rPr>
-        <w:t xml:space="preserve"> Suspended Cymbal, </w:t>
-      </w:r>
-      <w:r>
-        <w:rPr>
-          <w:rFonts w:ascii="Noto Serif SC" w:eastAsia="Noto Serif SC" w:hAnsi="Noto Serif SC" w:cs="Noto Serif" w:hint="eastAsia"/>
-          <w:sz w:val="20"/>
-          <w:szCs w:val="20"/>
-        </w:rPr>
-        <w:t>碰铃</w:t>
-      </w:r>
-      <w:r>
-        <w:rPr>
-          <w:rFonts w:ascii="Noto Serif SC" w:eastAsia="Noto Serif SC" w:hAnsi="Noto Serif SC" w:cs="Noto Serif"/>
-          <w:sz w:val="20"/>
-          <w:szCs w:val="20"/>
-        </w:rPr>
-        <w:t xml:space="preserve"> </w:t>
-      </w:r>
-      <w:proofErr w:type="spellStart"/>
-      <w:r>
-        <w:rPr>
-          <w:rFonts w:ascii="Noto Serif SC" w:eastAsia="Noto Serif SC" w:hAnsi="Noto Serif SC" w:cs="Noto Serif"/>
-          <w:sz w:val="20"/>
-          <w:szCs w:val="20"/>
-        </w:rPr>
-        <w:t>Pengling</w:t>
-      </w:r>
-      <w:proofErr w:type="spellEnd"/>
-      <w:r>
-        <w:rPr>
-          <w:rFonts w:ascii="Noto Serif SC" w:eastAsia="Noto Serif SC" w:hAnsi="Noto Serif SC" w:cs="Noto Serif"/>
-          <w:sz w:val="20"/>
-          <w:szCs w:val="20"/>
-        </w:rPr>
-        <w:t xml:space="preserve">, </w:t>
-      </w:r>
-      <w:r>
-        <w:rPr>
-          <w:rFonts w:ascii="Noto Serif SC" w:eastAsia="Noto Serif SC" w:hAnsi="Noto Serif SC" w:cs="Noto Serif" w:hint="eastAsia"/>
-          <w:sz w:val="20"/>
-          <w:szCs w:val="20"/>
-        </w:rPr>
-        <w:t>低音木鱼</w:t>
-      </w:r>
-      <w:r>
-        <w:rPr>
-          <w:rFonts w:ascii="Noto Serif SC" w:eastAsia="Noto Serif SC" w:hAnsi="Noto Serif SC" w:cs="Noto Serif"/>
-          <w:sz w:val="20"/>
-          <w:szCs w:val="20"/>
-        </w:rPr>
-        <w:t xml:space="preserve"> Low Woodblock</w:t>
-      </w:r>
-    </w:p>
-    <w:p>
-      <w:pPr>
-        <w:ind w:left="720" w:hanging="436"/>
-        <w:rPr>
-          <w:rFonts w:ascii="Noto Serif SC" w:eastAsia="Noto Serif SC" w:hAnsi="Noto Serif SC" w:cs="Noto Serif"/>
-          <w:sz w:val="20"/>
-          <w:szCs w:val="20"/>
-        </w:rPr>
-      </w:pPr>
-      <w:r>
-        <w:rPr>
-          <w:rFonts w:ascii="Noto Serif SC" w:eastAsia="Noto Serif SC" w:hAnsi="Noto Serif SC" w:cs="Noto Serif"/>
-          <w:sz w:val="20"/>
-          <w:szCs w:val="20"/>
-          <w:lang w:val="en-US"/>
-        </w:rPr>
-        <w:t xml:space="preserve">III: </w:t>
-      </w:r>
-      <w:r>
-        <w:rPr>
-          <w:rFonts w:ascii="Noto Serif SC" w:eastAsia="Noto Serif SC" w:hAnsi="Noto Serif SC" w:cs="Noto Serif" w:hint="eastAsia"/>
-          <w:sz w:val="20"/>
-          <w:szCs w:val="20"/>
-          <w:lang w:val="en-US"/>
-        </w:rPr>
-        <w:t>小军鼓</w:t>
-      </w:r>
-      <w:r>
-        <w:rPr>
-          <w:rFonts w:ascii="Noto Serif SC" w:eastAsia="Noto Serif SC" w:hAnsi="Noto Serif SC" w:cs="Noto Serif"/>
-          <w:sz w:val="20"/>
-          <w:szCs w:val="20"/>
-          <w:lang w:val="en-US"/>
-        </w:rPr>
-        <w:t xml:space="preserve"> Snare Drum, </w:t>
-      </w:r>
-      <w:r>
-        <w:rPr>
-          <w:rFonts w:ascii="Noto Serif SC" w:eastAsia="Noto Serif SC" w:hAnsi="Noto Serif SC" w:cs="Noto Serif" w:hint="eastAsia"/>
-          <w:sz w:val="20"/>
-          <w:szCs w:val="20"/>
-        </w:rPr>
-        <w:t>铃鼓</w:t>
-      </w:r>
-      <w:r>
-        <w:rPr>
-          <w:rFonts w:ascii="Noto Serif SC" w:eastAsia="Noto Serif SC" w:hAnsi="Noto Serif SC" w:cs="Noto Serif"/>
-          <w:sz w:val="20"/>
-          <w:szCs w:val="20"/>
-        </w:rPr>
-        <w:t xml:space="preserve"> Tambourine, </w:t>
-      </w:r>
-      <w:r>
-        <w:rPr>
-          <w:rFonts w:ascii="Noto Serif SC" w:eastAsia="Noto Serif SC" w:hAnsi="Noto Serif SC" w:cs="Noto Serif" w:hint="eastAsia"/>
-          <w:sz w:val="20"/>
-          <w:szCs w:val="20"/>
-        </w:rPr>
-        <w:t>钟琴</w:t>
-      </w:r>
-      <w:r>
-        <w:rPr>
-          <w:rFonts w:ascii="Noto Serif SC" w:eastAsia="Noto Serif SC" w:hAnsi="Noto Serif SC" w:cs="Noto Serif"/>
-          <w:sz w:val="20"/>
-          <w:szCs w:val="20"/>
-        </w:rPr>
-        <w:t xml:space="preserve"> Glockenspiel, </w:t>
-      </w:r>
-      <w:r>
-        <w:rPr>
-          <w:rFonts w:ascii="Noto Serif SC" w:eastAsia="Noto Serif SC" w:hAnsi="Noto Serif SC" w:cs="Noto Serif" w:hint="eastAsia"/>
-          <w:sz w:val="20"/>
-          <w:szCs w:val="20"/>
-        </w:rPr>
-        <w:t>小钹</w:t>
-      </w:r>
-      <w:r>
-        <w:rPr>
-          <w:rFonts w:ascii="Noto Serif SC" w:eastAsia="Noto Serif SC" w:hAnsi="Noto Serif SC" w:cs="Noto Serif"/>
-          <w:sz w:val="20"/>
-          <w:szCs w:val="20"/>
-        </w:rPr>
-        <w:t xml:space="preserve"> Xiaobo, </w:t>
-      </w:r>
-      <w:r>
-        <w:rPr>
-          <w:rFonts w:ascii="Noto Serif SC" w:eastAsia="Noto Serif SC" w:hAnsi="Noto Serif SC" w:cs="Noto Serif" w:hint="eastAsia"/>
-          <w:sz w:val="20"/>
-          <w:szCs w:val="20"/>
-        </w:rPr>
-        <w:t>小堂鼓</w:t>
-      </w:r>
-      <w:r>
-        <w:rPr>
-          <w:rFonts w:ascii="Noto Serif SC" w:eastAsia="Noto Serif SC" w:hAnsi="Noto Serif SC" w:cs="Noto Serif"/>
-          <w:sz w:val="20"/>
-          <w:szCs w:val="20"/>
-        </w:rPr>
-        <w:t xml:space="preserve"> </w:t>
-      </w:r>
-      <w:proofErr w:type="spellStart"/>
-      <w:r>
-        <w:rPr>
-          <w:rFonts w:ascii="Noto Serif SC" w:eastAsia="Noto Serif SC" w:hAnsi="Noto Serif SC" w:cs="Noto Serif"/>
-          <w:sz w:val="20"/>
-          <w:szCs w:val="20"/>
-        </w:rPr>
-        <w:t>Xiaotanggu</w:t>
-      </w:r>
-      <w:proofErr w:type="spellEnd"/>
-    </w:p>
-    <w:p>
-      <w:pPr>
-        <w:ind w:left="720" w:hanging="436"/>
-        <w:rPr>
-          <w:rFonts w:ascii="Noto Serif SC" w:eastAsia="Noto Serif SC" w:hAnsi="Noto Serif SC" w:cs="Noto Serif"/>
-          <w:sz w:val="20"/>
-          <w:szCs w:val="20"/>
-          <w:lang w:val="en-US"/>
-        </w:rPr>
-      </w:pPr>
-      <w:r>
-        <w:rPr>
-          <w:rFonts w:ascii="Noto Serif SC" w:eastAsia="Noto Serif SC" w:hAnsi="Noto Serif SC" w:cs="Noto Serif"/>
-          <w:sz w:val="20"/>
-          <w:szCs w:val="20"/>
-          <w:lang w:val="en-US"/>
-        </w:rPr>
-        <w:t xml:space="preserve">IV: </w:t>
-      </w:r>
-      <w:r>
-        <w:rPr>
-          <w:rFonts w:ascii="Noto Serif SC" w:eastAsia="Noto Serif SC" w:hAnsi="Noto Serif SC" w:cs="Noto Serif" w:hint="eastAsia"/>
-          <w:sz w:val="20"/>
-          <w:szCs w:val="20"/>
-        </w:rPr>
-        <w:t>鞭子</w:t>
-      </w:r>
-      <w:r>
-        <w:rPr>
-          <w:rFonts w:ascii="Noto Serif SC" w:eastAsia="Noto Serif SC" w:hAnsi="Noto Serif SC" w:cs="Noto Serif"/>
-          <w:sz w:val="20"/>
-          <w:szCs w:val="20"/>
-        </w:rPr>
-        <w:t xml:space="preserve"> Whip, </w:t>
-      </w:r>
-      <w:r>
-        <w:rPr>
-          <w:rFonts w:ascii="Noto Serif SC" w:eastAsia="Noto Serif SC" w:hAnsi="Noto Serif SC" w:cs="Noto Serif" w:hint="eastAsia"/>
-          <w:sz w:val="20"/>
-          <w:szCs w:val="20"/>
-        </w:rPr>
-        <w:t>中钹</w:t>
-      </w:r>
-      <w:r>
-        <w:rPr>
-          <w:rFonts w:ascii="Noto Serif SC" w:eastAsia="Noto Serif SC" w:hAnsi="Noto Serif SC" w:cs="Noto Serif"/>
-          <w:sz w:val="20"/>
-          <w:szCs w:val="20"/>
-        </w:rPr>
-        <w:t xml:space="preserve"> </w:t>
-      </w:r>
-      <w:proofErr w:type="spellStart"/>
-      <w:r>
-        <w:rPr>
-          <w:rFonts w:ascii="Noto Serif SC" w:eastAsia="Noto Serif SC" w:hAnsi="Noto Serif SC" w:cs="Noto Serif"/>
-          <w:sz w:val="20"/>
-          <w:szCs w:val="20"/>
-        </w:rPr>
-        <w:t>Zhongbo</w:t>
-      </w:r>
-      <w:proofErr w:type="spellEnd"/>
-      <w:r>
-        <w:rPr>
-          <w:rFonts w:ascii="Noto Serif SC" w:eastAsia="Noto Serif SC" w:hAnsi="Noto Serif SC" w:cs="Noto Serif"/>
-          <w:sz w:val="20"/>
-          <w:szCs w:val="20"/>
-        </w:rPr>
-        <w:t xml:space="preserve">, </w:t>
-      </w:r>
-      <w:r>
-        <w:rPr>
-          <w:rFonts w:ascii="Noto Serif SC" w:eastAsia="Noto Serif SC" w:hAnsi="Noto Serif SC" w:cs="Noto Serif" w:hint="eastAsia"/>
-          <w:sz w:val="20"/>
-          <w:szCs w:val="20"/>
-        </w:rPr>
-        <w:t>中国小钹</w:t>
-      </w:r>
-      <w:r>
-        <w:rPr>
-          <w:rFonts w:ascii="Noto Serif SC" w:eastAsia="Noto Serif SC" w:hAnsi="Noto Serif SC" w:cs="Noto Serif"/>
-          <w:sz w:val="20"/>
-          <w:szCs w:val="20"/>
-          <w:lang w:val="en-GB"/>
-        </w:rPr>
-        <w:t xml:space="preserve"> </w:t>
-      </w:r>
-      <w:proofErr w:type="spellStart"/>
-      <w:r>
-        <w:rPr>
-          <w:rFonts w:ascii="Noto Serif SC" w:eastAsia="Noto Serif SC" w:hAnsi="Noto Serif SC" w:cs="Noto Serif"/>
-          <w:sz w:val="20"/>
-          <w:szCs w:val="20"/>
-        </w:rPr>
-        <w:t>Xiaoluo</w:t>
-      </w:r>
-      <w:proofErr w:type="spellEnd"/>
-      <w:r>
-        <w:rPr>
-          <w:rFonts w:ascii="Noto Serif SC" w:eastAsia="Noto Serif SC" w:hAnsi="Noto Serif SC" w:cs="Noto Serif"/>
-          <w:sz w:val="20"/>
-          <w:szCs w:val="20"/>
-        </w:rPr>
-        <w:t xml:space="preserve">, </w:t>
-      </w:r>
-      <w:r>
-        <w:rPr>
-          <w:rFonts w:ascii="Noto Serif SC" w:eastAsia="Noto Serif SC" w:hAnsi="Noto Serif SC" w:cs="Noto Serif" w:hint="eastAsia"/>
-          <w:sz w:val="20"/>
-          <w:szCs w:val="20"/>
-        </w:rPr>
-        <w:t>中国大钹</w:t>
-      </w:r>
-      <w:r>
-        <w:rPr>
-          <w:rFonts w:ascii="Noto Serif SC" w:eastAsia="Noto Serif SC" w:hAnsi="Noto Serif SC" w:cs="Noto Serif"/>
-          <w:sz w:val="20"/>
-          <w:szCs w:val="20"/>
-        </w:rPr>
-        <w:t xml:space="preserve"> </w:t>
-      </w:r>
-      <w:proofErr w:type="spellStart"/>
-      <w:r>
-        <w:rPr>
-          <w:rFonts w:ascii="Noto Serif SC" w:eastAsia="Noto Serif SC" w:hAnsi="Noto Serif SC" w:cs="Noto Serif"/>
-          <w:sz w:val="20"/>
-          <w:szCs w:val="20"/>
-        </w:rPr>
-        <w:t>Daluo</w:t>
-      </w:r>
-      <w:proofErr w:type="spellEnd"/>
-      <w:r>
-        <w:rPr>
-          <w:rFonts w:ascii="Noto Serif SC" w:eastAsia="Noto Serif SC" w:hAnsi="Noto Serif SC" w:cs="Noto Serif"/>
-          <w:sz w:val="20"/>
-          <w:szCs w:val="20"/>
-        </w:rPr>
-        <w:t xml:space="preserve">, </w:t>
-      </w:r>
-      <w:r>
-        <w:rPr>
-          <w:rFonts w:ascii="Noto Serif SC" w:eastAsia="Noto Serif SC" w:hAnsi="Noto Serif SC" w:cs="Noto Serif" w:hint="eastAsia"/>
-          <w:sz w:val="20"/>
-          <w:szCs w:val="20"/>
-        </w:rPr>
-        <w:t>西洋对镲</w:t>
-      </w:r>
-      <w:r>
-        <w:rPr>
-          <w:rFonts w:ascii="Noto Serif SC" w:eastAsia="Noto Serif SC" w:hAnsi="Noto Serif SC" w:cs="Noto Serif"/>
-          <w:sz w:val="20"/>
-          <w:szCs w:val="20"/>
-        </w:rPr>
-        <w:t xml:space="preserve"> Crash Cymbals</w:t>
-      </w:r>
-    </w:p>
-    <w:p>
-      <w:pPr>
-        <w:ind w:hanging="436"/>
-        <w:rPr>
-          <w:rFonts w:ascii="Noto Serif SC" w:eastAsia="Noto Serif SC" w:hAnsi="Noto Serif SC" w:cs="Noto Serif"/>
-          <w:sz w:val="24"/>
-          <w:szCs w:val="24"/>
-          <w:lang w:val="en-US"/>
-        </w:rPr>
-      </w:pPr>
-    </w:p>
-    <w:p>
-      <w:pPr>
-        <w:rPr>
-          <w:rFonts w:ascii="Noto Serif SC" w:eastAsia="Noto Serif SC" w:hAnsi="Noto Serif SC" w:cs="Noto Serif"/>
-          <w:sz w:val="24"/>
-          <w:szCs w:val="24"/>
-          <w:lang w:val="en-US"/>
-        </w:rPr>
-      </w:pPr>
-      <w:r>
-        <w:rPr>
-          <w:rFonts w:ascii="Noto Serif SC" w:eastAsia="Noto Serif SC" w:hAnsi="Noto Serif SC" w:cs="Noto Serif" w:hint="eastAsia"/>
-          <w:sz w:val="24"/>
-          <w:szCs w:val="24"/>
-          <w:lang w:val="en-US"/>
-        </w:rPr>
-        <w:t>高胡</w:t>
-      </w:r>
-      <w:r>
-        <w:rPr>
-          <w:rFonts w:ascii="Noto Serif SC" w:eastAsia="Noto Serif SC" w:hAnsi="Noto Serif SC" w:cs="Noto Serif"/>
-          <w:sz w:val="24"/>
-          <w:szCs w:val="24"/>
-          <w:lang w:val="en-US"/>
-        </w:rPr>
-        <w:t xml:space="preserve"> Gaohu</w:t>
-      </w:r>
-    </w:p>
-    <w:p>
-      <w:pPr>
-        <w:rPr>
-          <w:rFonts w:ascii="Noto Serif SC" w:eastAsia="Noto Serif SC" w:hAnsi="Noto Serif SC" w:cs="Noto Serif"/>
-          <w:sz w:val="24"/>
-          <w:szCs w:val="24"/>
-          <w:lang w:val="en-US"/>
-        </w:rPr>
-      </w:pPr>
-      <w:r>
-        <w:rPr>
-          <w:rFonts w:ascii="Noto Serif SC" w:eastAsia="Noto Serif SC" w:hAnsi="Noto Serif SC" w:cs="Noto Serif" w:hint="eastAsia"/>
-          <w:sz w:val="24"/>
-          <w:szCs w:val="24"/>
-          <w:lang w:val="en-US"/>
-        </w:rPr>
-        <w:t>二胡</w:t>
-      </w:r>
-      <w:r>
-        <w:rPr>
-          <w:rFonts w:ascii="Noto Serif SC" w:eastAsia="Noto Serif SC" w:hAnsi="Noto Serif SC" w:cs="Noto Serif"/>
-          <w:sz w:val="24"/>
-          <w:szCs w:val="24"/>
-          <w:lang w:val="en-US"/>
-        </w:rPr>
-        <w:t xml:space="preserve"> Erhu</w:t>
-      </w:r>
-      <w:r>
-        <w:rPr>
-          <w:rFonts w:ascii="Noto Serif SC" w:eastAsia="Noto Serif SC" w:hAnsi="Noto Serif SC" w:cs="Noto Serif"/>
-          <w:sz w:val="24"/>
-          <w:szCs w:val="24"/>
-          <w:lang w:val="en-US"/>
-        </w:rPr>
-        <w:t xml:space="preserve"> I</w:t>
-      </w:r>
-    </w:p>
-    <w:p>
-      <w:pPr>
-        <w:rPr>
-          <w:rFonts w:ascii="Noto Serif SC" w:eastAsia="Noto Serif SC" w:hAnsi="Noto Serif SC" w:cs="Noto Serif"/>
-          <w:sz w:val="24"/>
-          <w:szCs w:val="24"/>
-          <w:lang w:val="en-US"/>
-        </w:rPr>
-      </w:pPr>
-      <w:r>
-        <w:rPr>
-          <w:rFonts w:ascii="Noto Serif SC" w:eastAsia="Noto Serif SC" w:hAnsi="Noto Serif SC" w:cs="Noto Serif" w:hint="eastAsia"/>
-          <w:sz w:val="24"/>
-          <w:szCs w:val="24"/>
-          <w:lang w:val="en-US"/>
-        </w:rPr>
-        <w:t>二胡</w:t>
-      </w:r>
-      <w:r>
-        <w:rPr>
-          <w:rFonts w:ascii="Noto Serif SC" w:eastAsia="Noto Serif SC" w:hAnsi="Noto Serif SC" w:cs="Noto Serif"/>
-          <w:sz w:val="24"/>
-          <w:szCs w:val="24"/>
-          <w:lang w:val="en-US"/>
-        </w:rPr>
-        <w:t xml:space="preserve"> Erhu</w:t>
-      </w:r>
-      <w:r>
-        <w:rPr>
-          <w:rFonts w:ascii="Noto Serif SC" w:eastAsia="Noto Serif SC" w:hAnsi="Noto Serif SC" w:cs="Noto Serif"/>
-          <w:sz w:val="24"/>
-          <w:szCs w:val="24"/>
-          <w:lang w:val="en-US"/>
-        </w:rPr>
-        <w:t xml:space="preserve"> II</w:t>
       </w:r>
     </w:p>
     <w:p>

</xml_diff>

<commit_message>
Front matters: Apostrophes set to Noto Serif SC and are non-curly.
</commit_message>
<xml_diff>
--- a/Front Matter/Template/Pieces/1_Front-Matter.docx
+++ b/Front Matter/Template/Pieces/1_Front-Matter.docx
@@ -22,7 +22,7 @@
           <w:b/>
           <w:sz w:val="120"/>
           <w:szCs w:val="120"/>
-          <w:lang w:val="en-US" w:eastAsia="zh-TW"/>
+          <w:lang w:eastAsia="zh-TW"/>
         </w:rPr>
       </w:pPr>
       <w:r>
@@ -31,7 +31,6 @@
           <w:b/>
           <w:sz w:val="120"/>
           <w:szCs w:val="120"/>
-          <w:lang w:val="en-US"/>
         </w:rPr>
         <w:t>狮城漫步</w:t>
       </w:r>
@@ -44,7 +43,6 @@
           <w:b/>
           <w:sz w:val="60"/>
           <w:szCs w:val="60"/>
-          <w:lang w:val="en-GB"/>
         </w:rPr>
       </w:pPr>
       <w:r>
@@ -65,7 +63,6 @@
           <w:rFonts w:ascii="Noto Serif SC" w:eastAsia="Noto Serif SC" w:hAnsi="Noto Serif SC" w:cs="Noto Serif"/>
           <w:sz w:val="40"/>
           <w:szCs w:val="96"/>
-          <w:lang w:val="en-US"/>
         </w:rPr>
       </w:pPr>
       <w:r>
@@ -125,7 +122,6 @@
           <w:rFonts w:ascii="Noto Serif SC" w:eastAsia="Noto Serif SC" w:hAnsi="Noto Serif SC" w:cs="Noto Serif"/>
           <w:sz w:val="60"/>
           <w:szCs w:val="60"/>
-          <w:lang w:val="en-GB"/>
         </w:rPr>
       </w:pPr>
       <w:r>
@@ -152,16 +148,15 @@
           <w:sz w:val="40"/>
           <w:szCs w:val="96"/>
         </w:rPr>
-        <w:t xml:space="preserve">Xie </w:t>
-      </w:r>
-      <w:proofErr w:type="spellStart"/>
+        <w:t>Xie Xiang</w:t>
+      </w:r>
       <w:r>
         <w:rPr>
           <w:rFonts w:ascii="Noto Serif SC" w:eastAsia="Noto Serif SC" w:hAnsi="Noto Serif SC" w:cs="Noto Serif"/>
           <w:sz w:val="40"/>
           <w:szCs w:val="96"/>
         </w:rPr>
-        <w:t>Xiang</w:t>
+        <w:t>m</w:t>
       </w:r>
       <w:r>
         <w:rPr>
@@ -169,17 +164,8 @@
           <w:sz w:val="40"/>
           <w:szCs w:val="96"/>
         </w:rPr>
-        <w:t>m</w:t>
-      </w:r>
-      <w:r>
-        <w:rPr>
-          <w:rFonts w:ascii="Noto Serif SC" w:eastAsia="Noto Serif SC" w:hAnsi="Noto Serif SC" w:cs="Noto Serif"/>
-          <w:sz w:val="40"/>
-          <w:szCs w:val="96"/>
-        </w:rPr>
         <w:t>ing</w:t>
       </w:r>
-      <w:proofErr w:type="spellEnd"/>
     </w:p>
     <w:p>
       <w:pPr>
@@ -199,7 +185,6 @@
       <w:r>
         <w:rPr>
           <w:rFonts w:ascii="Noto Serif SC" w:eastAsia="Noto Serif SC" w:hAnsi="Noto Serif SC" w:cs="STKaiti" w:hint="eastAsia"/>
-          <w:noProof/>
           <w:sz w:val="144"/>
           <w:szCs w:val="72"/>
         </w:rPr>
@@ -336,7 +321,7 @@
           <w:b/>
           <w:sz w:val="60"/>
           <w:szCs w:val="60"/>
-          <w:lang w:val="en-US" w:eastAsia="zh-TW"/>
+          <w:lang w:eastAsia="zh-TW"/>
         </w:rPr>
       </w:pPr>
       <w:r>
@@ -345,7 +330,6 @@
           <w:b/>
           <w:sz w:val="60"/>
           <w:szCs w:val="60"/>
-          <w:lang w:val="en-US"/>
         </w:rPr>
         <w:t>狮城漫步</w:t>
       </w:r>
@@ -358,7 +342,6 @@
           <w:b/>
           <w:sz w:val="56"/>
           <w:szCs w:val="96"/>
-          <w:lang w:val="en-GB"/>
         </w:rPr>
       </w:pPr>
       <w:r>
@@ -379,7 +362,6 @@
           <w:rFonts w:ascii="Noto Serif SC" w:eastAsia="Noto Serif SC" w:hAnsi="Noto Serif SC" w:cs="Noto Serif"/>
           <w:sz w:val="36"/>
           <w:szCs w:val="72"/>
-          <w:lang w:val="en-US"/>
         </w:rPr>
       </w:pPr>
       <w:r>
@@ -438,7 +420,6 @@
           <w:rFonts w:ascii="Noto Serif SC" w:eastAsia="Noto Serif SC" w:hAnsi="Noto Serif SC" w:cs="Noto Serif"/>
           <w:sz w:val="44"/>
           <w:szCs w:val="144"/>
-          <w:lang w:val="en-GB"/>
         </w:rPr>
       </w:pPr>
       <w:r>
@@ -466,16 +447,15 @@
           <w:sz w:val="40"/>
           <w:szCs w:val="96"/>
         </w:rPr>
-        <w:t xml:space="preserve">Xie </w:t>
-      </w:r>
-      <w:proofErr w:type="spellStart"/>
+        <w:t>Xie Xiang</w:t>
+      </w:r>
       <w:r>
         <w:rPr>
           <w:rFonts w:ascii="Noto Serif SC" w:eastAsia="Noto Serif SC" w:hAnsi="Noto Serif SC" w:cs="Noto Serif"/>
           <w:sz w:val="40"/>
           <w:szCs w:val="96"/>
         </w:rPr>
-        <w:t>Xiang</w:t>
+        <w:t>m</w:t>
       </w:r>
       <w:r>
         <w:rPr>
@@ -483,17 +463,8 @@
           <w:sz w:val="40"/>
           <w:szCs w:val="96"/>
         </w:rPr>
-        <w:t>m</w:t>
-      </w:r>
-      <w:r>
-        <w:rPr>
-          <w:rFonts w:ascii="Noto Serif SC" w:eastAsia="Noto Serif SC" w:hAnsi="Noto Serif SC" w:cs="Noto Serif"/>
-          <w:sz w:val="40"/>
-          <w:szCs w:val="96"/>
-        </w:rPr>
         <w:t>ing</w:t>
       </w:r>
-      <w:proofErr w:type="spellEnd"/>
     </w:p>
     <w:p>
       <w:pPr>
@@ -503,7 +474,6 @@
           <w:rFonts w:ascii="Noto Serif SC" w:eastAsia="Noto Serif SC" w:hAnsi="Noto Serif SC" w:cs="Noto Serif"/>
           <w:sz w:val="32"/>
           <w:szCs w:val="32"/>
-          <w:lang w:val="en-US"/>
         </w:rPr>
       </w:pPr>
       <w:r>
@@ -511,7 +481,6 @@
           <w:rFonts w:ascii="Noto Serif SC" w:eastAsia="Noto Serif SC" w:hAnsi="Noto Serif SC" w:cs="Noto Serif"/>
           <w:sz w:val="32"/>
           <w:szCs w:val="32"/>
-          <w:lang w:val="en-US"/>
         </w:rPr>
         <w:t>(2011)</w:t>
       </w:r>
@@ -523,7 +492,6 @@
           <w:rFonts w:ascii="Noto Serif SC" w:eastAsia="Noto Serif SC" w:hAnsi="Noto Serif SC" w:cs="Noto Serif"/>
           <w:sz w:val="32"/>
           <w:szCs w:val="32"/>
-          <w:lang w:val="en-US"/>
         </w:rPr>
         <w:sectPr>
           <w:pgSz w:w="16840" w:h="23820"/>
@@ -538,7 +506,6 @@
           <w:rFonts w:ascii="Noto Serif SC" w:eastAsia="Noto Serif SC" w:hAnsi="Noto Serif SC" w:cs="Noto Serif"/>
           <w:sz w:val="32"/>
           <w:szCs w:val="32"/>
-          <w:lang w:val="en-US"/>
         </w:rPr>
         <w:t>1</w:t>
       </w:r>
@@ -547,7 +514,6 @@
           <w:rFonts w:ascii="Noto Serif SC" w:eastAsia="Noto Serif SC" w:hAnsi="Noto Serif SC" w:cs="Noto Serif"/>
           <w:sz w:val="32"/>
           <w:szCs w:val="32"/>
-          <w:lang w:val="en-US"/>
         </w:rPr>
         <w:t>1</w:t>
       </w:r>
@@ -556,7 +522,6 @@
           <w:rFonts w:ascii="Noto Serif SC" w:eastAsia="Noto Serif SC" w:hAnsi="Noto Serif SC" w:cs="Noto Serif"/>
           <w:sz w:val="32"/>
           <w:szCs w:val="32"/>
-          <w:lang w:val="en-US"/>
         </w:rPr>
         <w:t>'</w:t>
       </w:r>
@@ -570,7 +535,6 @@
           <w:color w:val="000000" w:themeColor="text1"/>
           <w:sz w:val="24"/>
           <w:szCs w:val="24"/>
-          <w:lang w:val="en-GB"/>
         </w:rPr>
       </w:pPr>
       <w:r>
@@ -616,7 +580,6 @@
           <w:color w:val="000000" w:themeColor="text1"/>
           <w:sz w:val="20"/>
           <w:szCs w:val="20"/>
-          <w:lang w:val="en-GB"/>
         </w:rPr>
       </w:pPr>
     </w:p>
@@ -712,7 +675,6 @@
           <w:color w:val="000000" w:themeColor="text1"/>
           <w:sz w:val="20"/>
           <w:szCs w:val="20"/>
-          <w:lang w:val="en-US"/>
         </w:rPr>
       </w:pPr>
       <w:r>
@@ -789,7 +751,6 @@
           <w:color w:val="000000" w:themeColor="text1"/>
           <w:sz w:val="20"/>
           <w:szCs w:val="20"/>
-          <w:lang w:val="en-US"/>
         </w:rPr>
       </w:pPr>
       <w:r>
@@ -836,16 +797,14 @@
           <w:color w:val="000000" w:themeColor="text1"/>
           <w:sz w:val="20"/>
           <w:szCs w:val="20"/>
-          <w:lang w:val="en-US"/>
-        </w:rPr>
-      </w:pPr>
-      <w:r>
-        <w:rPr>
-          <w:rFonts w:ascii="Noto Serif SC" w:eastAsia="Noto Serif SC" w:hAnsi="Noto Serif SC" w:cs="Noto Serif"/>
-          <w:color w:val="000000" w:themeColor="text1"/>
-          <w:sz w:val="20"/>
-          <w:szCs w:val="20"/>
-          <w:lang w:val="en-US"/>
+        </w:rPr>
+      </w:pPr>
+      <w:r>
+        <w:rPr>
+          <w:rFonts w:ascii="Noto Serif SC" w:eastAsia="Noto Serif SC" w:hAnsi="Noto Serif SC" w:cs="Noto Serif"/>
+          <w:color w:val="000000" w:themeColor="text1"/>
+          <w:sz w:val="20"/>
+          <w:szCs w:val="20"/>
         </w:rPr>
         <w:t>新加坡华乐团有限公司</w:t>
       </w:r>
@@ -857,16 +816,14 @@
           <w:color w:val="000000" w:themeColor="text1"/>
           <w:sz w:val="20"/>
           <w:szCs w:val="20"/>
-          <w:lang w:val="en-US"/>
-        </w:rPr>
-      </w:pPr>
-      <w:r>
-        <w:rPr>
-          <w:rFonts w:ascii="Noto Serif SC" w:eastAsia="Noto Serif SC" w:hAnsi="Noto Serif SC" w:cs="Noto Serif"/>
-          <w:color w:val="000000" w:themeColor="text1"/>
-          <w:sz w:val="20"/>
-          <w:szCs w:val="20"/>
-          <w:lang w:val="en-US"/>
+        </w:rPr>
+      </w:pPr>
+      <w:r>
+        <w:rPr>
+          <w:rFonts w:ascii="Noto Serif SC" w:eastAsia="Noto Serif SC" w:hAnsi="Noto Serif SC" w:cs="Noto Serif"/>
+          <w:color w:val="000000" w:themeColor="text1"/>
+          <w:sz w:val="20"/>
+          <w:szCs w:val="20"/>
         </w:rPr>
         <w:t>珊顿道7号</w:t>
       </w:r>
@@ -878,16 +835,14 @@
           <w:color w:val="000000" w:themeColor="text1"/>
           <w:sz w:val="20"/>
           <w:szCs w:val="20"/>
-          <w:lang w:val="en-US"/>
-        </w:rPr>
-      </w:pPr>
-      <w:r>
-        <w:rPr>
-          <w:rFonts w:ascii="Noto Serif SC" w:eastAsia="Noto Serif SC" w:hAnsi="Noto Serif SC" w:cs="Noto Serif"/>
-          <w:color w:val="000000" w:themeColor="text1"/>
-          <w:sz w:val="20"/>
-          <w:szCs w:val="20"/>
-          <w:lang w:val="en-US"/>
+        </w:rPr>
+      </w:pPr>
+      <w:r>
+        <w:rPr>
+          <w:rFonts w:ascii="Noto Serif SC" w:eastAsia="Noto Serif SC" w:hAnsi="Noto Serif SC" w:cs="Noto Serif"/>
+          <w:color w:val="000000" w:themeColor="text1"/>
+          <w:sz w:val="20"/>
+          <w:szCs w:val="20"/>
         </w:rPr>
         <w:t>新加坡大会堂</w:t>
       </w:r>
@@ -899,16 +854,14 @@
           <w:color w:val="000000" w:themeColor="text1"/>
           <w:sz w:val="20"/>
           <w:szCs w:val="20"/>
-          <w:lang w:val="en-US"/>
-        </w:rPr>
-      </w:pPr>
-      <w:r>
-        <w:rPr>
-          <w:rFonts w:ascii="Noto Serif SC" w:eastAsia="Noto Serif SC" w:hAnsi="Noto Serif SC" w:cs="Noto Serif"/>
-          <w:color w:val="000000" w:themeColor="text1"/>
-          <w:sz w:val="20"/>
-          <w:szCs w:val="20"/>
-          <w:lang w:val="en-US"/>
+        </w:rPr>
+      </w:pPr>
+      <w:r>
+        <w:rPr>
+          <w:rFonts w:ascii="Noto Serif SC" w:eastAsia="Noto Serif SC" w:hAnsi="Noto Serif SC" w:cs="Noto Serif"/>
+          <w:color w:val="000000" w:themeColor="text1"/>
+          <w:sz w:val="20"/>
+          <w:szCs w:val="20"/>
         </w:rPr>
         <w:t>新加坡邮区 068810</w:t>
       </w:r>
@@ -930,16 +883,14 @@
           <w:color w:val="000000" w:themeColor="text1"/>
           <w:sz w:val="20"/>
           <w:szCs w:val="20"/>
-          <w:lang w:val="en-US"/>
-        </w:rPr>
-      </w:pPr>
-      <w:r>
-        <w:rPr>
-          <w:rFonts w:ascii="Noto Serif SC" w:eastAsia="Noto Serif SC" w:hAnsi="Noto Serif SC" w:cs="Noto Serif"/>
-          <w:color w:val="000000" w:themeColor="text1"/>
-          <w:sz w:val="20"/>
-          <w:szCs w:val="20"/>
-          <w:lang w:val="en-US"/>
+        </w:rPr>
+      </w:pPr>
+      <w:r>
+        <w:rPr>
+          <w:rFonts w:ascii="Noto Serif SC" w:eastAsia="Noto Serif SC" w:hAnsi="Noto Serif SC" w:cs="Noto Serif"/>
+          <w:color w:val="000000" w:themeColor="text1"/>
+          <w:sz w:val="20"/>
+          <w:szCs w:val="20"/>
         </w:rPr>
         <w:t>Singapore Chinese Orchestra Co. Ltd.</w:t>
       </w:r>
@@ -951,16 +902,14 @@
           <w:color w:val="000000" w:themeColor="text1"/>
           <w:sz w:val="20"/>
           <w:szCs w:val="20"/>
-          <w:lang w:val="en-US"/>
-        </w:rPr>
-      </w:pPr>
-      <w:r>
-        <w:rPr>
-          <w:rFonts w:ascii="Noto Serif SC" w:eastAsia="Noto Serif SC" w:hAnsi="Noto Serif SC" w:cs="Noto Serif"/>
-          <w:color w:val="000000" w:themeColor="text1"/>
-          <w:sz w:val="20"/>
-          <w:szCs w:val="20"/>
-          <w:lang w:val="en-US"/>
+        </w:rPr>
+      </w:pPr>
+      <w:r>
+        <w:rPr>
+          <w:rFonts w:ascii="Noto Serif SC" w:eastAsia="Noto Serif SC" w:hAnsi="Noto Serif SC" w:cs="Noto Serif"/>
+          <w:color w:val="000000" w:themeColor="text1"/>
+          <w:sz w:val="20"/>
+          <w:szCs w:val="20"/>
         </w:rPr>
         <w:t>7 Shenton Way</w:t>
       </w:r>
@@ -972,16 +921,14 @@
           <w:color w:val="000000" w:themeColor="text1"/>
           <w:sz w:val="20"/>
           <w:szCs w:val="20"/>
-          <w:lang w:val="en-US"/>
-        </w:rPr>
-      </w:pPr>
-      <w:r>
-        <w:rPr>
-          <w:rFonts w:ascii="Noto Serif SC" w:eastAsia="Noto Serif SC" w:hAnsi="Noto Serif SC" w:cs="Noto Serif"/>
-          <w:color w:val="000000" w:themeColor="text1"/>
-          <w:sz w:val="20"/>
-          <w:szCs w:val="20"/>
-          <w:lang w:val="en-US"/>
+        </w:rPr>
+      </w:pPr>
+      <w:r>
+        <w:rPr>
+          <w:rFonts w:ascii="Noto Serif SC" w:eastAsia="Noto Serif SC" w:hAnsi="Noto Serif SC" w:cs="Noto Serif"/>
+          <w:color w:val="000000" w:themeColor="text1"/>
+          <w:sz w:val="20"/>
+          <w:szCs w:val="20"/>
         </w:rPr>
         <w:t>Singapore Conference Hall</w:t>
       </w:r>
@@ -993,16 +940,14 @@
           <w:color w:val="000000" w:themeColor="text1"/>
           <w:sz w:val="20"/>
           <w:szCs w:val="20"/>
-          <w:lang w:val="en-US"/>
-        </w:rPr>
-      </w:pPr>
-      <w:r>
-        <w:rPr>
-          <w:rFonts w:ascii="Noto Serif SC" w:eastAsia="Noto Serif SC" w:hAnsi="Noto Serif SC" w:cs="Noto Serif"/>
-          <w:color w:val="000000" w:themeColor="text1"/>
-          <w:sz w:val="20"/>
-          <w:szCs w:val="20"/>
-          <w:lang w:val="en-US"/>
+        </w:rPr>
+      </w:pPr>
+      <w:r>
+        <w:rPr>
+          <w:rFonts w:ascii="Noto Serif SC" w:eastAsia="Noto Serif SC" w:hAnsi="Noto Serif SC" w:cs="Noto Serif"/>
+          <w:color w:val="000000" w:themeColor="text1"/>
+          <w:sz w:val="20"/>
+          <w:szCs w:val="20"/>
         </w:rPr>
         <w:t>Singapore 068810</w:t>
       </w:r>
@@ -1014,25 +959,22 @@
           <w:b/>
           <w:sz w:val="20"/>
           <w:szCs w:val="20"/>
-          <w:lang w:val="en-US"/>
-        </w:rPr>
-      </w:pPr>
-    </w:p>
-    <w:p>
-      <w:pPr>
-        <w:rPr>
-          <w:rFonts w:ascii="Noto Serif SC" w:eastAsia="Noto Serif SC" w:hAnsi="Noto Serif SC" w:cs="Noto Serif"/>
-          <w:sz w:val="20"/>
-          <w:szCs w:val="20"/>
-          <w:lang w:val="en-US"/>
-        </w:rPr>
-      </w:pPr>
-      <w:r>
-        <w:rPr>
-          <w:rFonts w:ascii="Noto Serif SC" w:eastAsia="Noto Serif SC" w:hAnsi="Noto Serif SC" w:cs="Noto Serif"/>
-          <w:sz w:val="20"/>
-          <w:szCs w:val="20"/>
-          <w:lang w:val="en-US"/>
+        </w:rPr>
+      </w:pPr>
+    </w:p>
+    <w:p>
+      <w:pPr>
+        <w:rPr>
+          <w:rFonts w:ascii="Noto Serif SC" w:eastAsia="Noto Serif SC" w:hAnsi="Noto Serif SC" w:cs="Noto Serif"/>
+          <w:sz w:val="20"/>
+          <w:szCs w:val="20"/>
+        </w:rPr>
+      </w:pPr>
+      <w:r>
+        <w:rPr>
+          <w:rFonts w:ascii="Noto Serif SC" w:eastAsia="Noto Serif SC" w:hAnsi="Noto Serif SC" w:cs="Noto Serif"/>
+          <w:sz w:val="20"/>
+          <w:szCs w:val="20"/>
         </w:rPr>
         <w:t>网站</w:t>
       </w:r>
@@ -1041,7 +983,6 @@
           <w:rFonts w:ascii="Noto Serif SC" w:eastAsia="Noto Serif SC" w:hAnsi="Noto Serif SC" w:cs="Noto Serif"/>
           <w:sz w:val="20"/>
           <w:szCs w:val="20"/>
-          <w:lang w:val="en-US"/>
         </w:rPr>
         <w:t xml:space="preserve"> </w:t>
       </w:r>
@@ -1050,7 +991,6 @@
           <w:rFonts w:ascii="Noto Serif SC" w:eastAsia="Noto Serif SC" w:hAnsi="Noto Serif SC" w:cs="Noto Serif"/>
           <w:sz w:val="20"/>
           <w:szCs w:val="20"/>
-          <w:lang w:val="en-US"/>
         </w:rPr>
         <w:t>Website: </w:t>
       </w:r>
@@ -1061,7 +1001,6 @@
             <w:rFonts w:ascii="Noto Serif SC" w:eastAsia="Noto Serif SC" w:hAnsi="Noto Serif SC" w:cs="Noto Serif"/>
             <w:sz w:val="20"/>
             <w:szCs w:val="20"/>
-            <w:lang w:val="en-US"/>
           </w:rPr>
           <w:t>www.sco.com.sg</w:t>
         </w:r>
@@ -1073,15 +1012,13 @@
           <w:rFonts w:ascii="Noto Serif SC" w:eastAsia="Noto Serif SC" w:hAnsi="Noto Serif SC" w:cs="Noto Serif"/>
           <w:sz w:val="20"/>
           <w:szCs w:val="20"/>
-          <w:lang w:val="en-US"/>
-        </w:rPr>
-      </w:pPr>
-      <w:r>
-        <w:rPr>
-          <w:rFonts w:ascii="Noto Serif SC" w:eastAsia="Noto Serif SC" w:hAnsi="Noto Serif SC" w:cs="Noto Serif"/>
-          <w:sz w:val="20"/>
-          <w:szCs w:val="20"/>
-          <w:lang w:val="en-US"/>
+        </w:rPr>
+      </w:pPr>
+      <w:r>
+        <w:rPr>
+          <w:rFonts w:ascii="Noto Serif SC" w:eastAsia="Noto Serif SC" w:hAnsi="Noto Serif SC" w:cs="Noto Serif"/>
+          <w:sz w:val="20"/>
+          <w:szCs w:val="20"/>
         </w:rPr>
         <w:t>电邮</w:t>
       </w:r>
@@ -1090,7 +1027,6 @@
           <w:rFonts w:ascii="Noto Serif SC" w:eastAsia="Noto Serif SC" w:hAnsi="Noto Serif SC" w:cs="Noto Serif"/>
           <w:sz w:val="20"/>
           <w:szCs w:val="20"/>
-          <w:lang w:val="en-US"/>
         </w:rPr>
         <w:t xml:space="preserve"> </w:t>
       </w:r>
@@ -1099,7 +1035,6 @@
           <w:rFonts w:ascii="Noto Serif SC" w:eastAsia="Noto Serif SC" w:hAnsi="Noto Serif SC" w:cs="Noto Serif"/>
           <w:sz w:val="20"/>
           <w:szCs w:val="20"/>
-          <w:lang w:val="en-US"/>
         </w:rPr>
         <w:t>Email: </w:t>
       </w:r>
@@ -1110,7 +1045,6 @@
             <w:rFonts w:ascii="Noto Serif SC" w:eastAsia="Noto Serif SC" w:hAnsi="Noto Serif SC" w:cs="Noto Serif"/>
             <w:sz w:val="20"/>
             <w:szCs w:val="20"/>
-            <w:lang w:val="en-US"/>
           </w:rPr>
           <w:t>aa@sco.com.sg</w:t>
         </w:r>
@@ -1122,15 +1056,13 @@
           <w:rFonts w:ascii="Noto Serif SC" w:eastAsia="Noto Serif SC" w:hAnsi="Noto Serif SC" w:cs="Noto Serif"/>
           <w:sz w:val="20"/>
           <w:szCs w:val="20"/>
-          <w:lang w:val="en-US"/>
-        </w:rPr>
-      </w:pPr>
-      <w:r>
-        <w:rPr>
-          <w:rFonts w:ascii="Noto Serif SC" w:eastAsia="Noto Serif SC" w:hAnsi="Noto Serif SC" w:cs="Noto Serif"/>
-          <w:sz w:val="20"/>
-          <w:szCs w:val="20"/>
-          <w:lang w:val="en-US"/>
+        </w:rPr>
+      </w:pPr>
+      <w:r>
+        <w:rPr>
+          <w:rFonts w:ascii="Noto Serif SC" w:eastAsia="Noto Serif SC" w:hAnsi="Noto Serif SC" w:cs="Noto Serif"/>
+          <w:sz w:val="20"/>
+          <w:szCs w:val="20"/>
         </w:rPr>
         <w:t>电话</w:t>
       </w:r>
@@ -1139,7 +1071,6 @@
           <w:rFonts w:ascii="Noto Serif SC" w:eastAsia="Noto Serif SC" w:hAnsi="Noto Serif SC" w:cs="Noto Serif"/>
           <w:sz w:val="20"/>
           <w:szCs w:val="20"/>
-          <w:lang w:val="en-US"/>
         </w:rPr>
         <w:t xml:space="preserve"> </w:t>
       </w:r>
@@ -1148,7 +1079,6 @@
           <w:rFonts w:ascii="Noto Serif SC" w:eastAsia="Noto Serif SC" w:hAnsi="Noto Serif SC" w:cs="Noto Serif"/>
           <w:sz w:val="20"/>
           <w:szCs w:val="20"/>
-          <w:lang w:val="en-US"/>
         </w:rPr>
         <w:t>Telephone: (65) 6557 402</w:t>
       </w:r>
@@ -1157,7 +1087,6 @@
           <w:rFonts w:ascii="Noto Serif SC" w:eastAsia="Noto Serif SC" w:hAnsi="Noto Serif SC" w:cs="Noto Serif"/>
           <w:sz w:val="20"/>
           <w:szCs w:val="20"/>
-          <w:lang w:val="en-US"/>
         </w:rPr>
         <w:t>6</w:t>
       </w:r>
@@ -1168,7 +1097,6 @@
           <w:rFonts w:ascii="Noto Serif SC" w:eastAsia="Noto Serif SC" w:hAnsi="Noto Serif SC" w:cs="Noto Serif"/>
           <w:sz w:val="20"/>
           <w:szCs w:val="20"/>
-          <w:lang w:val="en-US"/>
         </w:rPr>
         <w:sectPr>
           <w:pgSz w:w="16840" w:h="23820"/>
@@ -1183,7 +1111,6 @@
           <w:rFonts w:ascii="Noto Serif SC" w:eastAsia="Noto Serif SC" w:hAnsi="Noto Serif SC" w:cs="Noto Serif"/>
           <w:sz w:val="20"/>
           <w:szCs w:val="20"/>
-          <w:lang w:val="en-US"/>
         </w:rPr>
         <w:t>传真</w:t>
       </w:r>
@@ -1192,7 +1119,6 @@
           <w:rFonts w:ascii="Noto Serif SC" w:eastAsia="Noto Serif SC" w:hAnsi="Noto Serif SC" w:cs="Noto Serif"/>
           <w:sz w:val="20"/>
           <w:szCs w:val="20"/>
-          <w:lang w:val="en-US"/>
         </w:rPr>
         <w:t xml:space="preserve"> </w:t>
       </w:r>
@@ -1201,7 +1127,6 @@
           <w:rFonts w:ascii="Noto Serif SC" w:eastAsia="Noto Serif SC" w:hAnsi="Noto Serif SC" w:cs="Noto Serif"/>
           <w:sz w:val="20"/>
           <w:szCs w:val="20"/>
-          <w:lang w:val="en-US"/>
         </w:rPr>
         <w:t>Fax: (65) 6557 275</w:t>
       </w:r>
@@ -1210,7 +1135,6 @@
           <w:rFonts w:ascii="Noto Serif SC" w:eastAsia="Noto Serif SC" w:hAnsi="Noto Serif SC" w:cs="Noto Serif"/>
           <w:sz w:val="20"/>
           <w:szCs w:val="20"/>
-          <w:lang w:val="en-US"/>
         </w:rPr>
         <w:t>6</w:t>
       </w:r>
@@ -1274,7 +1198,6 @@
           <w:bCs/>
           <w:sz w:val="24"/>
           <w:szCs w:val="24"/>
-          <w:lang w:val="en-US"/>
         </w:rPr>
         <w:t>1974</w:t>
       </w:r>
@@ -1283,7 +1206,6 @@
           <w:rFonts w:ascii="Noto Serif SC" w:eastAsia="Noto Serif SC" w:hAnsi="Noto Serif SC" w:hint="eastAsia"/>
           <w:sz w:val="24"/>
           <w:szCs w:val="24"/>
-          <w:lang w:val="en-US"/>
         </w:rPr>
         <w:t>年出生于福建漳州，祖籍龙岩客家。自幼随父学习扬琴、小提琴、钢琴和作曲。1991年考入上海音乐学院作曲指挥系，师从王建中教授学习作曲。毕业后曾任上海音乐学院附中作曲科教师，现为活跃于多种领域音乐创作的自由音乐人。创作体裁广泛，作有交响乐、室内乐、合唱、音乐剧等多种体裁的音乐，风格类型多样，现代、古典、流行、民间、宗教、电子等风格均有涉及，并在各种体裁和风格中均体现鲜明的个人特征。</w:t>
       </w:r>
@@ -1308,7 +1230,6 @@
           <w:rFonts w:ascii="Noto Serif SC" w:eastAsia="Noto Serif SC" w:hAnsi="Noto Serif SC" w:cs="Noto Serif"/>
           <w:sz w:val="24"/>
           <w:szCs w:val="24"/>
-          <w:lang w:val="en-US"/>
         </w:rPr>
       </w:pPr>
     </w:p>
@@ -1318,7 +1239,6 @@
           <w:rFonts w:ascii="Noto Serif SC" w:eastAsia="Noto Serif SC" w:hAnsi="Noto Serif SC"/>
           <w:sz w:val="24"/>
           <w:szCs w:val="24"/>
-          <w:lang w:val="en-US"/>
         </w:rPr>
       </w:pPr>
       <w:r>
@@ -1326,47 +1246,24 @@
           <w:rFonts w:ascii="Noto Serif SC" w:eastAsia="Noto Serif SC" w:hAnsi="Noto Serif SC"/>
           <w:sz w:val="24"/>
           <w:szCs w:val="24"/>
-          <w:lang w:val="en-US"/>
-        </w:rPr>
-        <w:t xml:space="preserve">Xie Xiangming was born in Zhangzhou, Fujian Province in 1974, of Hakka </w:t>
-      </w:r>
-      <w:proofErr w:type="spellStart"/>
+        </w:rPr>
+        <w:t>Xie Xiangming was born in Zhangzhou, Fujian Province in 1974, of Hakka Long</w:t>
+      </w:r>
       <w:r>
         <w:rPr>
           <w:rFonts w:ascii="Noto Serif SC" w:eastAsia="Noto Serif SC" w:hAnsi="Noto Serif SC"/>
           <w:sz w:val="24"/>
           <w:szCs w:val="24"/>
-          <w:lang w:val="en-US"/>
-        </w:rPr>
-        <w:t>Long</w:t>
+        </w:rPr>
+        <w:t>y</w:t>
       </w:r>
       <w:r>
         <w:rPr>
           <w:rFonts w:ascii="Noto Serif SC" w:eastAsia="Noto Serif SC" w:hAnsi="Noto Serif SC"/>
           <w:sz w:val="24"/>
           <w:szCs w:val="24"/>
-          <w:lang w:val="en-US"/>
-        </w:rPr>
-        <w:t>y</w:t>
-      </w:r>
-      <w:r>
-        <w:rPr>
-          <w:rFonts w:ascii="Noto Serif SC" w:eastAsia="Noto Serif SC" w:hAnsi="Noto Serif SC"/>
-          <w:sz w:val="24"/>
-          <w:szCs w:val="24"/>
-          <w:lang w:val="en-US"/>
-        </w:rPr>
-        <w:t>uan</w:t>
-      </w:r>
-      <w:proofErr w:type="spellEnd"/>
-      <w:r>
-        <w:rPr>
-          <w:rFonts w:ascii="Noto Serif SC" w:eastAsia="Noto Serif SC" w:hAnsi="Noto Serif SC"/>
-          <w:sz w:val="24"/>
-          <w:szCs w:val="24"/>
-          <w:lang w:val="en-US"/>
-        </w:rPr>
-        <w:t xml:space="preserve"> descent. He learnt to compose and to play the dulcimer, violin and piano from his father during his childhood, and was admitted to the Shanghai Conservatory of Music Composition and Conducting Department in 1991 to study composition under the tutelage of Professor Wang Jianzhong. He teaches in the Composition Department of Middle School Affiliated to Shanghai Conservatory of music and is actively engaged in various fields of composition. His works include symphonies, chamber music, choral music and musicals etc. His distinctive personal style is expressed through diverse genres such as modern, classical, pop, folk, religious and electronic music.</w:t>
+        </w:rPr>
+        <w:t>uan descent. He learnt to compose and to play the dulcimer, violin and piano from his father during his childhood, and was admitted to the Shanghai Conservatory of Music Composition and Conducting Department in 1991 to study composition under the tutelage of Professor Wang Jianzhong. He teaches in the Composition Department of Middle School Affiliated to Shanghai Conservatory of music and is actively engaged in various fields of composition. His works include symphonies, chamber music, choral music and musicals etc. His distinctive personal style is expressed through diverse genres such as modern, classical, pop, folk, religious and electronic music.</w:t>
       </w:r>
     </w:p>
     <w:p>
@@ -1381,10 +1278,8 @@
       <w:r>
         <w:rPr>
           <w:rFonts w:ascii="Noto Serif SC" w:eastAsia="Noto Serif SC" w:hAnsi="Noto Serif SC" w:hint="eastAsia"/>
-          <w:noProof/>
-          <w:sz w:val="24"/>
-          <w:szCs w:val="24"/>
-          <w:lang w:val="zh-CN"/>
+          <w:sz w:val="24"/>
+          <w:szCs w:val="24"/>
         </w:rPr>
         <w:drawing>
           <wp:anchor distT="0" distB="0" distL="114300" distR="114300" simplePos="0" relativeHeight="251659264" behindDoc="0" locked="0" layoutInCell="1" allowOverlap="1" wp14:anchorId="25D4653E" wp14:editId="7CC7DC96">
@@ -1478,7 +1373,6 @@
           <w:bCs/>
           <w:sz w:val="28"/>
           <w:szCs w:val="36"/>
-          <w:lang w:val="en-US"/>
         </w:rPr>
         <w:sectPr>
           <w:pgSz w:w="16840" w:h="23820"/>
@@ -1528,15 +1422,13 @@
         <w:jc w:val="both"/>
         <w:rPr>
           <w:rFonts w:ascii="Noto Serif SC" w:eastAsia="Noto Serif SC" w:hAnsi="Noto Serif SC" w:cs="Noto Serif"/>
-          <w:noProof/>
-          <w:sz w:val="24"/>
-          <w:szCs w:val="24"/>
-        </w:rPr>
-      </w:pPr>
-      <w:r>
-        <w:rPr>
-          <w:rFonts w:ascii="Noto Serif SC" w:eastAsia="Noto Serif SC" w:hAnsi="Noto Serif SC" w:cs="Noto Serif"/>
-          <w:noProof/>
+          <w:sz w:val="24"/>
+          <w:szCs w:val="24"/>
+        </w:rPr>
+      </w:pPr>
+      <w:r>
+        <w:rPr>
+          <w:rFonts w:ascii="Noto Serif SC" w:eastAsia="Noto Serif SC" w:hAnsi="Noto Serif SC" w:cs="Noto Serif"/>
           <w:sz w:val="24"/>
           <w:szCs w:val="24"/>
         </w:rPr>
@@ -1551,15 +1443,13 @@
         <w:jc w:val="both"/>
         <w:rPr>
           <w:rFonts w:ascii="Noto Serif SC" w:eastAsia="Noto Serif SC" w:hAnsi="Noto Serif SC" w:cs="Noto Serif"/>
-          <w:noProof/>
-          <w:sz w:val="24"/>
-          <w:szCs w:val="24"/>
-        </w:rPr>
-      </w:pPr>
-      <w:r>
-        <w:rPr>
-          <w:rFonts w:ascii="Noto Serif SC" w:eastAsia="Noto Serif SC" w:hAnsi="Noto Serif SC" w:cs="Noto Serif"/>
-          <w:noProof/>
+          <w:sz w:val="24"/>
+          <w:szCs w:val="24"/>
+        </w:rPr>
+      </w:pPr>
+      <w:r>
+        <w:rPr>
+          <w:rFonts w:ascii="Noto Serif SC" w:eastAsia="Noto Serif SC" w:hAnsi="Noto Serif SC" w:cs="Noto Serif"/>
           <w:sz w:val="24"/>
           <w:szCs w:val="24"/>
         </w:rPr>
@@ -1568,7 +1458,6 @@
       <w:r>
         <w:rPr>
           <w:rFonts w:ascii="Noto Serif SC" w:eastAsia="Noto Serif SC" w:hAnsi="Noto Serif SC" w:cs="Noto Serif" w:hint="eastAsia"/>
-          <w:noProof/>
           <w:sz w:val="24"/>
           <w:szCs w:val="24"/>
         </w:rPr>
@@ -1585,7 +1474,6 @@
           <w:rFonts w:ascii="Noto Serif SC" w:eastAsia="Noto Serif SC" w:hAnsi="Noto Serif SC" w:cs="Noto Serif"/>
           <w:sz w:val="24"/>
           <w:szCs w:val="24"/>
-          <w:lang w:val="en-GB"/>
         </w:rPr>
       </w:pPr>
     </w:p>
@@ -1596,7 +1484,6 @@
           <w:rFonts w:ascii="Noto Serif SC" w:eastAsia="Noto Serif SC" w:hAnsi="Noto Serif SC" w:cs="Noto Serif"/>
           <w:sz w:val="24"/>
           <w:szCs w:val="24"/>
-          <w:lang w:val="en-US"/>
         </w:rPr>
       </w:pPr>
     </w:p>
@@ -1664,7 +1551,47 @@
           <w:sz w:val="24"/>
           <w:szCs w:val="24"/>
         </w:rPr>
-        <w:t>s cultural atmosphere. The composition emphasises the vibrant, elegant and bustling city life and describes the charms of Nanyang. It depicts scenes of its rich and diverse sentiments, integrated with aspects of traditional Chinese culture. The composer adopts an array of composition techniques with a combination of elements from various influences, including the southern Chinese, western modern, classical and romantic music to reflect the diversity and inner spirit of Singapore.</w:t>
+        <w:t>s cultural atmosphere. The composition emphasises the vibrant, elegant and bustling city life and describes the charms of Nanyang. It depicts scenes of its rich and diverse sentiments, integrated with aspects of traditional Chinese culture. The composer adopts an array of composition techniques with a combination of elements from various influences, including the southern Chinese</w:t>
+      </w:r>
+      <w:r>
+        <w:rPr>
+          <w:rFonts w:ascii="Noto Serif SC" w:eastAsia="Noto Serif SC" w:hAnsi="Noto Serif SC" w:cs="Noto Serif"/>
+          <w:sz w:val="24"/>
+          <w:szCs w:val="24"/>
+        </w:rPr>
+        <w:t>,</w:t>
+      </w:r>
+      <w:r>
+        <w:rPr>
+          <w:rFonts w:ascii="Noto Serif SC" w:eastAsia="Noto Serif SC" w:hAnsi="Noto Serif SC" w:cs="Noto Serif"/>
+          <w:sz w:val="24"/>
+          <w:szCs w:val="24"/>
+        </w:rPr>
+        <w:t xml:space="preserve"> western modern</w:t>
+      </w:r>
+      <w:r>
+        <w:rPr>
+          <w:rFonts w:ascii="Noto Serif SC" w:eastAsia="Noto Serif SC" w:hAnsi="Noto Serif SC" w:cs="Noto Serif"/>
+          <w:sz w:val="24"/>
+          <w:szCs w:val="24"/>
+        </w:rPr>
+        <w:t>,</w:t>
+      </w:r>
+      <w:r>
+        <w:rPr>
+          <w:rFonts w:ascii="Noto Serif SC" w:eastAsia="Noto Serif SC" w:hAnsi="Noto Serif SC" w:cs="Noto Serif"/>
+          <w:sz w:val="24"/>
+          <w:szCs w:val="24"/>
+        </w:rPr>
+        <w:t xml:space="preserve"> classical and romantic music to reflect the diversity and inner spirit of Singapore.</w:t>
+      </w:r>
+      <w:r>
+        <w:rPr>
+          <w:rFonts w:ascii="Noto Serif SC" w:eastAsia="Noto Serif SC" w:hAnsi="Noto Serif SC" w:cs="Noto Serif"/>
+          <w:sz w:val="24"/>
+          <w:szCs w:val="24"/>
+        </w:rPr>
+        <w:t xml:space="preserve"> </w:t>
       </w:r>
     </w:p>
     <w:p>
@@ -1741,15 +1668,13 @@
           <w:rFonts w:ascii="Noto Serif SC" w:eastAsia="Noto Serif SC" w:hAnsi="Noto Serif SC" w:cs="Noto Serif"/>
           <w:sz w:val="24"/>
           <w:szCs w:val="24"/>
-          <w:lang w:val="en-GB"/>
-        </w:rPr>
-      </w:pPr>
-      <w:r>
-        <w:rPr>
-          <w:rFonts w:ascii="Noto Serif SC" w:eastAsia="Noto Serif SC" w:hAnsi="Noto Serif SC" w:cs="Noto Serif" w:hint="eastAsia"/>
-          <w:sz w:val="24"/>
-          <w:szCs w:val="24"/>
-          <w:lang w:val="en-GB"/>
+        </w:rPr>
+      </w:pPr>
+      <w:r>
+        <w:rPr>
+          <w:rFonts w:ascii="Noto Serif SC" w:eastAsia="Noto Serif SC" w:hAnsi="Noto Serif SC" w:cs="Noto Serif" w:hint="eastAsia"/>
+          <w:sz w:val="24"/>
+          <w:szCs w:val="24"/>
         </w:rPr>
         <w:t>梆笛</w:t>
       </w:r>
@@ -1758,7 +1683,6 @@
           <w:rFonts w:ascii="Noto Serif SC" w:eastAsia="Noto Serif SC" w:hAnsi="Noto Serif SC" w:cs="Noto Serif"/>
           <w:sz w:val="24"/>
           <w:szCs w:val="24"/>
-          <w:lang w:val="en-GB"/>
         </w:rPr>
         <w:t xml:space="preserve"> </w:t>
       </w:r>
@@ -1767,7 +1691,6 @@
           <w:rFonts w:ascii="Noto Serif SC" w:eastAsia="Noto Serif SC" w:hAnsi="Noto Serif SC" w:cs="Noto Serif"/>
           <w:sz w:val="24"/>
           <w:szCs w:val="24"/>
-          <w:lang w:val="en-GB"/>
         </w:rPr>
         <w:t xml:space="preserve">I, II </w:t>
       </w:r>
@@ -1776,7 +1699,6 @@
           <w:rFonts w:ascii="Noto Serif SC" w:eastAsia="Noto Serif SC" w:hAnsi="Noto Serif SC" w:cs="Noto Serif"/>
           <w:sz w:val="24"/>
           <w:szCs w:val="24"/>
-          <w:lang w:val="en-GB"/>
         </w:rPr>
         <w:t>Bangdi</w:t>
       </w:r>
@@ -1785,7 +1707,6 @@
           <w:rFonts w:ascii="Noto Serif SC" w:eastAsia="Noto Serif SC" w:hAnsi="Noto Serif SC" w:cs="Noto Serif"/>
           <w:sz w:val="24"/>
           <w:szCs w:val="24"/>
-          <w:lang w:val="en-GB"/>
         </w:rPr>
         <w:t xml:space="preserve"> I, II</w:t>
       </w:r>
@@ -1796,15 +1717,13 @@
           <w:rFonts w:ascii="Noto Serif SC" w:eastAsia="Noto Serif SC" w:hAnsi="Noto Serif SC" w:cs="Noto Serif"/>
           <w:sz w:val="24"/>
           <w:szCs w:val="24"/>
-          <w:lang w:val="en-US"/>
-        </w:rPr>
-      </w:pPr>
-      <w:r>
-        <w:rPr>
-          <w:rFonts w:ascii="Noto Serif SC" w:eastAsia="Noto Serif SC" w:hAnsi="Noto Serif SC" w:cs="Noto Serif" w:hint="eastAsia"/>
-          <w:sz w:val="24"/>
-          <w:szCs w:val="24"/>
-          <w:lang w:val="en-US"/>
+        </w:rPr>
+      </w:pPr>
+      <w:r>
+        <w:rPr>
+          <w:rFonts w:ascii="Noto Serif SC" w:eastAsia="Noto Serif SC" w:hAnsi="Noto Serif SC" w:cs="Noto Serif" w:hint="eastAsia"/>
+          <w:sz w:val="24"/>
+          <w:szCs w:val="24"/>
         </w:rPr>
         <w:t>曲笛</w:t>
       </w:r>
@@ -1813,7 +1732,73 @@
           <w:rFonts w:ascii="Noto Serif SC" w:eastAsia="Noto Serif SC" w:hAnsi="Noto Serif SC" w:cs="Noto Serif"/>
           <w:sz w:val="24"/>
           <w:szCs w:val="24"/>
-          <w:lang w:val="en-US"/>
+        </w:rPr>
+        <w:t xml:space="preserve"> Qudi</w:t>
+      </w:r>
+    </w:p>
+    <w:p>
+      <w:pPr>
+        <w:spacing w:after="120"/>
+        <w:rPr>
+          <w:rFonts w:ascii="Noto Serif SC" w:eastAsia="Noto Serif SC" w:hAnsi="Noto Serif SC" w:cs="Noto Serif"/>
+          <w:sz w:val="24"/>
+          <w:szCs w:val="24"/>
+        </w:rPr>
+      </w:pPr>
+      <w:r>
+        <w:rPr>
+          <w:rFonts w:ascii="Noto Serif SC" w:eastAsia="Noto Serif SC" w:hAnsi="Noto Serif SC" w:cs="Noto Serif" w:hint="eastAsia"/>
+          <w:sz w:val="24"/>
+          <w:szCs w:val="24"/>
+        </w:rPr>
+        <w:t>新笛</w:t>
+      </w:r>
+      <w:r>
+        <w:rPr>
+          <w:rFonts w:ascii="Noto Serif SC" w:eastAsia="Noto Serif SC" w:hAnsi="Noto Serif SC" w:cs="Noto Serif"/>
+          <w:sz w:val="24"/>
+          <w:szCs w:val="24"/>
+        </w:rPr>
+        <w:t xml:space="preserve"> I, II</w:t>
+      </w:r>
+      <w:r>
+        <w:rPr>
+          <w:rFonts w:ascii="Noto Serif SC" w:eastAsia="Noto Serif SC" w:hAnsi="Noto Serif SC" w:cs="Noto Serif"/>
+          <w:sz w:val="24"/>
+          <w:szCs w:val="24"/>
+        </w:rPr>
+        <w:t xml:space="preserve"> Xindi</w:t>
+      </w:r>
+      <w:r>
+        <w:rPr>
+          <w:rFonts w:ascii="Noto Serif SC" w:eastAsia="Noto Serif SC" w:hAnsi="Noto Serif SC" w:cs="Noto Serif"/>
+          <w:sz w:val="24"/>
+          <w:szCs w:val="24"/>
+        </w:rPr>
+        <w:t xml:space="preserve"> I, II</w:t>
+      </w:r>
+    </w:p>
+    <w:p>
+      <w:pPr>
+        <w:rPr>
+          <w:rFonts w:ascii="Noto Serif SC" w:eastAsia="Noto Serif SC" w:hAnsi="Noto Serif SC" w:cs="Noto Serif"/>
+          <w:sz w:val="24"/>
+          <w:szCs w:val="24"/>
+        </w:rPr>
+      </w:pPr>
+      <w:r>
+        <w:rPr>
+          <w:rFonts w:ascii="Noto Serif SC" w:eastAsia="Noto Serif SC" w:hAnsi="Noto Serif SC" w:cs="Noto Serif" w:hint="eastAsia"/>
+          <w:sz w:val="24"/>
+          <w:szCs w:val="24"/>
+        </w:rPr>
+        <w:t>高音笙</w:t>
+      </w:r>
+      <w:r>
+        <w:rPr>
+          <w:rFonts w:ascii="Noto Serif SC" w:eastAsia="Noto Serif SC" w:hAnsi="Noto Serif SC" w:cs="Noto Serif"/>
+          <w:sz w:val="24"/>
+          <w:szCs w:val="24"/>
         </w:rPr>
         <w:t xml:space="preserve"> </w:t>
       </w:r>
@@ -1822,9 +1807,49 @@
           <w:rFonts w:ascii="Noto Serif SC" w:eastAsia="Noto Serif SC" w:hAnsi="Noto Serif SC" w:cs="Noto Serif"/>
           <w:sz w:val="24"/>
           <w:szCs w:val="24"/>
-          <w:lang w:val="en-US"/>
-        </w:rPr>
-        <w:t>Qudi</w:t>
+        </w:rPr>
+        <w:t xml:space="preserve">I, II </w:t>
+      </w:r>
+      <w:r>
+        <w:rPr>
+          <w:rFonts w:ascii="Noto Serif SC" w:eastAsia="Noto Serif SC" w:hAnsi="Noto Serif SC" w:cs="Noto Serif"/>
+          <w:sz w:val="24"/>
+          <w:szCs w:val="24"/>
+        </w:rPr>
+        <w:t>Gaoyin Sheng</w:t>
+      </w:r>
+      <w:r>
+        <w:rPr>
+          <w:rFonts w:ascii="Noto Serif SC" w:eastAsia="Noto Serif SC" w:hAnsi="Noto Serif SC" w:cs="Noto Serif"/>
+          <w:sz w:val="24"/>
+          <w:szCs w:val="24"/>
+        </w:rPr>
+        <w:t xml:space="preserve"> I, II</w:t>
+      </w:r>
+    </w:p>
+    <w:p>
+      <w:pPr>
+        <w:rPr>
+          <w:rFonts w:ascii="Noto Serif SC" w:eastAsia="Noto Serif SC" w:hAnsi="Noto Serif SC" w:cs="Noto Serif"/>
+          <w:sz w:val="24"/>
+          <w:szCs w:val="24"/>
+        </w:rPr>
+      </w:pPr>
+      <w:r>
+        <w:rPr>
+          <w:rFonts w:ascii="Noto Serif SC" w:eastAsia="Noto Serif SC" w:hAnsi="Noto Serif SC" w:cs="Noto Serif" w:hint="eastAsia"/>
+          <w:sz w:val="24"/>
+          <w:szCs w:val="24"/>
+        </w:rPr>
+        <w:t>中音笙</w:t>
+      </w:r>
+      <w:r>
+        <w:rPr>
+          <w:rFonts w:ascii="Noto Serif SC" w:eastAsia="Noto Serif SC" w:hAnsi="Noto Serif SC" w:cs="Noto Serif"/>
+          <w:sz w:val="24"/>
+          <w:szCs w:val="24"/>
+        </w:rPr>
+        <w:t xml:space="preserve"> Zhongyin Sheng</w:t>
       </w:r>
     </w:p>
     <w:p>
@@ -1834,70 +1859,203 @@
           <w:rFonts w:ascii="Noto Serif SC" w:eastAsia="Noto Serif SC" w:hAnsi="Noto Serif SC" w:cs="Noto Serif"/>
           <w:sz w:val="24"/>
           <w:szCs w:val="24"/>
-          <w:lang w:val="en-GB"/>
-        </w:rPr>
-      </w:pPr>
-      <w:r>
-        <w:rPr>
-          <w:rFonts w:ascii="Noto Serif SC" w:eastAsia="Noto Serif SC" w:hAnsi="Noto Serif SC" w:cs="Noto Serif" w:hint="eastAsia"/>
-          <w:sz w:val="24"/>
-          <w:szCs w:val="24"/>
-          <w:lang w:val="en-GB"/>
-        </w:rPr>
-        <w:t>新笛</w:t>
-      </w:r>
-      <w:r>
-        <w:rPr>
-          <w:rFonts w:ascii="Noto Serif SC" w:eastAsia="Noto Serif SC" w:hAnsi="Noto Serif SC" w:cs="Noto Serif"/>
-          <w:sz w:val="24"/>
-          <w:szCs w:val="24"/>
-          <w:lang w:val="en-GB"/>
+        </w:rPr>
+      </w:pPr>
+      <w:r>
+        <w:rPr>
+          <w:rFonts w:ascii="Noto Serif SC" w:eastAsia="Noto Serif SC" w:hAnsi="Noto Serif SC" w:cs="Noto Serif" w:hint="eastAsia"/>
+          <w:sz w:val="24"/>
+          <w:szCs w:val="24"/>
+        </w:rPr>
+        <w:t>低音笙</w:t>
+      </w:r>
+      <w:r>
+        <w:rPr>
+          <w:rFonts w:ascii="Noto Serif SC" w:eastAsia="Noto Serif SC" w:hAnsi="Noto Serif SC" w:cs="Noto Serif"/>
+          <w:sz w:val="24"/>
+          <w:szCs w:val="24"/>
+        </w:rPr>
+        <w:t xml:space="preserve"> Diyin Sheng</w:t>
+      </w:r>
+    </w:p>
+    <w:p>
+      <w:pPr>
+        <w:rPr>
+          <w:rFonts w:ascii="Noto Serif SC" w:eastAsia="Noto Serif SC" w:hAnsi="Noto Serif SC" w:cs="Noto Serif"/>
+          <w:sz w:val="24"/>
+          <w:szCs w:val="24"/>
+        </w:rPr>
+      </w:pPr>
+      <w:r>
+        <w:rPr>
+          <w:rFonts w:ascii="Noto Serif SC" w:eastAsia="Noto Serif SC" w:hAnsi="Noto Serif SC" w:cs="Noto Serif"/>
+          <w:sz w:val="24"/>
+          <w:szCs w:val="24"/>
+        </w:rPr>
+        <w:t>加键高音唢呐</w:t>
+      </w:r>
+      <w:r>
+        <w:rPr>
+          <w:rFonts w:ascii="Noto Serif SC" w:eastAsia="Noto Serif SC" w:hAnsi="Noto Serif SC" w:cs="Noto Serif"/>
+          <w:sz w:val="24"/>
+          <w:szCs w:val="24"/>
+        </w:rPr>
+        <w:t xml:space="preserve">I, II </w:t>
+      </w:r>
+      <w:r>
+        <w:rPr>
+          <w:rFonts w:ascii="Noto Serif SC" w:eastAsia="Noto Serif SC" w:hAnsi="Noto Serif SC" w:cs="Noto Serif"/>
+          <w:sz w:val="24"/>
+          <w:szCs w:val="24"/>
+        </w:rPr>
+        <w:t xml:space="preserve">Keyed </w:t>
+      </w:r>
+      <w:r>
+        <w:rPr>
+          <w:rFonts w:ascii="Noto Serif SC" w:eastAsia="Noto Serif SC" w:hAnsi="Noto Serif SC" w:cs="Noto Serif"/>
+          <w:sz w:val="24"/>
+          <w:szCs w:val="24"/>
+        </w:rPr>
+        <w:t>Gaoyin Suona</w:t>
+      </w:r>
+      <w:r>
+        <w:rPr>
+          <w:rFonts w:ascii="Noto Serif SC" w:eastAsia="Noto Serif SC" w:hAnsi="Noto Serif SC" w:cs="Noto Serif"/>
+          <w:sz w:val="24"/>
+          <w:szCs w:val="24"/>
         </w:rPr>
         <w:t xml:space="preserve"> I, II</w:t>
       </w:r>
-      <w:r>
-        <w:rPr>
-          <w:rFonts w:ascii="Noto Serif SC" w:eastAsia="Noto Serif SC" w:hAnsi="Noto Serif SC" w:cs="Noto Serif"/>
-          <w:sz w:val="24"/>
-          <w:szCs w:val="24"/>
-          <w:lang w:val="en-GB"/>
-        </w:rPr>
-        <w:t xml:space="preserve"> Xindi</w:t>
-      </w:r>
-      <w:r>
-        <w:rPr>
-          <w:rFonts w:ascii="Noto Serif SC" w:eastAsia="Noto Serif SC" w:hAnsi="Noto Serif SC" w:cs="Noto Serif"/>
-          <w:sz w:val="24"/>
-          <w:szCs w:val="24"/>
-          <w:lang w:val="en-GB"/>
-        </w:rPr>
-        <w:t xml:space="preserve"> I, II</w:t>
-      </w:r>
-    </w:p>
-    <w:p>
-      <w:pPr>
-        <w:rPr>
-          <w:rFonts w:ascii="Noto Serif SC" w:eastAsia="Noto Serif SC" w:hAnsi="Noto Serif SC" w:cs="Noto Serif"/>
-          <w:sz w:val="24"/>
-          <w:szCs w:val="24"/>
-          <w:lang w:val="en-GB"/>
-        </w:rPr>
-      </w:pPr>
-      <w:r>
-        <w:rPr>
-          <w:rFonts w:ascii="Noto Serif SC" w:eastAsia="Noto Serif SC" w:hAnsi="Noto Serif SC" w:cs="Noto Serif" w:hint="eastAsia"/>
-          <w:sz w:val="24"/>
-          <w:szCs w:val="24"/>
-          <w:lang w:val="en-GB"/>
-        </w:rPr>
-        <w:t>高音笙</w:t>
-      </w:r>
-      <w:r>
-        <w:rPr>
-          <w:rFonts w:ascii="Noto Serif SC" w:eastAsia="Noto Serif SC" w:hAnsi="Noto Serif SC" w:cs="Noto Serif"/>
-          <w:sz w:val="24"/>
-          <w:szCs w:val="24"/>
-          <w:lang w:val="en-GB"/>
+    </w:p>
+    <w:p>
+      <w:pPr>
+        <w:rPr>
+          <w:rFonts w:ascii="Noto Serif SC" w:eastAsia="Noto Serif SC" w:hAnsi="Noto Serif SC" w:cs="Noto Serif"/>
+          <w:sz w:val="24"/>
+          <w:szCs w:val="24"/>
+        </w:rPr>
+      </w:pPr>
+      <w:r>
+        <w:rPr>
+          <w:rFonts w:ascii="Noto Serif SC" w:eastAsia="Noto Serif SC" w:hAnsi="Noto Serif SC" w:cs="Noto Serif" w:hint="eastAsia"/>
+          <w:sz w:val="24"/>
+          <w:szCs w:val="24"/>
+        </w:rPr>
+        <w:t>中音唢吶</w:t>
+      </w:r>
+      <w:r>
+        <w:rPr>
+          <w:rFonts w:ascii="Noto Serif SC" w:eastAsia="Noto Serif SC" w:hAnsi="Noto Serif SC" w:cs="Noto Serif"/>
+          <w:sz w:val="24"/>
+          <w:szCs w:val="24"/>
+        </w:rPr>
+        <w:t xml:space="preserve"> Zhongyin Suona</w:t>
+      </w:r>
+    </w:p>
+    <w:p>
+      <w:pPr>
+        <w:rPr>
+          <w:rFonts w:ascii="Noto Serif SC" w:eastAsia="Noto Serif SC" w:hAnsi="Noto Serif SC" w:cs="Noto Serif"/>
+          <w:sz w:val="24"/>
+          <w:szCs w:val="24"/>
+        </w:rPr>
+      </w:pPr>
+      <w:r>
+        <w:rPr>
+          <w:rFonts w:ascii="Noto Serif SC" w:eastAsia="Noto Serif SC" w:hAnsi="Noto Serif SC" w:cs="Noto Serif" w:hint="eastAsia"/>
+          <w:sz w:val="24"/>
+          <w:szCs w:val="24"/>
+        </w:rPr>
+        <w:t>次中</w:t>
+      </w:r>
+      <w:r>
+        <w:rPr>
+          <w:rFonts w:ascii="Noto Serif SC" w:eastAsia="Noto Serif SC" w:hAnsi="Noto Serif SC" w:cs="Noto Serif" w:hint="eastAsia"/>
+          <w:sz w:val="24"/>
+          <w:szCs w:val="24"/>
+        </w:rPr>
+        <w:t>音</w:t>
+      </w:r>
+      <w:r>
+        <w:rPr>
+          <w:rFonts w:ascii="Noto Serif SC" w:eastAsia="Noto Serif SC" w:hAnsi="Noto Serif SC" w:cs="Noto Serif" w:hint="eastAsia"/>
+          <w:sz w:val="24"/>
+          <w:szCs w:val="24"/>
+        </w:rPr>
+        <w:t>唢吶</w:t>
+      </w:r>
+      <w:r>
+        <w:rPr>
+          <w:rFonts w:ascii="Noto Serif SC" w:eastAsia="Noto Serif SC" w:hAnsi="Noto Serif SC" w:cs="Noto Serif"/>
+          <w:sz w:val="24"/>
+          <w:szCs w:val="24"/>
+        </w:rPr>
+        <w:t xml:space="preserve"> Cizhongyin Suona</w:t>
+      </w:r>
+    </w:p>
+    <w:p>
+      <w:pPr>
+        <w:rPr>
+          <w:rFonts w:ascii="Noto Serif SC" w:eastAsia="Noto Serif SC" w:hAnsi="Noto Serif SC" w:cs="Noto Serif"/>
+          <w:sz w:val="24"/>
+          <w:szCs w:val="24"/>
+        </w:rPr>
+      </w:pPr>
+      <w:r>
+        <w:rPr>
+          <w:rFonts w:ascii="Noto Serif SC" w:eastAsia="Noto Serif SC" w:hAnsi="Noto Serif SC" w:cs="Noto Serif" w:hint="eastAsia"/>
+          <w:sz w:val="24"/>
+          <w:szCs w:val="24"/>
+        </w:rPr>
+        <w:t>低音唢吶</w:t>
+      </w:r>
+      <w:r>
+        <w:rPr>
+          <w:rFonts w:ascii="Noto Serif SC" w:eastAsia="Noto Serif SC" w:hAnsi="Noto Serif SC" w:cs="Noto Serif"/>
+          <w:sz w:val="24"/>
+          <w:szCs w:val="24"/>
+        </w:rPr>
+        <w:t xml:space="preserve"> Diyin Suona</w:t>
+      </w:r>
+    </w:p>
+    <w:p>
+      <w:pPr>
+        <w:rPr>
+          <w:rFonts w:ascii="Noto Serif SC" w:eastAsia="Noto Serif SC" w:hAnsi="Noto Serif SC" w:cs="Noto Serif"/>
+          <w:sz w:val="24"/>
+          <w:szCs w:val="24"/>
+        </w:rPr>
+      </w:pPr>
+    </w:p>
+    <w:p>
+      <w:pPr>
+        <w:rPr>
+          <w:rFonts w:ascii="Noto Serif SC" w:eastAsia="Noto Serif SC" w:hAnsi="Noto Serif SC" w:cs="Noto Serif"/>
+          <w:sz w:val="24"/>
+          <w:szCs w:val="24"/>
+        </w:rPr>
+      </w:pPr>
+      <w:r>
+        <w:rPr>
+          <w:rFonts w:ascii="Noto Serif SC" w:eastAsia="Noto Serif SC" w:hAnsi="Noto Serif SC" w:cs="Noto Serif" w:hint="eastAsia"/>
+          <w:sz w:val="24"/>
+          <w:szCs w:val="24"/>
+        </w:rPr>
+        <w:t>扬琴</w:t>
+      </w:r>
+      <w:r>
+        <w:rPr>
+          <w:rFonts w:ascii="Noto Serif SC" w:eastAsia="Noto Serif SC" w:hAnsi="Noto Serif SC" w:cs="Noto Serif"/>
+          <w:sz w:val="24"/>
+          <w:szCs w:val="24"/>
+        </w:rPr>
+        <w:t xml:space="preserve"> Yangqin</w:t>
+      </w:r>
+      <w:r>
+        <w:rPr>
+          <w:rFonts w:ascii="Noto Serif SC" w:eastAsia="Noto Serif SC" w:hAnsi="Noto Serif SC" w:cs="Noto Serif"/>
+          <w:sz w:val="24"/>
+          <w:szCs w:val="24"/>
         </w:rPr>
         <w:t xml:space="preserve"> </w:t>
       </w:r>
@@ -1906,145 +2064,47 @@
           <w:rFonts w:ascii="Noto Serif SC" w:eastAsia="Noto Serif SC" w:hAnsi="Noto Serif SC" w:cs="Noto Serif"/>
           <w:sz w:val="24"/>
           <w:szCs w:val="24"/>
-          <w:lang w:val="en-GB"/>
-        </w:rPr>
-        <w:t xml:space="preserve">I, II </w:t>
-      </w:r>
-      <w:r>
-        <w:rPr>
-          <w:rFonts w:ascii="Noto Serif SC" w:eastAsia="Noto Serif SC" w:hAnsi="Noto Serif SC" w:cs="Noto Serif"/>
-          <w:sz w:val="24"/>
-          <w:szCs w:val="24"/>
-          <w:lang w:val="en-GB"/>
-        </w:rPr>
-        <w:t xml:space="preserve">Gaoyin </w:t>
-      </w:r>
-      <w:r>
-        <w:rPr>
-          <w:rFonts w:ascii="Noto Serif SC" w:eastAsia="Noto Serif SC" w:hAnsi="Noto Serif SC" w:cs="Noto Serif"/>
-          <w:sz w:val="24"/>
-          <w:szCs w:val="24"/>
-          <w:lang w:val="en-GB"/>
-        </w:rPr>
-        <w:t>Sheng</w:t>
-      </w:r>
-      <w:r>
-        <w:rPr>
-          <w:rFonts w:ascii="Noto Serif SC" w:eastAsia="Noto Serif SC" w:hAnsi="Noto Serif SC" w:cs="Noto Serif"/>
-          <w:sz w:val="24"/>
-          <w:szCs w:val="24"/>
-          <w:lang w:val="en-GB"/>
-        </w:rPr>
-        <w:t xml:space="preserve"> I, II</w:t>
-      </w:r>
-    </w:p>
-    <w:p>
-      <w:pPr>
-        <w:rPr>
-          <w:rFonts w:ascii="Noto Serif SC" w:eastAsia="Noto Serif SC" w:hAnsi="Noto Serif SC" w:cs="Noto Serif"/>
-          <w:sz w:val="24"/>
-          <w:szCs w:val="24"/>
-          <w:lang w:val="en-GB"/>
-        </w:rPr>
-      </w:pPr>
-      <w:r>
-        <w:rPr>
-          <w:rFonts w:ascii="Noto Serif SC" w:eastAsia="Noto Serif SC" w:hAnsi="Noto Serif SC" w:cs="Noto Serif" w:hint="eastAsia"/>
-          <w:sz w:val="24"/>
-          <w:szCs w:val="24"/>
-          <w:lang w:val="en-GB"/>
-        </w:rPr>
-        <w:t>中音笙</w:t>
-      </w:r>
-      <w:r>
-        <w:rPr>
-          <w:rFonts w:ascii="Noto Serif SC" w:eastAsia="Noto Serif SC" w:hAnsi="Noto Serif SC" w:cs="Noto Serif"/>
-          <w:sz w:val="24"/>
-          <w:szCs w:val="24"/>
-          <w:lang w:val="en-GB"/>
-        </w:rPr>
-        <w:t xml:space="preserve"> Zhongyin Sheng</w:t>
-      </w:r>
-    </w:p>
-    <w:p>
-      <w:pPr>
-        <w:spacing w:after="120"/>
-        <w:rPr>
-          <w:rFonts w:ascii="Noto Serif SC" w:eastAsia="Noto Serif SC" w:hAnsi="Noto Serif SC" w:cs="Noto Serif"/>
-          <w:sz w:val="24"/>
-          <w:szCs w:val="24"/>
-          <w:lang w:val="en-GB"/>
-        </w:rPr>
-      </w:pPr>
-      <w:r>
-        <w:rPr>
-          <w:rFonts w:ascii="Noto Serif SC" w:eastAsia="Noto Serif SC" w:hAnsi="Noto Serif SC" w:cs="Noto Serif" w:hint="eastAsia"/>
-          <w:sz w:val="24"/>
-          <w:szCs w:val="24"/>
-          <w:lang w:val="en-GB"/>
-        </w:rPr>
-        <w:t>低音笙</w:t>
-      </w:r>
-      <w:r>
-        <w:rPr>
-          <w:rFonts w:ascii="Noto Serif SC" w:eastAsia="Noto Serif SC" w:hAnsi="Noto Serif SC" w:cs="Noto Serif"/>
-          <w:sz w:val="24"/>
-          <w:szCs w:val="24"/>
-          <w:lang w:val="en-GB"/>
-        </w:rPr>
-        <w:t xml:space="preserve"> Diyin Sheng</w:t>
-      </w:r>
-    </w:p>
-    <w:p>
-      <w:pPr>
-        <w:rPr>
-          <w:rFonts w:ascii="Noto Serif SC" w:eastAsia="Noto Serif SC" w:hAnsi="Noto Serif SC" w:cs="Noto Serif"/>
-          <w:sz w:val="24"/>
-          <w:szCs w:val="24"/>
-          <w:lang w:val="en-GB"/>
-        </w:rPr>
-      </w:pPr>
-      <w:r>
-        <w:rPr>
-          <w:rFonts w:ascii="Noto Serif SC" w:eastAsia="Noto Serif SC" w:hAnsi="Noto Serif SC" w:cs="Noto Serif"/>
-          <w:sz w:val="24"/>
-          <w:szCs w:val="24"/>
-        </w:rPr>
-        <w:t>加键高音唢呐</w:t>
-      </w:r>
-      <w:r>
-        <w:rPr>
-          <w:rFonts w:ascii="Noto Serif SC" w:eastAsia="Noto Serif SC" w:hAnsi="Noto Serif SC" w:cs="Noto Serif"/>
-          <w:sz w:val="24"/>
-          <w:szCs w:val="24"/>
-          <w:lang w:val="en-GB"/>
-        </w:rPr>
-        <w:t xml:space="preserve">I, II </w:t>
-      </w:r>
-      <w:r>
-        <w:rPr>
-          <w:rFonts w:ascii="Noto Serif SC" w:eastAsia="Noto Serif SC" w:hAnsi="Noto Serif SC" w:cs="Noto Serif"/>
-          <w:sz w:val="24"/>
-          <w:szCs w:val="24"/>
-          <w:lang w:val="en-GB"/>
-        </w:rPr>
-        <w:t xml:space="preserve">Keyed </w:t>
-      </w:r>
-      <w:r>
-        <w:rPr>
-          <w:rFonts w:ascii="Noto Serif SC" w:eastAsia="Noto Serif SC" w:hAnsi="Noto Serif SC" w:cs="Noto Serif"/>
-          <w:sz w:val="24"/>
-          <w:szCs w:val="24"/>
-          <w:lang w:val="en-GB"/>
-        </w:rPr>
-        <w:t>Gaoyin Suona</w:t>
-      </w:r>
-      <w:r>
-        <w:rPr>
-          <w:rFonts w:ascii="Noto Serif SC" w:eastAsia="Noto Serif SC" w:hAnsi="Noto Serif SC" w:cs="Noto Serif"/>
-          <w:sz w:val="24"/>
-          <w:szCs w:val="24"/>
-          <w:lang w:val="en-GB"/>
+        </w:rPr>
+        <w:t>(2)</w:t>
+      </w:r>
+      <w:r>
+        <w:rPr>
+          <w:rFonts w:ascii="Noto Serif SC" w:eastAsia="Noto Serif SC" w:hAnsi="Noto Serif SC" w:cs="Noto Serif"/>
+          <w:sz w:val="24"/>
+          <w:szCs w:val="24"/>
+        </w:rPr>
+        <w:t>*</w:t>
+      </w:r>
+    </w:p>
+    <w:p>
+      <w:pPr>
+        <w:rPr>
+          <w:rFonts w:ascii="Noto Serif SC" w:eastAsia="Noto Serif SC" w:hAnsi="Noto Serif SC" w:cs="Noto Serif"/>
+          <w:sz w:val="24"/>
+          <w:szCs w:val="24"/>
+        </w:rPr>
+      </w:pPr>
+      <w:r>
+        <w:rPr>
+          <w:rFonts w:ascii="Noto Serif SC" w:eastAsia="Noto Serif SC" w:hAnsi="Noto Serif SC" w:cs="Noto Serif" w:hint="eastAsia"/>
+          <w:sz w:val="24"/>
+          <w:szCs w:val="24"/>
+        </w:rPr>
+        <w:t>柳琴</w:t>
+      </w:r>
+      <w:r>
+        <w:rPr>
+          <w:rFonts w:ascii="Noto Serif SC" w:eastAsia="Noto Serif SC" w:hAnsi="Noto Serif SC" w:cs="Noto Serif"/>
+          <w:sz w:val="24"/>
+          <w:szCs w:val="24"/>
+        </w:rPr>
+        <w:t>Liuqin</w:t>
+      </w:r>
+      <w:r>
+        <w:rPr>
+          <w:rFonts w:ascii="Noto Serif SC" w:eastAsia="Noto Serif SC" w:hAnsi="Noto Serif SC" w:cs="Noto Serif"/>
+          <w:sz w:val="24"/>
+          <w:szCs w:val="24"/>
         </w:rPr>
         <w:t xml:space="preserve"> </w:t>
       </w:r>
@@ -2053,81 +2113,39 @@
           <w:rFonts w:ascii="Noto Serif SC" w:eastAsia="Noto Serif SC" w:hAnsi="Noto Serif SC" w:cs="Noto Serif"/>
           <w:sz w:val="24"/>
           <w:szCs w:val="24"/>
-          <w:lang w:val="en-GB"/>
-        </w:rPr>
-        <w:t>I, II</w:t>
-      </w:r>
-    </w:p>
-    <w:p>
-      <w:pPr>
-        <w:rPr>
-          <w:rFonts w:ascii="Noto Serif SC" w:eastAsia="Noto Serif SC" w:hAnsi="Noto Serif SC" w:cs="Noto Serif"/>
-          <w:sz w:val="24"/>
-          <w:szCs w:val="24"/>
-          <w:lang w:val="en-US"/>
-        </w:rPr>
-      </w:pPr>
-      <w:r>
-        <w:rPr>
-          <w:rFonts w:ascii="Noto Serif SC" w:eastAsia="Noto Serif SC" w:hAnsi="Noto Serif SC" w:cs="Noto Serif" w:hint="eastAsia"/>
-          <w:sz w:val="24"/>
-          <w:szCs w:val="24"/>
-          <w:lang w:val="en-US"/>
-        </w:rPr>
-        <w:t>中音唢吶</w:t>
-      </w:r>
-      <w:r>
-        <w:rPr>
-          <w:rFonts w:ascii="Noto Serif SC" w:eastAsia="Noto Serif SC" w:hAnsi="Noto Serif SC" w:cs="Noto Serif"/>
-          <w:sz w:val="24"/>
-          <w:szCs w:val="24"/>
-          <w:lang w:val="en-US"/>
-        </w:rPr>
-        <w:t xml:space="preserve"> Zhongyin Suona</w:t>
-      </w:r>
-    </w:p>
-    <w:p>
-      <w:pPr>
-        <w:rPr>
-          <w:rFonts w:ascii="Noto Serif SC" w:eastAsia="Noto Serif SC" w:hAnsi="Noto Serif SC" w:cs="Noto Serif"/>
-          <w:sz w:val="24"/>
-          <w:szCs w:val="24"/>
-          <w:lang w:val="en-US"/>
-        </w:rPr>
-      </w:pPr>
-      <w:r>
-        <w:rPr>
-          <w:rFonts w:ascii="Noto Serif SC" w:eastAsia="Noto Serif SC" w:hAnsi="Noto Serif SC" w:cs="Noto Serif" w:hint="eastAsia"/>
-          <w:sz w:val="24"/>
-          <w:szCs w:val="24"/>
-          <w:lang w:val="en-US"/>
-        </w:rPr>
-        <w:t>次中</w:t>
-      </w:r>
-      <w:r>
-        <w:rPr>
-          <w:rFonts w:ascii="Noto Serif SC" w:eastAsia="Noto Serif SC" w:hAnsi="Noto Serif SC" w:cs="Noto Serif" w:hint="eastAsia"/>
-          <w:sz w:val="24"/>
-          <w:szCs w:val="24"/>
-          <w:lang w:val="en-GB"/>
-        </w:rPr>
-        <w:t>音</w:t>
-      </w:r>
-      <w:r>
-        <w:rPr>
-          <w:rFonts w:ascii="Noto Serif SC" w:eastAsia="Noto Serif SC" w:hAnsi="Noto Serif SC" w:cs="Noto Serif" w:hint="eastAsia"/>
-          <w:sz w:val="24"/>
-          <w:szCs w:val="24"/>
-          <w:lang w:val="en-US"/>
-        </w:rPr>
-        <w:t>唢吶</w:t>
-      </w:r>
-      <w:r>
-        <w:rPr>
-          <w:rFonts w:ascii="Noto Serif SC" w:eastAsia="Noto Serif SC" w:hAnsi="Noto Serif SC" w:cs="Noto Serif"/>
-          <w:sz w:val="24"/>
-          <w:szCs w:val="24"/>
-          <w:lang w:val="en-US"/>
+        </w:rPr>
+        <w:t>(2)</w:t>
+      </w:r>
+    </w:p>
+    <w:p>
+      <w:pPr>
+        <w:rPr>
+          <w:rFonts w:ascii="Noto Serif SC" w:eastAsia="Noto Serif SC" w:hAnsi="Noto Serif SC" w:cs="Noto Serif"/>
+          <w:sz w:val="24"/>
+          <w:szCs w:val="24"/>
+        </w:rPr>
+      </w:pPr>
+      <w:r>
+        <w:rPr>
+          <w:rFonts w:ascii="Noto Serif SC" w:eastAsia="Noto Serif SC" w:hAnsi="Noto Serif SC" w:cs="Noto Serif" w:hint="eastAsia"/>
+          <w:sz w:val="24"/>
+          <w:szCs w:val="24"/>
+        </w:rPr>
+        <w:t>琵琶</w:t>
+      </w:r>
+      <w:r>
+        <w:rPr>
+          <w:rFonts w:ascii="Noto Serif SC" w:eastAsia="Noto Serif SC" w:hAnsi="Noto Serif SC" w:cs="Noto Serif"/>
+          <w:sz w:val="24"/>
+          <w:szCs w:val="24"/>
+        </w:rPr>
+        <w:t>Pipa</w:t>
+      </w:r>
+      <w:r>
+        <w:rPr>
+          <w:rFonts w:ascii="Noto Serif SC" w:eastAsia="Noto Serif SC" w:hAnsi="Noto Serif SC" w:cs="Noto Serif"/>
+          <w:sz w:val="24"/>
+          <w:szCs w:val="24"/>
         </w:rPr>
         <w:t xml:space="preserve"> </w:t>
       </w:r>
@@ -2137,87 +2155,38 @@
           <w:sz w:val="24"/>
           <w:szCs w:val="24"/>
         </w:rPr>
-        <w:t xml:space="preserve">Cizhongyin </w:t>
-      </w:r>
-      <w:r>
-        <w:rPr>
-          <w:rFonts w:ascii="Noto Serif SC" w:eastAsia="Noto Serif SC" w:hAnsi="Noto Serif SC" w:cs="Noto Serif"/>
-          <w:sz w:val="24"/>
-          <w:szCs w:val="24"/>
-          <w:lang w:val="en-US"/>
-        </w:rPr>
-        <w:t>Suona</w:t>
-      </w:r>
-    </w:p>
-    <w:p>
-      <w:pPr>
-        <w:rPr>
-          <w:rFonts w:ascii="Noto Serif SC" w:eastAsia="Noto Serif SC" w:hAnsi="Noto Serif SC" w:cs="Noto Serif"/>
-          <w:sz w:val="24"/>
-          <w:szCs w:val="24"/>
-          <w:lang w:val="en-US"/>
-        </w:rPr>
-      </w:pPr>
-      <w:r>
-        <w:rPr>
-          <w:rFonts w:ascii="Noto Serif SC" w:eastAsia="Noto Serif SC" w:hAnsi="Noto Serif SC" w:cs="Noto Serif" w:hint="eastAsia"/>
-          <w:sz w:val="24"/>
-          <w:szCs w:val="24"/>
-        </w:rPr>
-        <w:t>低音唢吶</w:t>
-      </w:r>
-      <w:r>
-        <w:rPr>
-          <w:rFonts w:ascii="Noto Serif SC" w:eastAsia="Noto Serif SC" w:hAnsi="Noto Serif SC" w:cs="Noto Serif"/>
-          <w:sz w:val="24"/>
-          <w:szCs w:val="24"/>
-        </w:rPr>
-        <w:t xml:space="preserve"> Diyin Suona</w:t>
-      </w:r>
-    </w:p>
-    <w:p>
-      <w:pPr>
-        <w:rPr>
-          <w:rFonts w:ascii="Noto Serif SC" w:eastAsia="Noto Serif SC" w:hAnsi="Noto Serif SC" w:cs="Noto Serif"/>
-          <w:sz w:val="24"/>
-          <w:szCs w:val="24"/>
-          <w:lang w:val="en-US"/>
-        </w:rPr>
-      </w:pPr>
-    </w:p>
-    <w:p>
-      <w:pPr>
-        <w:rPr>
-          <w:rFonts w:ascii="Noto Serif SC" w:eastAsia="Noto Serif SC" w:hAnsi="Noto Serif SC" w:cs="Noto Serif"/>
-          <w:sz w:val="24"/>
-          <w:szCs w:val="24"/>
-          <w:lang w:val="en-US"/>
-        </w:rPr>
-      </w:pPr>
-      <w:r>
-        <w:rPr>
-          <w:rFonts w:ascii="Noto Serif SC" w:eastAsia="Noto Serif SC" w:hAnsi="Noto Serif SC" w:cs="Noto Serif" w:hint="eastAsia"/>
-          <w:sz w:val="24"/>
-          <w:szCs w:val="24"/>
-          <w:lang w:val="en-US"/>
-        </w:rPr>
-        <w:t>扬琴</w:t>
-      </w:r>
-      <w:r>
-        <w:rPr>
-          <w:rFonts w:ascii="Noto Serif SC" w:eastAsia="Noto Serif SC" w:hAnsi="Noto Serif SC" w:cs="Noto Serif"/>
-          <w:sz w:val="24"/>
-          <w:szCs w:val="24"/>
-          <w:lang w:val="en-US"/>
-        </w:rPr>
-        <w:t xml:space="preserve"> Yangqin</w:t>
-      </w:r>
-      <w:r>
-        <w:rPr>
-          <w:rFonts w:ascii="Noto Serif SC" w:eastAsia="Noto Serif SC" w:hAnsi="Noto Serif SC" w:cs="Noto Serif"/>
-          <w:sz w:val="24"/>
-          <w:szCs w:val="24"/>
-          <w:lang w:val="en-US"/>
+        <w:t>(4)</w:t>
+      </w:r>
+    </w:p>
+    <w:p>
+      <w:pPr>
+        <w:rPr>
+          <w:rFonts w:ascii="Noto Serif SC" w:eastAsia="Noto Serif SC" w:hAnsi="Noto Serif SC" w:cs="Noto Serif"/>
+          <w:sz w:val="24"/>
+          <w:szCs w:val="24"/>
+        </w:rPr>
+      </w:pPr>
+      <w:r>
+        <w:rPr>
+          <w:rFonts w:ascii="Noto Serif SC" w:eastAsia="Noto Serif SC" w:hAnsi="Noto Serif SC" w:cs="Noto Serif" w:hint="eastAsia"/>
+          <w:sz w:val="24"/>
+          <w:szCs w:val="24"/>
+        </w:rPr>
+        <w:t>中阮</w:t>
+      </w:r>
+      <w:r>
+        <w:rPr>
+          <w:rFonts w:ascii="Noto Serif SC" w:eastAsia="Noto Serif SC" w:hAnsi="Noto Serif SC" w:cs="Noto Serif"/>
+          <w:sz w:val="24"/>
+          <w:szCs w:val="24"/>
+        </w:rPr>
+        <w:t>Zhongruan</w:t>
+      </w:r>
+      <w:r>
+        <w:rPr>
+          <w:rFonts w:ascii="Noto Serif SC" w:eastAsia="Noto Serif SC" w:hAnsi="Noto Serif SC" w:cs="Noto Serif"/>
+          <w:sz w:val="24"/>
+          <w:szCs w:val="24"/>
         </w:rPr>
         <w:t xml:space="preserve"> </w:t>
       </w:r>
@@ -2226,986 +2195,696 @@
           <w:rFonts w:ascii="Noto Serif SC" w:eastAsia="Noto Serif SC" w:hAnsi="Noto Serif SC" w:cs="Noto Serif"/>
           <w:sz w:val="24"/>
           <w:szCs w:val="24"/>
-          <w:lang w:val="en-US"/>
+        </w:rPr>
+        <w:t>(4)</w:t>
+      </w:r>
+    </w:p>
+    <w:p>
+      <w:pPr>
+        <w:rPr>
+          <w:rFonts w:ascii="Noto Serif SC" w:eastAsia="Noto Serif SC" w:hAnsi="Noto Serif SC" w:cs="Noto Serif"/>
+          <w:sz w:val="24"/>
+          <w:szCs w:val="24"/>
+        </w:rPr>
+      </w:pPr>
+      <w:r>
+        <w:rPr>
+          <w:rFonts w:ascii="Noto Serif SC" w:eastAsia="Noto Serif SC" w:hAnsi="Noto Serif SC" w:cs="Noto Serif" w:hint="eastAsia"/>
+          <w:sz w:val="24"/>
+          <w:szCs w:val="24"/>
+        </w:rPr>
+        <w:t>大阮</w:t>
+      </w:r>
+      <w:r>
+        <w:rPr>
+          <w:rFonts w:ascii="Noto Serif SC" w:eastAsia="Noto Serif SC" w:hAnsi="Noto Serif SC" w:cs="Noto Serif"/>
+          <w:sz w:val="24"/>
+          <w:szCs w:val="24"/>
+        </w:rPr>
+        <w:t>Daruan</w:t>
+      </w:r>
+      <w:r>
+        <w:rPr>
+          <w:rFonts w:ascii="Noto Serif SC" w:eastAsia="Noto Serif SC" w:hAnsi="Noto Serif SC" w:cs="Noto Serif"/>
+          <w:sz w:val="24"/>
+          <w:szCs w:val="24"/>
+        </w:rPr>
+        <w:t xml:space="preserve"> </w:t>
+      </w:r>
+      <w:r>
+        <w:rPr>
+          <w:rFonts w:ascii="Noto Serif SC" w:eastAsia="Noto Serif SC" w:hAnsi="Noto Serif SC" w:cs="Noto Serif"/>
+          <w:sz w:val="24"/>
+          <w:szCs w:val="24"/>
         </w:rPr>
         <w:t>(2)</w:t>
       </w:r>
-      <w:r>
-        <w:rPr>
-          <w:rFonts w:ascii="Noto Serif SC" w:eastAsia="Noto Serif SC" w:hAnsi="Noto Serif SC" w:cs="Noto Serif"/>
-          <w:sz w:val="24"/>
-          <w:szCs w:val="24"/>
-          <w:lang w:val="en-US"/>
+    </w:p>
+    <w:p>
+      <w:pPr>
+        <w:rPr>
+          <w:rFonts w:ascii="Noto Serif SC" w:eastAsia="Noto Serif SC" w:hAnsi="Noto Serif SC" w:cs="Noto Serif"/>
+          <w:sz w:val="24"/>
+          <w:szCs w:val="24"/>
+        </w:rPr>
+      </w:pPr>
+      <w:r>
+        <w:rPr>
+          <w:rFonts w:ascii="Noto Serif SC" w:eastAsia="Noto Serif SC" w:hAnsi="Noto Serif SC" w:cs="Noto Serif" w:hint="eastAsia"/>
+          <w:sz w:val="24"/>
+          <w:szCs w:val="24"/>
+        </w:rPr>
+        <w:t>古筝</w:t>
+      </w:r>
+      <w:r>
+        <w:rPr>
+          <w:rFonts w:ascii="Noto Serif SC" w:eastAsia="Noto Serif SC" w:hAnsi="Noto Serif SC" w:cs="Noto Serif"/>
+          <w:sz w:val="24"/>
+          <w:szCs w:val="24"/>
+        </w:rPr>
+        <w:t>Guzheng</w:t>
+      </w:r>
+      <w:r>
+        <w:rPr>
+          <w:rFonts w:ascii="Noto Serif SC" w:eastAsia="Noto Serif SC" w:hAnsi="Noto Serif SC" w:cs="Noto Serif"/>
+          <w:sz w:val="24"/>
+          <w:szCs w:val="24"/>
+        </w:rPr>
+        <w:t xml:space="preserve"> </w:t>
+      </w:r>
+      <w:r>
+        <w:rPr>
+          <w:rFonts w:ascii="Noto Serif SC" w:eastAsia="Noto Serif SC" w:hAnsi="Noto Serif SC" w:cs="Noto Serif"/>
+          <w:sz w:val="24"/>
+          <w:szCs w:val="24"/>
+        </w:rPr>
+        <w:t>(2)</w:t>
+      </w:r>
+    </w:p>
+    <w:p>
+      <w:pPr>
+        <w:rPr>
+          <w:rFonts w:ascii="Noto Serif SC" w:eastAsia="Noto Serif SC" w:hAnsi="Noto Serif SC" w:cs="Noto Serif"/>
+          <w:sz w:val="24"/>
+          <w:szCs w:val="24"/>
+        </w:rPr>
+      </w:pPr>
+    </w:p>
+    <w:p>
+      <w:pPr>
+        <w:rPr>
+          <w:rFonts w:ascii="Noto Serif SC" w:eastAsia="Noto Serif SC" w:hAnsi="Noto Serif SC" w:cs="Noto Serif"/>
+          <w:sz w:val="24"/>
+          <w:szCs w:val="24"/>
+        </w:rPr>
+      </w:pPr>
+      <w:r>
+        <w:rPr>
+          <w:rFonts w:ascii="Noto Serif SC" w:eastAsia="Noto Serif SC" w:hAnsi="Noto Serif SC" w:cs="Noto Serif" w:hint="eastAsia"/>
+          <w:sz w:val="24"/>
+          <w:szCs w:val="24"/>
+        </w:rPr>
+        <w:t>定音鼓</w:t>
+      </w:r>
+      <w:r>
+        <w:rPr>
+          <w:rFonts w:ascii="Noto Serif SC" w:eastAsia="Noto Serif SC" w:hAnsi="Noto Serif SC" w:cs="Noto Serif"/>
+          <w:sz w:val="24"/>
+          <w:szCs w:val="24"/>
+        </w:rPr>
+        <w:t xml:space="preserve"> Timpani</w:t>
+      </w:r>
+    </w:p>
+    <w:p>
+      <w:pPr>
+        <w:rPr>
+          <w:rFonts w:ascii="Noto Serif SC" w:eastAsia="Noto Serif SC" w:hAnsi="Noto Serif SC" w:cs="Noto Serif"/>
+          <w:sz w:val="24"/>
+          <w:szCs w:val="24"/>
+        </w:rPr>
+      </w:pPr>
+      <w:r>
+        <w:rPr>
+          <w:rFonts w:ascii="Noto Serif SC" w:eastAsia="Noto Serif SC" w:hAnsi="Noto Serif SC" w:cs="Noto Serif"/>
+          <w:sz w:val="24"/>
+          <w:szCs w:val="24"/>
+        </w:rPr>
+        <w:t>4</w:t>
+      </w:r>
+      <w:r>
+        <w:rPr>
+          <w:rFonts w:ascii="Noto Serif SC" w:eastAsia="Noto Serif SC" w:hAnsi="Noto Serif SC" w:cs="Noto Serif" w:hint="eastAsia"/>
+          <w:sz w:val="24"/>
+          <w:szCs w:val="24"/>
+        </w:rPr>
+        <w:t xml:space="preserve"> 打击乐 </w:t>
+      </w:r>
+      <w:r>
+        <w:rPr>
+          <w:rFonts w:ascii="Noto Serif SC" w:eastAsia="Noto Serif SC" w:hAnsi="Noto Serif SC" w:cs="Noto Serif"/>
+          <w:sz w:val="24"/>
+          <w:szCs w:val="24"/>
+        </w:rPr>
+        <w:t>Percussion</w:t>
+      </w:r>
+    </w:p>
+    <w:p>
+      <w:pPr>
+        <w:ind w:left="720" w:hanging="436"/>
+        <w:rPr>
+          <w:rFonts w:ascii="Noto Serif SC" w:eastAsia="Noto Serif SC" w:hAnsi="Noto Serif SC" w:cs="Noto Serif"/>
+          <w:sz w:val="20"/>
+          <w:szCs w:val="20"/>
+        </w:rPr>
+      </w:pPr>
+      <w:r>
+        <w:rPr>
+          <w:rFonts w:ascii="Noto Serif SC" w:eastAsia="Noto Serif SC" w:hAnsi="Noto Serif SC" w:cs="Noto Serif"/>
+          <w:sz w:val="20"/>
+          <w:szCs w:val="20"/>
+        </w:rPr>
+        <w:t xml:space="preserve">I: </w:t>
+      </w:r>
+      <w:r>
+        <w:rPr>
+          <w:rFonts w:ascii="Noto Serif SC" w:eastAsia="Noto Serif SC" w:hAnsi="Noto Serif SC" w:cs="Noto Serif" w:hint="eastAsia"/>
+          <w:sz w:val="20"/>
+          <w:szCs w:val="20"/>
+        </w:rPr>
+        <w:t>大军鼓</w:t>
+      </w:r>
+      <w:r>
+        <w:rPr>
+          <w:rFonts w:ascii="Noto Serif SC" w:eastAsia="Noto Serif SC" w:hAnsi="Noto Serif SC" w:cs="Noto Serif"/>
+          <w:sz w:val="20"/>
+          <w:szCs w:val="20"/>
+        </w:rPr>
+        <w:t xml:space="preserve"> Bass Drum, </w:t>
+      </w:r>
+      <w:r>
+        <w:rPr>
+          <w:rFonts w:ascii="Noto Serif SC" w:eastAsia="Noto Serif SC" w:hAnsi="Noto Serif SC" w:cs="Noto Serif" w:hint="eastAsia"/>
+          <w:sz w:val="20"/>
+          <w:szCs w:val="20"/>
+        </w:rPr>
+        <w:t>板鼓</w:t>
+      </w:r>
+      <w:r>
+        <w:rPr>
+          <w:rFonts w:ascii="Noto Serif SC" w:eastAsia="Noto Serif SC" w:hAnsi="Noto Serif SC" w:cs="Noto Serif"/>
+          <w:sz w:val="20"/>
+          <w:szCs w:val="20"/>
+        </w:rPr>
+        <w:t xml:space="preserve"> Bangu</w:t>
+      </w:r>
+    </w:p>
+    <w:p>
+      <w:pPr>
+        <w:ind w:left="720" w:hanging="436"/>
+        <w:rPr>
+          <w:rFonts w:ascii="Noto Serif SC" w:eastAsia="Noto Serif SC" w:hAnsi="Noto Serif SC" w:cs="Noto Serif"/>
+          <w:sz w:val="20"/>
+          <w:szCs w:val="20"/>
+        </w:rPr>
+      </w:pPr>
+      <w:r>
+        <w:rPr>
+          <w:rFonts w:ascii="Noto Serif SC" w:eastAsia="Noto Serif SC" w:hAnsi="Noto Serif SC" w:cs="Noto Serif"/>
+          <w:sz w:val="20"/>
+          <w:szCs w:val="20"/>
+        </w:rPr>
+        <w:t xml:space="preserve">II: </w:t>
+      </w:r>
+      <w:r>
+        <w:rPr>
+          <w:rFonts w:ascii="Noto Serif SC" w:eastAsia="Noto Serif SC" w:hAnsi="Noto Serif SC" w:cs="Noto Serif" w:hint="eastAsia"/>
+          <w:sz w:val="20"/>
+          <w:szCs w:val="20"/>
+        </w:rPr>
+        <w:t>吊镲</w:t>
+      </w:r>
+      <w:r>
+        <w:rPr>
+          <w:rFonts w:ascii="Noto Serif SC" w:eastAsia="Noto Serif SC" w:hAnsi="Noto Serif SC" w:cs="Noto Serif"/>
+          <w:sz w:val="20"/>
+          <w:szCs w:val="20"/>
+        </w:rPr>
+        <w:t xml:space="preserve"> Suspended Cymbal, </w:t>
+      </w:r>
+      <w:r>
+        <w:rPr>
+          <w:rFonts w:ascii="Noto Serif SC" w:eastAsia="Noto Serif SC" w:hAnsi="Noto Serif SC" w:cs="Noto Serif" w:hint="eastAsia"/>
+          <w:sz w:val="20"/>
+          <w:szCs w:val="20"/>
+        </w:rPr>
+        <w:t>碰铃</w:t>
+      </w:r>
+      <w:r>
+        <w:rPr>
+          <w:rFonts w:ascii="Noto Serif SC" w:eastAsia="Noto Serif SC" w:hAnsi="Noto Serif SC" w:cs="Noto Serif"/>
+          <w:sz w:val="20"/>
+          <w:szCs w:val="20"/>
+        </w:rPr>
+        <w:t xml:space="preserve"> Pengling, </w:t>
+      </w:r>
+      <w:r>
+        <w:rPr>
+          <w:rFonts w:ascii="Noto Serif SC" w:eastAsia="Noto Serif SC" w:hAnsi="Noto Serif SC" w:cs="Noto Serif" w:hint="eastAsia"/>
+          <w:sz w:val="20"/>
+          <w:szCs w:val="20"/>
+        </w:rPr>
+        <w:t>低音木鱼</w:t>
+      </w:r>
+      <w:r>
+        <w:rPr>
+          <w:rFonts w:ascii="Noto Serif SC" w:eastAsia="Noto Serif SC" w:hAnsi="Noto Serif SC" w:cs="Noto Serif"/>
+          <w:sz w:val="20"/>
+          <w:szCs w:val="20"/>
+        </w:rPr>
+        <w:t xml:space="preserve"> Low Woodblock</w:t>
+      </w:r>
+    </w:p>
+    <w:p>
+      <w:pPr>
+        <w:ind w:left="720" w:hanging="436"/>
+        <w:rPr>
+          <w:rFonts w:ascii="Noto Serif SC" w:eastAsia="Noto Serif SC" w:hAnsi="Noto Serif SC" w:cs="Noto Serif"/>
+          <w:sz w:val="20"/>
+          <w:szCs w:val="20"/>
+        </w:rPr>
+      </w:pPr>
+      <w:r>
+        <w:rPr>
+          <w:rFonts w:ascii="Noto Serif SC" w:eastAsia="Noto Serif SC" w:hAnsi="Noto Serif SC" w:cs="Noto Serif"/>
+          <w:sz w:val="20"/>
+          <w:szCs w:val="20"/>
+        </w:rPr>
+        <w:t xml:space="preserve">III: </w:t>
+      </w:r>
+      <w:r>
+        <w:rPr>
+          <w:rFonts w:ascii="Noto Serif SC" w:eastAsia="Noto Serif SC" w:hAnsi="Noto Serif SC" w:cs="Noto Serif" w:hint="eastAsia"/>
+          <w:sz w:val="20"/>
+          <w:szCs w:val="20"/>
+        </w:rPr>
+        <w:t>小军鼓</w:t>
+      </w:r>
+      <w:r>
+        <w:rPr>
+          <w:rFonts w:ascii="Noto Serif SC" w:eastAsia="Noto Serif SC" w:hAnsi="Noto Serif SC" w:cs="Noto Serif"/>
+          <w:sz w:val="20"/>
+          <w:szCs w:val="20"/>
+        </w:rPr>
+        <w:t xml:space="preserve"> Snare Drum, </w:t>
+      </w:r>
+      <w:r>
+        <w:rPr>
+          <w:rFonts w:ascii="Noto Serif SC" w:eastAsia="Noto Serif SC" w:hAnsi="Noto Serif SC" w:cs="Noto Serif" w:hint="eastAsia"/>
+          <w:sz w:val="20"/>
+          <w:szCs w:val="20"/>
+        </w:rPr>
+        <w:t>铃鼓</w:t>
+      </w:r>
+      <w:r>
+        <w:rPr>
+          <w:rFonts w:ascii="Noto Serif SC" w:eastAsia="Noto Serif SC" w:hAnsi="Noto Serif SC" w:cs="Noto Serif"/>
+          <w:sz w:val="20"/>
+          <w:szCs w:val="20"/>
+        </w:rPr>
+        <w:t xml:space="preserve"> Tambourine, </w:t>
+      </w:r>
+      <w:r>
+        <w:rPr>
+          <w:rFonts w:ascii="Noto Serif SC" w:eastAsia="Noto Serif SC" w:hAnsi="Noto Serif SC" w:cs="Noto Serif" w:hint="eastAsia"/>
+          <w:sz w:val="20"/>
+          <w:szCs w:val="20"/>
+        </w:rPr>
+        <w:t>钟琴</w:t>
+      </w:r>
+      <w:r>
+        <w:rPr>
+          <w:rFonts w:ascii="Noto Serif SC" w:eastAsia="Noto Serif SC" w:hAnsi="Noto Serif SC" w:cs="Noto Serif"/>
+          <w:sz w:val="20"/>
+          <w:szCs w:val="20"/>
+        </w:rPr>
+        <w:t xml:space="preserve"> Glockenspiel, </w:t>
+      </w:r>
+      <w:r>
+        <w:rPr>
+          <w:rFonts w:ascii="Noto Serif SC" w:eastAsia="Noto Serif SC" w:hAnsi="Noto Serif SC" w:cs="Noto Serif" w:hint="eastAsia"/>
+          <w:sz w:val="20"/>
+          <w:szCs w:val="20"/>
+        </w:rPr>
+        <w:t>小钹</w:t>
+      </w:r>
+      <w:r>
+        <w:rPr>
+          <w:rFonts w:ascii="Noto Serif SC" w:eastAsia="Noto Serif SC" w:hAnsi="Noto Serif SC" w:cs="Noto Serif"/>
+          <w:sz w:val="20"/>
+          <w:szCs w:val="20"/>
+        </w:rPr>
+        <w:t xml:space="preserve"> Xiaobo, </w:t>
+      </w:r>
+      <w:r>
+        <w:rPr>
+          <w:rFonts w:ascii="Noto Serif SC" w:eastAsia="Noto Serif SC" w:hAnsi="Noto Serif SC" w:cs="Noto Serif" w:hint="eastAsia"/>
+          <w:sz w:val="20"/>
+          <w:szCs w:val="20"/>
+        </w:rPr>
+        <w:t>小堂鼓</w:t>
+      </w:r>
+      <w:r>
+        <w:rPr>
+          <w:rFonts w:ascii="Noto Serif SC" w:eastAsia="Noto Serif SC" w:hAnsi="Noto Serif SC" w:cs="Noto Serif"/>
+          <w:sz w:val="20"/>
+          <w:szCs w:val="20"/>
+        </w:rPr>
+        <w:t xml:space="preserve"> Xiaotanggu</w:t>
+      </w:r>
+    </w:p>
+    <w:p>
+      <w:pPr>
+        <w:ind w:left="720" w:hanging="436"/>
+        <w:rPr>
+          <w:rFonts w:ascii="Noto Serif SC" w:eastAsia="Noto Serif SC" w:hAnsi="Noto Serif SC" w:cs="Noto Serif"/>
+          <w:sz w:val="20"/>
+          <w:szCs w:val="20"/>
+        </w:rPr>
+      </w:pPr>
+      <w:r>
+        <w:rPr>
+          <w:rFonts w:ascii="Noto Serif SC" w:eastAsia="Noto Serif SC" w:hAnsi="Noto Serif SC" w:cs="Noto Serif"/>
+          <w:sz w:val="20"/>
+          <w:szCs w:val="20"/>
+        </w:rPr>
+        <w:t xml:space="preserve">IV: </w:t>
+      </w:r>
+      <w:r>
+        <w:rPr>
+          <w:rFonts w:ascii="Noto Serif SC" w:eastAsia="Noto Serif SC" w:hAnsi="Noto Serif SC" w:cs="Noto Serif" w:hint="eastAsia"/>
+          <w:sz w:val="20"/>
+          <w:szCs w:val="20"/>
+        </w:rPr>
+        <w:t>鞭子</w:t>
+      </w:r>
+      <w:r>
+        <w:rPr>
+          <w:rFonts w:ascii="Noto Serif SC" w:eastAsia="Noto Serif SC" w:hAnsi="Noto Serif SC" w:cs="Noto Serif"/>
+          <w:sz w:val="20"/>
+          <w:szCs w:val="20"/>
+        </w:rPr>
+        <w:t xml:space="preserve"> Whip, </w:t>
+      </w:r>
+      <w:r>
+        <w:rPr>
+          <w:rFonts w:ascii="Noto Serif SC" w:eastAsia="Noto Serif SC" w:hAnsi="Noto Serif SC" w:cs="Noto Serif" w:hint="eastAsia"/>
+          <w:sz w:val="20"/>
+          <w:szCs w:val="20"/>
+        </w:rPr>
+        <w:t>中钹</w:t>
+      </w:r>
+      <w:r>
+        <w:rPr>
+          <w:rFonts w:ascii="Noto Serif SC" w:eastAsia="Noto Serif SC" w:hAnsi="Noto Serif SC" w:cs="Noto Serif"/>
+          <w:sz w:val="20"/>
+          <w:szCs w:val="20"/>
+        </w:rPr>
+        <w:t xml:space="preserve"> Zhongbo, </w:t>
+      </w:r>
+      <w:r>
+        <w:rPr>
+          <w:rFonts w:ascii="Noto Serif SC" w:eastAsia="Noto Serif SC" w:hAnsi="Noto Serif SC" w:cs="Noto Serif" w:hint="eastAsia"/>
+          <w:sz w:val="20"/>
+          <w:szCs w:val="20"/>
+        </w:rPr>
+        <w:t>中国小钹</w:t>
+      </w:r>
+      <w:r>
+        <w:rPr>
+          <w:rFonts w:ascii="Noto Serif SC" w:eastAsia="Noto Serif SC" w:hAnsi="Noto Serif SC" w:cs="Noto Serif"/>
+          <w:sz w:val="20"/>
+          <w:szCs w:val="20"/>
+        </w:rPr>
+        <w:t xml:space="preserve"> Xiaoluo, </w:t>
+      </w:r>
+      <w:r>
+        <w:rPr>
+          <w:rFonts w:ascii="Noto Serif SC" w:eastAsia="Noto Serif SC" w:hAnsi="Noto Serif SC" w:cs="Noto Serif" w:hint="eastAsia"/>
+          <w:sz w:val="20"/>
+          <w:szCs w:val="20"/>
+        </w:rPr>
+        <w:t>中国大钹</w:t>
+      </w:r>
+      <w:r>
+        <w:rPr>
+          <w:rFonts w:ascii="Noto Serif SC" w:eastAsia="Noto Serif SC" w:hAnsi="Noto Serif SC" w:cs="Noto Serif"/>
+          <w:sz w:val="20"/>
+          <w:szCs w:val="20"/>
+        </w:rPr>
+        <w:t xml:space="preserve"> Daluo, </w:t>
+      </w:r>
+      <w:r>
+        <w:rPr>
+          <w:rFonts w:ascii="Noto Serif SC" w:eastAsia="Noto Serif SC" w:hAnsi="Noto Serif SC" w:cs="Noto Serif" w:hint="eastAsia"/>
+          <w:sz w:val="20"/>
+          <w:szCs w:val="20"/>
+        </w:rPr>
+        <w:t>西洋对镲</w:t>
+      </w:r>
+      <w:r>
+        <w:rPr>
+          <w:rFonts w:ascii="Noto Serif SC" w:eastAsia="Noto Serif SC" w:hAnsi="Noto Serif SC" w:cs="Noto Serif"/>
+          <w:sz w:val="20"/>
+          <w:szCs w:val="20"/>
+        </w:rPr>
+        <w:t xml:space="preserve"> Crash Cymbals</w:t>
+      </w:r>
+    </w:p>
+    <w:p>
+      <w:pPr>
+        <w:ind w:hanging="436"/>
+        <w:rPr>
+          <w:rFonts w:ascii="Noto Serif SC" w:eastAsia="Noto Serif SC" w:hAnsi="Noto Serif SC" w:cs="Noto Serif"/>
+          <w:sz w:val="24"/>
+          <w:szCs w:val="24"/>
+        </w:rPr>
+      </w:pPr>
+    </w:p>
+    <w:p>
+      <w:pPr>
+        <w:rPr>
+          <w:rFonts w:ascii="Noto Serif SC" w:eastAsia="Noto Serif SC" w:hAnsi="Noto Serif SC" w:cs="Noto Serif"/>
+          <w:sz w:val="24"/>
+          <w:szCs w:val="24"/>
+        </w:rPr>
+      </w:pPr>
+      <w:r>
+        <w:rPr>
+          <w:rFonts w:ascii="Noto Serif SC" w:eastAsia="Noto Serif SC" w:hAnsi="Noto Serif SC" w:cs="Noto Serif" w:hint="eastAsia"/>
+          <w:sz w:val="24"/>
+          <w:szCs w:val="24"/>
+        </w:rPr>
+        <w:t>高胡</w:t>
+      </w:r>
+      <w:r>
+        <w:rPr>
+          <w:rFonts w:ascii="Noto Serif SC" w:eastAsia="Noto Serif SC" w:hAnsi="Noto Serif SC" w:cs="Noto Serif"/>
+          <w:sz w:val="24"/>
+          <w:szCs w:val="24"/>
+        </w:rPr>
+        <w:t xml:space="preserve"> Gaohu</w:t>
+      </w:r>
+    </w:p>
+    <w:p>
+      <w:pPr>
+        <w:rPr>
+          <w:rFonts w:ascii="Noto Serif SC" w:eastAsia="Noto Serif SC" w:hAnsi="Noto Serif SC" w:cs="Noto Serif"/>
+          <w:sz w:val="24"/>
+          <w:szCs w:val="24"/>
+        </w:rPr>
+      </w:pPr>
+      <w:r>
+        <w:rPr>
+          <w:rFonts w:ascii="Noto Serif SC" w:eastAsia="Noto Serif SC" w:hAnsi="Noto Serif SC" w:cs="Noto Serif" w:hint="eastAsia"/>
+          <w:sz w:val="24"/>
+          <w:szCs w:val="24"/>
+        </w:rPr>
+        <w:t>二胡</w:t>
+      </w:r>
+      <w:r>
+        <w:rPr>
+          <w:rFonts w:ascii="Noto Serif SC" w:eastAsia="Noto Serif SC" w:hAnsi="Noto Serif SC" w:cs="Noto Serif"/>
+          <w:sz w:val="24"/>
+          <w:szCs w:val="24"/>
+        </w:rPr>
+        <w:t xml:space="preserve"> Erhu</w:t>
+      </w:r>
+      <w:r>
+        <w:rPr>
+          <w:rFonts w:ascii="Noto Serif SC" w:eastAsia="Noto Serif SC" w:hAnsi="Noto Serif SC" w:cs="Noto Serif"/>
+          <w:sz w:val="24"/>
+          <w:szCs w:val="24"/>
+        </w:rPr>
+        <w:t xml:space="preserve"> I</w:t>
+      </w:r>
+    </w:p>
+    <w:p>
+      <w:pPr>
+        <w:rPr>
+          <w:rFonts w:ascii="Noto Serif SC" w:eastAsia="Noto Serif SC" w:hAnsi="Noto Serif SC" w:cs="Noto Serif"/>
+          <w:sz w:val="24"/>
+          <w:szCs w:val="24"/>
+        </w:rPr>
+      </w:pPr>
+      <w:r>
+        <w:rPr>
+          <w:rFonts w:ascii="Noto Serif SC" w:eastAsia="Noto Serif SC" w:hAnsi="Noto Serif SC" w:cs="Noto Serif" w:hint="eastAsia"/>
+          <w:sz w:val="24"/>
+          <w:szCs w:val="24"/>
+        </w:rPr>
+        <w:t>二胡</w:t>
+      </w:r>
+      <w:r>
+        <w:rPr>
+          <w:rFonts w:ascii="Noto Serif SC" w:eastAsia="Noto Serif SC" w:hAnsi="Noto Serif SC" w:cs="Noto Serif"/>
+          <w:sz w:val="24"/>
+          <w:szCs w:val="24"/>
+        </w:rPr>
+        <w:t xml:space="preserve"> Erhu II</w:t>
+      </w:r>
+      <w:r>
+        <w:rPr>
+          <w:rFonts w:ascii="Noto Serif SC" w:eastAsia="Noto Serif SC" w:hAnsi="Noto Serif SC" w:cs="Noto Serif"/>
+          <w:sz w:val="24"/>
+          <w:szCs w:val="24"/>
+        </w:rPr>
+        <w:t xml:space="preserve"> </w:t>
+      </w:r>
+    </w:p>
+    <w:p>
+      <w:pPr>
+        <w:rPr>
+          <w:rFonts w:ascii="Noto Serif SC" w:eastAsia="Noto Serif SC" w:hAnsi="Noto Serif SC" w:cs="Noto Serif"/>
+          <w:sz w:val="24"/>
+          <w:szCs w:val="24"/>
+        </w:rPr>
+      </w:pPr>
+      <w:r>
+        <w:rPr>
+          <w:rFonts w:ascii="Noto Serif SC" w:eastAsia="Noto Serif SC" w:hAnsi="Noto Serif SC" w:cs="Noto Serif" w:hint="eastAsia"/>
+          <w:sz w:val="24"/>
+          <w:szCs w:val="24"/>
+        </w:rPr>
+        <w:t>中胡</w:t>
+      </w:r>
+      <w:r>
+        <w:rPr>
+          <w:rFonts w:ascii="Noto Serif SC" w:eastAsia="Noto Serif SC" w:hAnsi="Noto Serif SC" w:cs="Noto Serif"/>
+          <w:sz w:val="24"/>
+          <w:szCs w:val="24"/>
+        </w:rPr>
+        <w:t xml:space="preserve"> Zhonghu</w:t>
+      </w:r>
+    </w:p>
+    <w:p>
+      <w:pPr>
+        <w:rPr>
+          <w:rFonts w:ascii="Noto Serif SC" w:eastAsia="Noto Serif SC" w:hAnsi="Noto Serif SC" w:cs="Noto Serif"/>
+          <w:sz w:val="24"/>
+          <w:szCs w:val="24"/>
+        </w:rPr>
+      </w:pPr>
+      <w:r>
+        <w:rPr>
+          <w:rFonts w:ascii="Noto Serif SC" w:eastAsia="Noto Serif SC" w:hAnsi="Noto Serif SC" w:cs="Noto Serif" w:hint="eastAsia"/>
+          <w:sz w:val="24"/>
+          <w:szCs w:val="24"/>
+        </w:rPr>
+        <w:t>大提琴</w:t>
+      </w:r>
+      <w:r>
+        <w:rPr>
+          <w:rFonts w:ascii="Noto Serif SC" w:eastAsia="Noto Serif SC" w:hAnsi="Noto Serif SC" w:cs="Noto Serif"/>
+          <w:sz w:val="24"/>
+          <w:szCs w:val="24"/>
+        </w:rPr>
+        <w:t xml:space="preserve"> Violoncello</w:t>
+      </w:r>
+    </w:p>
+    <w:p>
+      <w:pPr>
+        <w:rPr>
+          <w:rFonts w:ascii="Noto Serif SC" w:eastAsia="Noto Serif SC" w:hAnsi="Noto Serif SC" w:cs="Noto Serif"/>
+          <w:sz w:val="24"/>
+          <w:szCs w:val="24"/>
+        </w:rPr>
+      </w:pPr>
+      <w:r>
+        <w:rPr>
+          <w:rFonts w:ascii="Noto Serif SC" w:eastAsia="Noto Serif SC" w:hAnsi="Noto Serif SC" w:cs="Noto Serif" w:hint="eastAsia"/>
+          <w:sz w:val="24"/>
+          <w:szCs w:val="24"/>
+        </w:rPr>
+        <w:t>低音提琴</w:t>
+      </w:r>
+      <w:r>
+        <w:rPr>
+          <w:rFonts w:ascii="Noto Serif SC" w:eastAsia="Noto Serif SC" w:hAnsi="Noto Serif SC" w:cs="Noto Serif"/>
+          <w:sz w:val="24"/>
+          <w:szCs w:val="24"/>
+        </w:rPr>
+        <w:t xml:space="preserve"> Contrabass</w:t>
+      </w:r>
+    </w:p>
+    <w:p>
+      <w:pPr>
+        <w:rPr>
+          <w:rFonts w:ascii="Noto Serif SC" w:eastAsia="Noto Serif SC" w:hAnsi="Noto Serif SC" w:cs="Noto Serif"/>
+        </w:rPr>
+      </w:pPr>
+    </w:p>
+    <w:p>
+      <w:pPr>
+        <w:rPr>
+          <w:rFonts w:ascii="Noto Serif SC" w:eastAsia="Noto Serif SC" w:hAnsi="Noto Serif SC" w:cs="Noto Serif"/>
+        </w:rPr>
+      </w:pPr>
+    </w:p>
+    <w:p>
+      <w:pPr>
+        <w:rPr>
+          <w:rFonts w:ascii="Noto Serif SC" w:eastAsia="Noto Serif SC" w:hAnsi="Noto Serif SC" w:cs="Noto Serif"/>
+        </w:rPr>
+      </w:pPr>
+      <w:r>
+        <w:rPr>
+          <w:rFonts w:ascii="Noto Serif SC" w:eastAsia="Noto Serif SC" w:hAnsi="Noto Serif SC" w:cs="Noto Serif"/>
         </w:rPr>
         <w:t>*</w:t>
       </w:r>
-    </w:p>
-    <w:p>
-      <w:pPr>
-        <w:rPr>
-          <w:rFonts w:ascii="Noto Serif SC" w:eastAsia="Noto Serif SC" w:hAnsi="Noto Serif SC" w:cs="Noto Serif"/>
-          <w:sz w:val="24"/>
-          <w:szCs w:val="24"/>
-          <w:lang w:val="en-US"/>
-        </w:rPr>
-      </w:pPr>
-      <w:r>
-        <w:rPr>
-          <w:rFonts w:ascii="Noto Serif SC" w:eastAsia="Noto Serif SC" w:hAnsi="Noto Serif SC" w:cs="Noto Serif" w:hint="eastAsia"/>
-          <w:sz w:val="24"/>
-          <w:szCs w:val="24"/>
-          <w:lang w:val="en-US"/>
-        </w:rPr>
-        <w:t>柳琴</w:t>
-      </w:r>
-      <w:r>
-        <w:rPr>
-          <w:rFonts w:ascii="Noto Serif SC" w:eastAsia="Noto Serif SC" w:hAnsi="Noto Serif SC" w:cs="Noto Serif"/>
-          <w:sz w:val="24"/>
-          <w:szCs w:val="24"/>
-          <w:lang w:val="en-US"/>
-        </w:rPr>
-        <w:t>Liuqin</w:t>
-      </w:r>
-      <w:r>
-        <w:rPr>
-          <w:rFonts w:ascii="Noto Serif SC" w:eastAsia="Noto Serif SC" w:hAnsi="Noto Serif SC" w:cs="Noto Serif"/>
-          <w:sz w:val="24"/>
-          <w:szCs w:val="24"/>
-          <w:lang w:val="en-US"/>
+      <w:r>
+        <w:rPr>
+          <w:rFonts w:ascii="Noto Serif SC" w:eastAsia="Noto Serif SC" w:hAnsi="Noto Serif SC" w:cs="Noto Serif"/>
         </w:rPr>
         <w:t xml:space="preserve"> </w:t>
       </w:r>
       <w:r>
         <w:rPr>
-          <w:rFonts w:ascii="Noto Serif SC" w:eastAsia="Noto Serif SC" w:hAnsi="Noto Serif SC" w:cs="Noto Serif"/>
-          <w:sz w:val="24"/>
-          <w:szCs w:val="24"/>
-          <w:lang w:val="en-US"/>
-        </w:rPr>
-        <w:t>(2)</w:t>
-      </w:r>
-    </w:p>
-    <w:p>
-      <w:pPr>
-        <w:rPr>
-          <w:rFonts w:ascii="Noto Serif SC" w:eastAsia="Noto Serif SC" w:hAnsi="Noto Serif SC" w:cs="Noto Serif"/>
-          <w:sz w:val="24"/>
-          <w:szCs w:val="24"/>
-          <w:lang w:val="en-US"/>
-        </w:rPr>
-      </w:pPr>
-      <w:r>
-        <w:rPr>
-          <w:rFonts w:ascii="Noto Serif SC" w:eastAsia="Noto Serif SC" w:hAnsi="Noto Serif SC" w:cs="Noto Serif" w:hint="eastAsia"/>
-          <w:sz w:val="24"/>
-          <w:szCs w:val="24"/>
-          <w:lang w:val="en-US"/>
-        </w:rPr>
-        <w:t>琵琶</w:t>
-      </w:r>
-      <w:r>
-        <w:rPr>
-          <w:rFonts w:ascii="Noto Serif SC" w:eastAsia="Noto Serif SC" w:hAnsi="Noto Serif SC" w:cs="Noto Serif"/>
-          <w:sz w:val="24"/>
-          <w:szCs w:val="24"/>
-          <w:lang w:val="en-US"/>
-        </w:rPr>
-        <w:t>Pipa</w:t>
-      </w:r>
-      <w:r>
-        <w:rPr>
-          <w:rFonts w:ascii="Noto Serif SC" w:eastAsia="Noto Serif SC" w:hAnsi="Noto Serif SC" w:cs="Noto Serif"/>
-          <w:sz w:val="24"/>
-          <w:szCs w:val="24"/>
-          <w:lang w:val="en-US"/>
+          <w:rFonts w:ascii="Noto Serif SC" w:eastAsia="Noto Serif SC" w:hAnsi="Noto Serif SC" w:cs="Noto Serif" w:hint="eastAsia"/>
+        </w:rPr>
+        <w:t>括号内的数字为推荐演奏人数</w:t>
+      </w:r>
+      <w:r>
+        <w:rPr>
+          <w:rFonts w:ascii="Noto Serif SC" w:eastAsia="Noto Serif SC" w:hAnsi="Noto Serif SC" w:cs="Noto Serif"/>
         </w:rPr>
         <w:t xml:space="preserve"> </w:t>
       </w:r>
       <w:r>
         <w:rPr>
-          <w:rFonts w:ascii="Noto Serif SC" w:eastAsia="Noto Serif SC" w:hAnsi="Noto Serif SC" w:cs="Noto Serif"/>
-          <w:sz w:val="24"/>
-          <w:szCs w:val="24"/>
-          <w:lang w:val="en-US"/>
-        </w:rPr>
-        <w:t>(4)</w:t>
-      </w:r>
-    </w:p>
-    <w:p>
-      <w:pPr>
-        <w:rPr>
-          <w:rFonts w:ascii="Noto Serif SC" w:eastAsia="Noto Serif SC" w:hAnsi="Noto Serif SC" w:cs="Noto Serif"/>
-          <w:sz w:val="24"/>
-          <w:szCs w:val="24"/>
-          <w:lang w:val="en-US"/>
-        </w:rPr>
-      </w:pPr>
-      <w:r>
-        <w:rPr>
-          <w:rFonts w:ascii="Noto Serif SC" w:eastAsia="Noto Serif SC" w:hAnsi="Noto Serif SC" w:cs="Noto Serif" w:hint="eastAsia"/>
-          <w:sz w:val="24"/>
-          <w:szCs w:val="24"/>
-          <w:lang w:val="en-US"/>
-        </w:rPr>
-        <w:t>中阮</w:t>
-      </w:r>
-      <w:r>
-        <w:rPr>
-          <w:rFonts w:ascii="Noto Serif SC" w:eastAsia="Noto Serif SC" w:hAnsi="Noto Serif SC" w:cs="Noto Serif"/>
-          <w:sz w:val="24"/>
-          <w:szCs w:val="24"/>
-          <w:lang w:val="en-US"/>
-        </w:rPr>
-        <w:t>Zhongruan</w:t>
-      </w:r>
-      <w:r>
-        <w:rPr>
-          <w:rFonts w:ascii="Noto Serif SC" w:eastAsia="Noto Serif SC" w:hAnsi="Noto Serif SC" w:cs="Noto Serif"/>
-          <w:sz w:val="24"/>
-          <w:szCs w:val="24"/>
-          <w:lang w:val="en-US"/>
-        </w:rPr>
-        <w:t xml:space="preserve"> </w:t>
-      </w:r>
-      <w:r>
-        <w:rPr>
-          <w:rFonts w:ascii="Noto Serif SC" w:eastAsia="Noto Serif SC" w:hAnsi="Noto Serif SC" w:cs="Noto Serif"/>
-          <w:sz w:val="24"/>
-          <w:szCs w:val="24"/>
-          <w:lang w:val="en-US"/>
-        </w:rPr>
-        <w:t>(4)</w:t>
-      </w:r>
-    </w:p>
-    <w:p>
-      <w:pPr>
-        <w:rPr>
-          <w:rFonts w:ascii="Noto Serif SC" w:eastAsia="Noto Serif SC" w:hAnsi="Noto Serif SC" w:cs="Noto Serif"/>
-          <w:sz w:val="24"/>
-          <w:szCs w:val="24"/>
-          <w:lang w:val="en-US"/>
-        </w:rPr>
-      </w:pPr>
-      <w:r>
-        <w:rPr>
-          <w:rFonts w:ascii="Noto Serif SC" w:eastAsia="Noto Serif SC" w:hAnsi="Noto Serif SC" w:cs="Noto Serif" w:hint="eastAsia"/>
-          <w:sz w:val="24"/>
-          <w:szCs w:val="24"/>
-          <w:lang w:val="en-US"/>
-        </w:rPr>
-        <w:t>大阮</w:t>
-      </w:r>
-      <w:r>
-        <w:rPr>
-          <w:rFonts w:ascii="Noto Serif SC" w:eastAsia="Noto Serif SC" w:hAnsi="Noto Serif SC" w:cs="Noto Serif"/>
-          <w:sz w:val="24"/>
-          <w:szCs w:val="24"/>
-          <w:lang w:val="en-US"/>
-        </w:rPr>
-        <w:t>Daruan</w:t>
-      </w:r>
-      <w:r>
-        <w:rPr>
-          <w:rFonts w:ascii="Noto Serif SC" w:eastAsia="Noto Serif SC" w:hAnsi="Noto Serif SC" w:cs="Noto Serif"/>
-          <w:sz w:val="24"/>
-          <w:szCs w:val="24"/>
-          <w:lang w:val="en-US"/>
-        </w:rPr>
-        <w:t xml:space="preserve"> </w:t>
-      </w:r>
-      <w:r>
-        <w:rPr>
-          <w:rFonts w:ascii="Noto Serif SC" w:eastAsia="Noto Serif SC" w:hAnsi="Noto Serif SC" w:cs="Noto Serif"/>
-          <w:sz w:val="24"/>
-          <w:szCs w:val="24"/>
-          <w:lang w:val="en-US"/>
-        </w:rPr>
-        <w:t>(2)</w:t>
-      </w:r>
-    </w:p>
-    <w:p>
-      <w:pPr>
-        <w:rPr>
-          <w:rFonts w:ascii="Noto Serif SC" w:eastAsia="Noto Serif SC" w:hAnsi="Noto Serif SC" w:cs="Noto Serif"/>
-          <w:sz w:val="24"/>
-          <w:szCs w:val="24"/>
-          <w:lang w:val="en-US"/>
-        </w:rPr>
-      </w:pPr>
-      <w:r>
-        <w:rPr>
-          <w:rFonts w:ascii="Noto Serif SC" w:eastAsia="Noto Serif SC" w:hAnsi="Noto Serif SC" w:cs="Noto Serif" w:hint="eastAsia"/>
-          <w:sz w:val="24"/>
-          <w:szCs w:val="24"/>
-        </w:rPr>
-        <w:t>古筝</w:t>
-      </w:r>
-      <w:r>
-        <w:rPr>
-          <w:rFonts w:ascii="Noto Serif SC" w:eastAsia="Noto Serif SC" w:hAnsi="Noto Serif SC" w:cs="Noto Serif"/>
-          <w:sz w:val="24"/>
-          <w:szCs w:val="24"/>
-          <w:lang w:val="en-US"/>
-        </w:rPr>
-        <w:t>Guzheng</w:t>
-      </w:r>
-      <w:r>
-        <w:rPr>
-          <w:rFonts w:ascii="Noto Serif SC" w:eastAsia="Noto Serif SC" w:hAnsi="Noto Serif SC" w:cs="Noto Serif"/>
-          <w:sz w:val="24"/>
-          <w:szCs w:val="24"/>
-          <w:lang w:val="en-US"/>
-        </w:rPr>
-        <w:t xml:space="preserve"> </w:t>
-      </w:r>
-      <w:r>
-        <w:rPr>
-          <w:rFonts w:ascii="Noto Serif SC" w:eastAsia="Noto Serif SC" w:hAnsi="Noto Serif SC" w:cs="Noto Serif"/>
-          <w:sz w:val="24"/>
-          <w:szCs w:val="24"/>
-          <w:lang w:val="en-US"/>
-        </w:rPr>
-        <w:t>(2)</w:t>
-      </w:r>
-    </w:p>
-    <w:p>
-      <w:pPr>
-        <w:rPr>
-          <w:rFonts w:ascii="Noto Serif SC" w:eastAsia="Noto Serif SC" w:hAnsi="Noto Serif SC" w:cs="Noto Serif"/>
-          <w:sz w:val="24"/>
-          <w:szCs w:val="24"/>
-          <w:lang w:val="en-US"/>
-        </w:rPr>
-      </w:pPr>
-    </w:p>
-    <w:p>
-      <w:pPr>
-        <w:rPr>
-          <w:rFonts w:ascii="Noto Serif SC" w:eastAsia="Noto Serif SC" w:hAnsi="Noto Serif SC" w:cs="Noto Serif"/>
-          <w:sz w:val="24"/>
-          <w:szCs w:val="24"/>
-          <w:lang w:val="en-US"/>
-        </w:rPr>
-      </w:pPr>
-      <w:r>
-        <w:rPr>
-          <w:rFonts w:ascii="Noto Serif SC" w:eastAsia="Noto Serif SC" w:hAnsi="Noto Serif SC" w:cs="Noto Serif" w:hint="eastAsia"/>
-          <w:sz w:val="24"/>
-          <w:szCs w:val="24"/>
-        </w:rPr>
-        <w:t>定音鼓</w:t>
-      </w:r>
-      <w:r>
-        <w:rPr>
-          <w:rFonts w:ascii="Noto Serif SC" w:eastAsia="Noto Serif SC" w:hAnsi="Noto Serif SC" w:cs="Noto Serif"/>
-          <w:sz w:val="24"/>
-          <w:szCs w:val="24"/>
-          <w:lang w:val="en-US"/>
-        </w:rPr>
-        <w:t xml:space="preserve"> Timpani</w:t>
-      </w:r>
-    </w:p>
-    <w:p>
-      <w:pPr>
-        <w:rPr>
-          <w:rFonts w:ascii="Noto Serif SC" w:eastAsia="Noto Serif SC" w:hAnsi="Noto Serif SC" w:cs="Noto Serif"/>
-          <w:sz w:val="24"/>
-          <w:szCs w:val="24"/>
-          <w:lang w:val="en-US"/>
-        </w:rPr>
-      </w:pPr>
-      <w:r>
-        <w:rPr>
-          <w:rFonts w:ascii="Noto Serif SC" w:eastAsia="Noto Serif SC" w:hAnsi="Noto Serif SC" w:cs="Noto Serif"/>
-          <w:sz w:val="24"/>
-          <w:szCs w:val="24"/>
-        </w:rPr>
-        <w:t>4</w:t>
-      </w:r>
-      <w:r>
-        <w:rPr>
-          <w:rFonts w:ascii="Noto Serif SC" w:eastAsia="Noto Serif SC" w:hAnsi="Noto Serif SC" w:cs="Noto Serif" w:hint="eastAsia"/>
-          <w:sz w:val="24"/>
-          <w:szCs w:val="24"/>
-        </w:rPr>
-        <w:t xml:space="preserve"> 打击乐 </w:t>
-      </w:r>
-      <w:r>
-        <w:rPr>
-          <w:rFonts w:ascii="Noto Serif SC" w:eastAsia="Noto Serif SC" w:hAnsi="Noto Serif SC" w:cs="Noto Serif"/>
-          <w:sz w:val="24"/>
-          <w:szCs w:val="24"/>
-        </w:rPr>
-        <w:t>Percussion</w:t>
-      </w:r>
-    </w:p>
-    <w:p>
-      <w:pPr>
-        <w:ind w:left="720" w:hanging="436"/>
-        <w:rPr>
-          <w:rFonts w:ascii="Noto Serif SC" w:eastAsia="Noto Serif SC" w:hAnsi="Noto Serif SC" w:cs="Noto Serif"/>
-          <w:sz w:val="20"/>
-          <w:szCs w:val="20"/>
-          <w:lang w:val="en-US"/>
-        </w:rPr>
-      </w:pPr>
-      <w:r>
-        <w:rPr>
-          <w:rFonts w:ascii="Noto Serif SC" w:eastAsia="Noto Serif SC" w:hAnsi="Noto Serif SC" w:cs="Noto Serif"/>
-          <w:sz w:val="20"/>
-          <w:szCs w:val="20"/>
-          <w:lang w:val="en-US"/>
-        </w:rPr>
-        <w:t xml:space="preserve">I: </w:t>
-      </w:r>
-      <w:r>
-        <w:rPr>
-          <w:rFonts w:ascii="Noto Serif SC" w:eastAsia="Noto Serif SC" w:hAnsi="Noto Serif SC" w:cs="Noto Serif" w:hint="eastAsia"/>
-          <w:sz w:val="20"/>
-          <w:szCs w:val="20"/>
-        </w:rPr>
-        <w:t>大军鼓</w:t>
-      </w:r>
-      <w:r>
-        <w:rPr>
-          <w:rFonts w:ascii="Noto Serif SC" w:eastAsia="Noto Serif SC" w:hAnsi="Noto Serif SC" w:cs="Noto Serif"/>
-          <w:sz w:val="20"/>
-          <w:szCs w:val="20"/>
-        </w:rPr>
-        <w:t xml:space="preserve"> Bass Drum, </w:t>
-      </w:r>
-      <w:r>
-        <w:rPr>
-          <w:rFonts w:ascii="Noto Serif SC" w:eastAsia="Noto Serif SC" w:hAnsi="Noto Serif SC" w:cs="Noto Serif" w:hint="eastAsia"/>
-          <w:sz w:val="20"/>
-          <w:szCs w:val="20"/>
-        </w:rPr>
-        <w:t>板鼓</w:t>
-      </w:r>
-      <w:r>
-        <w:rPr>
-          <w:rFonts w:ascii="Noto Serif SC" w:eastAsia="Noto Serif SC" w:hAnsi="Noto Serif SC" w:cs="Noto Serif"/>
-          <w:sz w:val="20"/>
-          <w:szCs w:val="20"/>
-        </w:rPr>
-        <w:t xml:space="preserve"> Bangu</w:t>
-      </w:r>
-    </w:p>
-    <w:p>
-      <w:pPr>
-        <w:ind w:left="720" w:hanging="436"/>
-        <w:rPr>
-          <w:rFonts w:ascii="Noto Serif SC" w:eastAsia="Noto Serif SC" w:hAnsi="Noto Serif SC" w:cs="Noto Serif"/>
-          <w:sz w:val="20"/>
-          <w:szCs w:val="20"/>
-        </w:rPr>
-      </w:pPr>
-      <w:r>
-        <w:rPr>
-          <w:rFonts w:ascii="Noto Serif SC" w:eastAsia="Noto Serif SC" w:hAnsi="Noto Serif SC" w:cs="Noto Serif"/>
-          <w:sz w:val="20"/>
-          <w:szCs w:val="20"/>
-          <w:lang w:val="en-US"/>
-        </w:rPr>
-        <w:t xml:space="preserve">II: </w:t>
-      </w:r>
-      <w:r>
-        <w:rPr>
-          <w:rFonts w:ascii="Noto Serif SC" w:eastAsia="Noto Serif SC" w:hAnsi="Noto Serif SC" w:cs="Noto Serif" w:hint="eastAsia"/>
-          <w:sz w:val="20"/>
-          <w:szCs w:val="20"/>
-        </w:rPr>
-        <w:t>吊镲</w:t>
-      </w:r>
-      <w:r>
-        <w:rPr>
-          <w:rFonts w:ascii="Noto Serif SC" w:eastAsia="Noto Serif SC" w:hAnsi="Noto Serif SC" w:cs="Noto Serif"/>
-          <w:sz w:val="20"/>
-          <w:szCs w:val="20"/>
-        </w:rPr>
-        <w:t xml:space="preserve"> Suspended Cymbal, </w:t>
-      </w:r>
-      <w:r>
-        <w:rPr>
-          <w:rFonts w:ascii="Noto Serif SC" w:eastAsia="Noto Serif SC" w:hAnsi="Noto Serif SC" w:cs="Noto Serif" w:hint="eastAsia"/>
-          <w:sz w:val="20"/>
-          <w:szCs w:val="20"/>
-        </w:rPr>
-        <w:t>碰铃</w:t>
-      </w:r>
-      <w:r>
-        <w:rPr>
-          <w:rFonts w:ascii="Noto Serif SC" w:eastAsia="Noto Serif SC" w:hAnsi="Noto Serif SC" w:cs="Noto Serif"/>
-          <w:sz w:val="20"/>
-          <w:szCs w:val="20"/>
-        </w:rPr>
-        <w:t xml:space="preserve"> </w:t>
-      </w:r>
-      <w:proofErr w:type="spellStart"/>
-      <w:r>
-        <w:rPr>
-          <w:rFonts w:ascii="Noto Serif SC" w:eastAsia="Noto Serif SC" w:hAnsi="Noto Serif SC" w:cs="Noto Serif"/>
-          <w:sz w:val="20"/>
-          <w:szCs w:val="20"/>
-        </w:rPr>
-        <w:t>Pengling</w:t>
-      </w:r>
-      <w:proofErr w:type="spellEnd"/>
-      <w:r>
-        <w:rPr>
-          <w:rFonts w:ascii="Noto Serif SC" w:eastAsia="Noto Serif SC" w:hAnsi="Noto Serif SC" w:cs="Noto Serif"/>
-          <w:sz w:val="20"/>
-          <w:szCs w:val="20"/>
-        </w:rPr>
-        <w:t xml:space="preserve">, </w:t>
-      </w:r>
-      <w:r>
-        <w:rPr>
-          <w:rFonts w:ascii="Noto Serif SC" w:eastAsia="Noto Serif SC" w:hAnsi="Noto Serif SC" w:cs="Noto Serif" w:hint="eastAsia"/>
-          <w:sz w:val="20"/>
-          <w:szCs w:val="20"/>
-        </w:rPr>
-        <w:t>低音木鱼</w:t>
-      </w:r>
-      <w:r>
-        <w:rPr>
-          <w:rFonts w:ascii="Noto Serif SC" w:eastAsia="Noto Serif SC" w:hAnsi="Noto Serif SC" w:cs="Noto Serif"/>
-          <w:sz w:val="20"/>
-          <w:szCs w:val="20"/>
-        </w:rPr>
-        <w:t xml:space="preserve"> Low Woodblock</w:t>
-      </w:r>
-    </w:p>
-    <w:p>
-      <w:pPr>
-        <w:ind w:left="720" w:hanging="436"/>
-        <w:rPr>
-          <w:rFonts w:ascii="Noto Serif SC" w:eastAsia="Noto Serif SC" w:hAnsi="Noto Serif SC" w:cs="Noto Serif"/>
-          <w:sz w:val="20"/>
-          <w:szCs w:val="20"/>
-        </w:rPr>
-      </w:pPr>
-      <w:r>
-        <w:rPr>
-          <w:rFonts w:ascii="Noto Serif SC" w:eastAsia="Noto Serif SC" w:hAnsi="Noto Serif SC" w:cs="Noto Serif"/>
-          <w:sz w:val="20"/>
-          <w:szCs w:val="20"/>
-          <w:lang w:val="en-US"/>
-        </w:rPr>
-        <w:t xml:space="preserve">III: </w:t>
-      </w:r>
-      <w:r>
-        <w:rPr>
-          <w:rFonts w:ascii="Noto Serif SC" w:eastAsia="Noto Serif SC" w:hAnsi="Noto Serif SC" w:cs="Noto Serif" w:hint="eastAsia"/>
-          <w:sz w:val="20"/>
-          <w:szCs w:val="20"/>
-          <w:lang w:val="en-US"/>
-        </w:rPr>
-        <w:t>小军鼓</w:t>
-      </w:r>
-      <w:r>
-        <w:rPr>
-          <w:rFonts w:ascii="Noto Serif SC" w:eastAsia="Noto Serif SC" w:hAnsi="Noto Serif SC" w:cs="Noto Serif"/>
-          <w:sz w:val="20"/>
-          <w:szCs w:val="20"/>
-          <w:lang w:val="en-US"/>
-        </w:rPr>
-        <w:t xml:space="preserve"> Snare Drum, </w:t>
-      </w:r>
-      <w:r>
-        <w:rPr>
-          <w:rFonts w:ascii="Noto Serif SC" w:eastAsia="Noto Serif SC" w:hAnsi="Noto Serif SC" w:cs="Noto Serif" w:hint="eastAsia"/>
-          <w:sz w:val="20"/>
-          <w:szCs w:val="20"/>
-        </w:rPr>
-        <w:t>铃鼓</w:t>
-      </w:r>
-      <w:r>
-        <w:rPr>
-          <w:rFonts w:ascii="Noto Serif SC" w:eastAsia="Noto Serif SC" w:hAnsi="Noto Serif SC" w:cs="Noto Serif"/>
-          <w:sz w:val="20"/>
-          <w:szCs w:val="20"/>
-        </w:rPr>
-        <w:t xml:space="preserve"> Tambourine, </w:t>
-      </w:r>
-      <w:r>
-        <w:rPr>
-          <w:rFonts w:ascii="Noto Serif SC" w:eastAsia="Noto Serif SC" w:hAnsi="Noto Serif SC" w:cs="Noto Serif" w:hint="eastAsia"/>
-          <w:sz w:val="20"/>
-          <w:szCs w:val="20"/>
-        </w:rPr>
-        <w:t>钟琴</w:t>
-      </w:r>
-      <w:r>
-        <w:rPr>
-          <w:rFonts w:ascii="Noto Serif SC" w:eastAsia="Noto Serif SC" w:hAnsi="Noto Serif SC" w:cs="Noto Serif"/>
-          <w:sz w:val="20"/>
-          <w:szCs w:val="20"/>
-        </w:rPr>
-        <w:t xml:space="preserve"> Glockenspiel, </w:t>
-      </w:r>
-      <w:r>
-        <w:rPr>
-          <w:rFonts w:ascii="Noto Serif SC" w:eastAsia="Noto Serif SC" w:hAnsi="Noto Serif SC" w:cs="Noto Serif" w:hint="eastAsia"/>
-          <w:sz w:val="20"/>
-          <w:szCs w:val="20"/>
-        </w:rPr>
-        <w:t>小钹</w:t>
-      </w:r>
-      <w:r>
-        <w:rPr>
-          <w:rFonts w:ascii="Noto Serif SC" w:eastAsia="Noto Serif SC" w:hAnsi="Noto Serif SC" w:cs="Noto Serif"/>
-          <w:sz w:val="20"/>
-          <w:szCs w:val="20"/>
-        </w:rPr>
-        <w:t xml:space="preserve"> Xiaobo, </w:t>
-      </w:r>
-      <w:r>
-        <w:rPr>
-          <w:rFonts w:ascii="Noto Serif SC" w:eastAsia="Noto Serif SC" w:hAnsi="Noto Serif SC" w:cs="Noto Serif" w:hint="eastAsia"/>
-          <w:sz w:val="20"/>
-          <w:szCs w:val="20"/>
-        </w:rPr>
-        <w:t>小堂鼓</w:t>
-      </w:r>
-      <w:r>
-        <w:rPr>
-          <w:rFonts w:ascii="Noto Serif SC" w:eastAsia="Noto Serif SC" w:hAnsi="Noto Serif SC" w:cs="Noto Serif"/>
-          <w:sz w:val="20"/>
-          <w:szCs w:val="20"/>
-        </w:rPr>
-        <w:t xml:space="preserve"> </w:t>
-      </w:r>
-      <w:proofErr w:type="spellStart"/>
-      <w:r>
-        <w:rPr>
-          <w:rFonts w:ascii="Noto Serif SC" w:eastAsia="Noto Serif SC" w:hAnsi="Noto Serif SC" w:cs="Noto Serif"/>
-          <w:sz w:val="20"/>
-          <w:szCs w:val="20"/>
-        </w:rPr>
-        <w:t>Xiaotanggu</w:t>
-      </w:r>
-      <w:proofErr w:type="spellEnd"/>
-    </w:p>
-    <w:p>
-      <w:pPr>
-        <w:ind w:left="720" w:hanging="436"/>
-        <w:rPr>
-          <w:rFonts w:ascii="Noto Serif SC" w:eastAsia="Noto Serif SC" w:hAnsi="Noto Serif SC" w:cs="Noto Serif"/>
-          <w:sz w:val="20"/>
-          <w:szCs w:val="20"/>
-          <w:lang w:val="en-US"/>
-        </w:rPr>
-      </w:pPr>
-      <w:r>
-        <w:rPr>
-          <w:rFonts w:ascii="Noto Serif SC" w:eastAsia="Noto Serif SC" w:hAnsi="Noto Serif SC" w:cs="Noto Serif"/>
-          <w:sz w:val="20"/>
-          <w:szCs w:val="20"/>
-          <w:lang w:val="en-US"/>
-        </w:rPr>
-        <w:t xml:space="preserve">IV: </w:t>
-      </w:r>
-      <w:r>
-        <w:rPr>
-          <w:rFonts w:ascii="Noto Serif SC" w:eastAsia="Noto Serif SC" w:hAnsi="Noto Serif SC" w:cs="Noto Serif" w:hint="eastAsia"/>
-          <w:sz w:val="20"/>
-          <w:szCs w:val="20"/>
-        </w:rPr>
-        <w:t>鞭子</w:t>
-      </w:r>
-      <w:r>
-        <w:rPr>
-          <w:rFonts w:ascii="Noto Serif SC" w:eastAsia="Noto Serif SC" w:hAnsi="Noto Serif SC" w:cs="Noto Serif"/>
-          <w:sz w:val="20"/>
-          <w:szCs w:val="20"/>
-        </w:rPr>
-        <w:t xml:space="preserve"> Whip, </w:t>
-      </w:r>
-      <w:r>
-        <w:rPr>
-          <w:rFonts w:ascii="Noto Serif SC" w:eastAsia="Noto Serif SC" w:hAnsi="Noto Serif SC" w:cs="Noto Serif" w:hint="eastAsia"/>
-          <w:sz w:val="20"/>
-          <w:szCs w:val="20"/>
-        </w:rPr>
-        <w:t>中钹</w:t>
-      </w:r>
-      <w:r>
-        <w:rPr>
-          <w:rFonts w:ascii="Noto Serif SC" w:eastAsia="Noto Serif SC" w:hAnsi="Noto Serif SC" w:cs="Noto Serif"/>
-          <w:sz w:val="20"/>
-          <w:szCs w:val="20"/>
-        </w:rPr>
-        <w:t xml:space="preserve"> </w:t>
-      </w:r>
-      <w:proofErr w:type="spellStart"/>
-      <w:r>
-        <w:rPr>
-          <w:rFonts w:ascii="Noto Serif SC" w:eastAsia="Noto Serif SC" w:hAnsi="Noto Serif SC" w:cs="Noto Serif"/>
-          <w:sz w:val="20"/>
-          <w:szCs w:val="20"/>
-        </w:rPr>
-        <w:t>Zhongbo</w:t>
-      </w:r>
-      <w:proofErr w:type="spellEnd"/>
-      <w:r>
-        <w:rPr>
-          <w:rFonts w:ascii="Noto Serif SC" w:eastAsia="Noto Serif SC" w:hAnsi="Noto Serif SC" w:cs="Noto Serif"/>
-          <w:sz w:val="20"/>
-          <w:szCs w:val="20"/>
-        </w:rPr>
-        <w:t xml:space="preserve">, </w:t>
-      </w:r>
-      <w:r>
-        <w:rPr>
-          <w:rFonts w:ascii="Noto Serif SC" w:eastAsia="Noto Serif SC" w:hAnsi="Noto Serif SC" w:cs="Noto Serif" w:hint="eastAsia"/>
-          <w:sz w:val="20"/>
-          <w:szCs w:val="20"/>
-        </w:rPr>
-        <w:t>中国小钹</w:t>
-      </w:r>
-      <w:r>
-        <w:rPr>
-          <w:rFonts w:ascii="Noto Serif SC" w:eastAsia="Noto Serif SC" w:hAnsi="Noto Serif SC" w:cs="Noto Serif"/>
-          <w:sz w:val="20"/>
-          <w:szCs w:val="20"/>
-          <w:lang w:val="en-GB"/>
-        </w:rPr>
-        <w:t xml:space="preserve"> </w:t>
-      </w:r>
-      <w:proofErr w:type="spellStart"/>
-      <w:r>
-        <w:rPr>
-          <w:rFonts w:ascii="Noto Serif SC" w:eastAsia="Noto Serif SC" w:hAnsi="Noto Serif SC" w:cs="Noto Serif"/>
-          <w:sz w:val="20"/>
-          <w:szCs w:val="20"/>
-        </w:rPr>
-        <w:t>Xiaoluo</w:t>
-      </w:r>
-      <w:proofErr w:type="spellEnd"/>
-      <w:r>
-        <w:rPr>
-          <w:rFonts w:ascii="Noto Serif SC" w:eastAsia="Noto Serif SC" w:hAnsi="Noto Serif SC" w:cs="Noto Serif"/>
-          <w:sz w:val="20"/>
-          <w:szCs w:val="20"/>
-        </w:rPr>
-        <w:t xml:space="preserve">, </w:t>
-      </w:r>
-      <w:r>
-        <w:rPr>
-          <w:rFonts w:ascii="Noto Serif SC" w:eastAsia="Noto Serif SC" w:hAnsi="Noto Serif SC" w:cs="Noto Serif" w:hint="eastAsia"/>
-          <w:sz w:val="20"/>
-          <w:szCs w:val="20"/>
-        </w:rPr>
-        <w:t>中国大钹</w:t>
-      </w:r>
-      <w:r>
-        <w:rPr>
-          <w:rFonts w:ascii="Noto Serif SC" w:eastAsia="Noto Serif SC" w:hAnsi="Noto Serif SC" w:cs="Noto Serif"/>
-          <w:sz w:val="20"/>
-          <w:szCs w:val="20"/>
-        </w:rPr>
-        <w:t xml:space="preserve"> </w:t>
-      </w:r>
-      <w:proofErr w:type="spellStart"/>
-      <w:r>
-        <w:rPr>
-          <w:rFonts w:ascii="Noto Serif SC" w:eastAsia="Noto Serif SC" w:hAnsi="Noto Serif SC" w:cs="Noto Serif"/>
-          <w:sz w:val="20"/>
-          <w:szCs w:val="20"/>
-        </w:rPr>
-        <w:t>Daluo</w:t>
-      </w:r>
-      <w:proofErr w:type="spellEnd"/>
-      <w:r>
-        <w:rPr>
-          <w:rFonts w:ascii="Noto Serif SC" w:eastAsia="Noto Serif SC" w:hAnsi="Noto Serif SC" w:cs="Noto Serif"/>
-          <w:sz w:val="20"/>
-          <w:szCs w:val="20"/>
-        </w:rPr>
-        <w:t xml:space="preserve">, </w:t>
-      </w:r>
-      <w:r>
-        <w:rPr>
-          <w:rFonts w:ascii="Noto Serif SC" w:eastAsia="Noto Serif SC" w:hAnsi="Noto Serif SC" w:cs="Noto Serif" w:hint="eastAsia"/>
-          <w:sz w:val="20"/>
-          <w:szCs w:val="20"/>
-        </w:rPr>
-        <w:t>西洋对镲</w:t>
-      </w:r>
-      <w:r>
-        <w:rPr>
-          <w:rFonts w:ascii="Noto Serif SC" w:eastAsia="Noto Serif SC" w:hAnsi="Noto Serif SC" w:cs="Noto Serif"/>
-          <w:sz w:val="20"/>
-          <w:szCs w:val="20"/>
-        </w:rPr>
-        <w:t xml:space="preserve"> Crash Cymbals</w:t>
-      </w:r>
-    </w:p>
-    <w:p>
-      <w:pPr>
-        <w:ind w:hanging="436"/>
-        <w:rPr>
-          <w:rFonts w:ascii="Noto Serif SC" w:eastAsia="Noto Serif SC" w:hAnsi="Noto Serif SC" w:cs="Noto Serif"/>
-          <w:sz w:val="24"/>
-          <w:szCs w:val="24"/>
-          <w:lang w:val="en-US"/>
-        </w:rPr>
-      </w:pPr>
-    </w:p>
-    <w:p>
-      <w:pPr>
-        <w:rPr>
-          <w:rFonts w:ascii="Noto Serif SC" w:eastAsia="Noto Serif SC" w:hAnsi="Noto Serif SC" w:cs="Noto Serif"/>
-          <w:sz w:val="24"/>
-          <w:szCs w:val="24"/>
-          <w:lang w:val="en-US"/>
-        </w:rPr>
-      </w:pPr>
-      <w:r>
-        <w:rPr>
-          <w:rFonts w:ascii="Noto Serif SC" w:eastAsia="Noto Serif SC" w:hAnsi="Noto Serif SC" w:cs="Noto Serif" w:hint="eastAsia"/>
-          <w:sz w:val="24"/>
-          <w:szCs w:val="24"/>
-          <w:lang w:val="en-US"/>
-        </w:rPr>
-        <w:t>高胡</w:t>
-      </w:r>
-      <w:r>
-        <w:rPr>
-          <w:rFonts w:ascii="Noto Serif SC" w:eastAsia="Noto Serif SC" w:hAnsi="Noto Serif SC" w:cs="Noto Serif"/>
-          <w:sz w:val="24"/>
-          <w:szCs w:val="24"/>
-          <w:lang w:val="en-US"/>
-        </w:rPr>
-        <w:t xml:space="preserve"> Gaohu</w:t>
-      </w:r>
-    </w:p>
-    <w:p>
-      <w:pPr>
-        <w:rPr>
-          <w:rFonts w:ascii="Noto Serif SC" w:eastAsia="Noto Serif SC" w:hAnsi="Noto Serif SC" w:cs="Noto Serif"/>
-          <w:sz w:val="24"/>
-          <w:szCs w:val="24"/>
-          <w:lang w:val="en-US"/>
-        </w:rPr>
-      </w:pPr>
-      <w:r>
-        <w:rPr>
-          <w:rFonts w:ascii="Noto Serif SC" w:eastAsia="Noto Serif SC" w:hAnsi="Noto Serif SC" w:cs="Noto Serif" w:hint="eastAsia"/>
-          <w:sz w:val="24"/>
-          <w:szCs w:val="24"/>
-          <w:lang w:val="en-US"/>
-        </w:rPr>
-        <w:t>二胡</w:t>
-      </w:r>
-      <w:r>
-        <w:rPr>
-          <w:rFonts w:ascii="Noto Serif SC" w:eastAsia="Noto Serif SC" w:hAnsi="Noto Serif SC" w:cs="Noto Serif"/>
-          <w:sz w:val="24"/>
-          <w:szCs w:val="24"/>
-          <w:lang w:val="en-US"/>
-        </w:rPr>
-        <w:t xml:space="preserve"> Erhu</w:t>
-      </w:r>
-      <w:r>
-        <w:rPr>
-          <w:rFonts w:ascii="Noto Serif SC" w:eastAsia="Noto Serif SC" w:hAnsi="Noto Serif SC" w:cs="Noto Serif"/>
-          <w:sz w:val="24"/>
-          <w:szCs w:val="24"/>
-          <w:lang w:val="en-US"/>
-        </w:rPr>
-        <w:t xml:space="preserve"> I</w:t>
-      </w:r>
-    </w:p>
-    <w:p>
-      <w:pPr>
-        <w:rPr>
-          <w:rFonts w:ascii="Noto Serif SC" w:eastAsia="Noto Serif SC" w:hAnsi="Noto Serif SC" w:cs="Noto Serif"/>
-          <w:sz w:val="24"/>
-          <w:szCs w:val="24"/>
-          <w:lang w:val="en-US"/>
-        </w:rPr>
-      </w:pPr>
-      <w:r>
-        <w:rPr>
-          <w:rFonts w:ascii="Noto Serif SC" w:eastAsia="Noto Serif SC" w:hAnsi="Noto Serif SC" w:cs="Noto Serif" w:hint="eastAsia"/>
-          <w:sz w:val="24"/>
-          <w:szCs w:val="24"/>
-          <w:lang w:val="en-US"/>
-        </w:rPr>
-        <w:t>二胡</w:t>
-      </w:r>
-      <w:r>
-        <w:rPr>
-          <w:rFonts w:ascii="Noto Serif SC" w:eastAsia="Noto Serif SC" w:hAnsi="Noto Serif SC" w:cs="Noto Serif"/>
-          <w:sz w:val="24"/>
-          <w:szCs w:val="24"/>
-          <w:lang w:val="en-US"/>
-        </w:rPr>
-        <w:t xml:space="preserve"> Erhu</w:t>
-      </w:r>
-      <w:r>
-        <w:rPr>
-          <w:rFonts w:ascii="Noto Serif SC" w:eastAsia="Noto Serif SC" w:hAnsi="Noto Serif SC" w:cs="Noto Serif"/>
-          <w:sz w:val="24"/>
-          <w:szCs w:val="24"/>
-          <w:lang w:val="en-US"/>
-        </w:rPr>
-        <w:t xml:space="preserve"> II</w:t>
-      </w:r>
-      <w:r>
-        <w:rPr>
-          <w:rFonts w:ascii="Noto Serif SC" w:eastAsia="Noto Serif SC" w:hAnsi="Noto Serif SC" w:cs="Noto Serif"/>
-          <w:sz w:val="24"/>
-          <w:szCs w:val="24"/>
-          <w:lang w:val="en-US"/>
-        </w:rPr>
-        <w:t xml:space="preserve"> </w:t>
-      </w:r>
-    </w:p>
-    <w:p>
-      <w:pPr>
-        <w:rPr>
-          <w:rFonts w:ascii="Noto Serif SC" w:eastAsia="Noto Serif SC" w:hAnsi="Noto Serif SC" w:cs="Noto Serif"/>
-          <w:sz w:val="24"/>
-          <w:szCs w:val="24"/>
-          <w:lang w:val="en-US"/>
-        </w:rPr>
-      </w:pPr>
-      <w:r>
-        <w:rPr>
-          <w:rFonts w:ascii="Noto Serif SC" w:eastAsia="Noto Serif SC" w:hAnsi="Noto Serif SC" w:cs="Noto Serif" w:hint="eastAsia"/>
-          <w:sz w:val="24"/>
-          <w:szCs w:val="24"/>
-          <w:lang w:val="en-US"/>
-        </w:rPr>
-        <w:t>中胡</w:t>
-      </w:r>
-      <w:r>
-        <w:rPr>
-          <w:rFonts w:ascii="Noto Serif SC" w:eastAsia="Noto Serif SC" w:hAnsi="Noto Serif SC" w:cs="Noto Serif"/>
-          <w:sz w:val="24"/>
-          <w:szCs w:val="24"/>
-          <w:lang w:val="en-US"/>
-        </w:rPr>
-        <w:t xml:space="preserve"> Zhonghu</w:t>
-      </w:r>
-    </w:p>
-    <w:p>
-      <w:pPr>
-        <w:rPr>
-          <w:rFonts w:ascii="Noto Serif SC" w:eastAsia="Noto Serif SC" w:hAnsi="Noto Serif SC" w:cs="Noto Serif"/>
-          <w:sz w:val="24"/>
-          <w:szCs w:val="24"/>
-          <w:lang w:val="en-US"/>
-        </w:rPr>
-      </w:pPr>
-      <w:r>
-        <w:rPr>
-          <w:rFonts w:ascii="Noto Serif SC" w:eastAsia="Noto Serif SC" w:hAnsi="Noto Serif SC" w:cs="Noto Serif" w:hint="eastAsia"/>
-          <w:sz w:val="24"/>
-          <w:szCs w:val="24"/>
-          <w:lang w:val="en-US"/>
-        </w:rPr>
-        <w:t>大提琴</w:t>
-      </w:r>
-      <w:r>
-        <w:rPr>
-          <w:rFonts w:ascii="Noto Serif SC" w:eastAsia="Noto Serif SC" w:hAnsi="Noto Serif SC" w:cs="Noto Serif"/>
-          <w:sz w:val="24"/>
-          <w:szCs w:val="24"/>
-          <w:lang w:val="en-US"/>
-        </w:rPr>
-        <w:t xml:space="preserve"> Violoncello</w:t>
-      </w:r>
-    </w:p>
-    <w:p>
-      <w:pPr>
-        <w:rPr>
-          <w:rFonts w:ascii="Noto Serif SC" w:eastAsia="Noto Serif SC" w:hAnsi="Noto Serif SC" w:cs="Noto Serif"/>
-          <w:sz w:val="24"/>
-          <w:szCs w:val="24"/>
-          <w:lang w:val="en-US"/>
-        </w:rPr>
-      </w:pPr>
-      <w:r>
-        <w:rPr>
-          <w:rFonts w:ascii="Noto Serif SC" w:eastAsia="Noto Serif SC" w:hAnsi="Noto Serif SC" w:cs="Noto Serif" w:hint="eastAsia"/>
-          <w:sz w:val="24"/>
-          <w:szCs w:val="24"/>
-          <w:lang w:val="en-US"/>
-        </w:rPr>
-        <w:t>低音提琴</w:t>
-      </w:r>
-      <w:r>
-        <w:rPr>
-          <w:rFonts w:ascii="Noto Serif SC" w:eastAsia="Noto Serif SC" w:hAnsi="Noto Serif SC" w:cs="Noto Serif"/>
-          <w:sz w:val="24"/>
-          <w:szCs w:val="24"/>
-          <w:lang w:val="en-US"/>
-        </w:rPr>
-        <w:t xml:space="preserve"> Contrabass</w:t>
-      </w:r>
-    </w:p>
-    <w:p>
-      <w:pPr>
-        <w:rPr>
-          <w:rFonts w:ascii="Noto Serif SC" w:eastAsia="Noto Serif SC" w:hAnsi="Noto Serif SC" w:cs="Noto Serif"/>
-          <w:lang w:val="en-US"/>
-        </w:rPr>
-      </w:pPr>
-    </w:p>
-    <w:p>
-      <w:pPr>
-        <w:rPr>
-          <w:rFonts w:ascii="Noto Serif SC" w:eastAsia="Noto Serif SC" w:hAnsi="Noto Serif SC" w:cs="Noto Serif"/>
-          <w:lang w:val="en-US"/>
-        </w:rPr>
-      </w:pPr>
-    </w:p>
-    <w:p>
-      <w:pPr>
-        <w:rPr>
-          <w:rFonts w:ascii="Noto Serif SC" w:eastAsia="Noto Serif SC" w:hAnsi="Noto Serif SC" w:cs="Noto Serif"/>
-          <w:lang w:val="en-US"/>
-        </w:rPr>
-      </w:pPr>
-      <w:r>
-        <w:rPr>
-          <w:rFonts w:ascii="Noto Serif SC" w:eastAsia="Noto Serif SC" w:hAnsi="Noto Serif SC" w:cs="Noto Serif"/>
-          <w:lang w:val="en-US"/>
-        </w:rPr>
-        <w:t>*</w:t>
-      </w:r>
-      <w:r>
-        <w:rPr>
-          <w:rFonts w:ascii="Noto Serif SC" w:eastAsia="Noto Serif SC" w:hAnsi="Noto Serif SC" w:cs="Noto Serif"/>
-          <w:lang w:val="en-US"/>
-        </w:rPr>
-        <w:t xml:space="preserve"> </w:t>
-      </w:r>
-      <w:r>
-        <w:rPr>
-          <w:rFonts w:ascii="Noto Serif SC" w:eastAsia="Noto Serif SC" w:hAnsi="Noto Serif SC" w:cs="Noto Serif" w:hint="eastAsia"/>
-          <w:lang w:val="en-US"/>
-        </w:rPr>
-        <w:t>括号内的数字为推荐演奏人数</w:t>
-      </w:r>
-      <w:r>
-        <w:rPr>
-          <w:rFonts w:ascii="Noto Serif SC" w:eastAsia="Noto Serif SC" w:hAnsi="Noto Serif SC" w:cs="Noto Serif"/>
-          <w:lang w:val="en-US"/>
-        </w:rPr>
-        <w:t xml:space="preserve"> </w:t>
-      </w:r>
-      <w:r>
-        <w:rPr>
           <w:rFonts w:ascii="Noto Serif SC" w:eastAsia="Noto Serif SC" w:hAnsi="Noto Serif SC"/>
           <w:sz w:val="24"/>
           <w:szCs w:val="24"/>
-          <w:lang w:val="en-US"/>
         </w:rPr>
         <w:t>。</w:t>
       </w:r>
@@ -3226,55 +2905,48 @@
       <w:pPr>
         <w:rPr>
           <w:rFonts w:ascii="Noto Serif SC" w:eastAsia="Noto Serif SC" w:hAnsi="Noto Serif SC" w:cs="Noto Serif"/>
-          <w:lang w:val="en-US"/>
-        </w:rPr>
-      </w:pPr>
-    </w:p>
-    <w:p>
-      <w:pPr>
-        <w:rPr>
-          <w:rFonts w:ascii="Noto Serif SC" w:eastAsia="Noto Serif SC" w:hAnsi="Noto Serif SC" w:cs="Noto Serif"/>
-          <w:lang w:val="en-US"/>
-        </w:rPr>
-      </w:pPr>
-    </w:p>
-    <w:p>
-      <w:pPr>
-        <w:rPr>
-          <w:rFonts w:ascii="Noto Serif SC" w:eastAsia="Noto Serif SC" w:hAnsi="Noto Serif SC" w:cs="Noto Serif"/>
-          <w:lang w:val="en-US"/>
-        </w:rPr>
-      </w:pPr>
-    </w:p>
-    <w:p>
-      <w:pPr>
-        <w:rPr>
-          <w:rFonts w:ascii="Noto Serif SC" w:eastAsia="Noto Serif SC" w:hAnsi="Noto Serif SC" w:cs="Noto Serif"/>
-          <w:lang w:val="en-US"/>
-        </w:rPr>
-      </w:pPr>
-    </w:p>
-    <w:p>
-      <w:pPr>
-        <w:rPr>
-          <w:rFonts w:ascii="Noto Serif SC" w:eastAsia="Noto Serif SC" w:hAnsi="Noto Serif SC" w:cs="Noto Serif"/>
-          <w:lang w:val="en-US"/>
-        </w:rPr>
-      </w:pPr>
-    </w:p>
-    <w:p>
-      <w:pPr>
-        <w:rPr>
-          <w:rFonts w:ascii="Noto Serif SC" w:eastAsia="Noto Serif SC" w:hAnsi="Noto Serif SC" w:cs="Noto Serif"/>
-          <w:lang w:val="en-US"/>
-        </w:rPr>
-      </w:pPr>
-    </w:p>
-    <w:p>
-      <w:pPr>
-        <w:rPr>
-          <w:rFonts w:ascii="Noto Serif SC" w:eastAsia="Noto Serif SC" w:hAnsi="Noto Serif SC" w:cs="Noto Serif"/>
-          <w:lang w:val="en-US"/>
+        </w:rPr>
+      </w:pPr>
+    </w:p>
+    <w:p>
+      <w:pPr>
+        <w:rPr>
+          <w:rFonts w:ascii="Noto Serif SC" w:eastAsia="Noto Serif SC" w:hAnsi="Noto Serif SC" w:cs="Noto Serif"/>
+        </w:rPr>
+      </w:pPr>
+    </w:p>
+    <w:p>
+      <w:pPr>
+        <w:rPr>
+          <w:rFonts w:ascii="Noto Serif SC" w:eastAsia="Noto Serif SC" w:hAnsi="Noto Serif SC" w:cs="Noto Serif"/>
+        </w:rPr>
+      </w:pPr>
+    </w:p>
+    <w:p>
+      <w:pPr>
+        <w:rPr>
+          <w:rFonts w:ascii="Noto Serif SC" w:eastAsia="Noto Serif SC" w:hAnsi="Noto Serif SC" w:cs="Noto Serif"/>
+        </w:rPr>
+      </w:pPr>
+    </w:p>
+    <w:p>
+      <w:pPr>
+        <w:rPr>
+          <w:rFonts w:ascii="Noto Serif SC" w:eastAsia="Noto Serif SC" w:hAnsi="Noto Serif SC" w:cs="Noto Serif"/>
+        </w:rPr>
+      </w:pPr>
+    </w:p>
+    <w:p>
+      <w:pPr>
+        <w:rPr>
+          <w:rFonts w:ascii="Noto Serif SC" w:eastAsia="Noto Serif SC" w:hAnsi="Noto Serif SC" w:cs="Noto Serif"/>
+        </w:rPr>
+      </w:pPr>
+    </w:p>
+    <w:p>
+      <w:pPr>
+        <w:rPr>
+          <w:rFonts w:ascii="Noto Serif SC" w:eastAsia="Noto Serif SC" w:hAnsi="Noto Serif SC" w:cs="Noto Serif"/>
         </w:rPr>
       </w:pPr>
     </w:p>
@@ -3904,6 +3576,9 @@
   <w:style w:type="paragraph" w:default="1" w:styleId="Normal">
     <w:name w:val="Normal"/>
     <w:qFormat/>
+    <w:rPr>
+      <w:noProof/>
+    </w:rPr>
   </w:style>
   <w:style w:type="paragraph" w:styleId="Heading1">
     <w:name w:val="heading 1"/>

</xml_diff>